<commit_message>
feat: Refactor App component and add new features
- Introduced new components: UploadCard, ChatBox, and AnalysisDashboard for better code organization and readability.
- Integrated Recharts for visual analytics in the AnalysisDashboard.
- Updated App component to manage state and render new components.
- Enhanced file upload functionality with improved user feedback.
- Implemented dynamic month selection for analysis comparison.
- Improved chat functionality with better message handling and user experience.
</commit_message>
<xml_diff>
--- a/STEP.docx
+++ b/STEP.docx
@@ -561,7 +561,6 @@
           <w:szCs w:val="24"/>
         </w:rPr>
       </w:pPr>
-      <w:bookmarkStart w:id="0" w:name="_GoBack"/>
       <w:r>
         <w:rPr>
           <w:rFonts w:ascii="Times New Roman" w:eastAsia="Times New Roman" w:hAnsi="Times New Roman" w:cs="Times New Roman"/>
@@ -573,7 +572,6 @@
           <v:rect id="_x0000_i1031" style="width:0;height:1.5pt" o:hralign="center" o:hrstd="t" o:hr="t" fillcolor="#a0a0a0" stroked="f"/>
         </w:pict>
       </w:r>
-      <w:bookmarkEnd w:id="0"/>
     </w:p>
     <w:p>
       <w:pPr>
@@ -841,6 +839,1381 @@
         </w:rPr>
         <w:t>Show insights</w:t>
       </w:r>
+    </w:p>
+    <w:p>
+      <w:pPr>
+        <w:spacing w:before="100" w:beforeAutospacing="1" w:after="100" w:afterAutospacing="1" w:line="240" w:lineRule="auto"/>
+        <w:rPr>
+          <w:rFonts w:ascii="Times New Roman" w:eastAsia="Times New Roman" w:hAnsi="Times New Roman" w:cs="Times New Roman"/>
+          <w:sz w:val="24"/>
+          <w:szCs w:val="24"/>
+        </w:rPr>
+      </w:pPr>
+    </w:p>
+    <w:p>
+      <w:pPr>
+        <w:spacing w:before="100" w:beforeAutospacing="1" w:after="100" w:afterAutospacing="1" w:line="240" w:lineRule="auto"/>
+        <w:rPr>
+          <w:rFonts w:ascii="Times New Roman" w:eastAsia="Times New Roman" w:hAnsi="Times New Roman" w:cs="Times New Roman"/>
+          <w:sz w:val="24"/>
+          <w:szCs w:val="24"/>
+        </w:rPr>
+      </w:pPr>
+    </w:p>
+    <w:p>
+      <w:pPr>
+        <w:spacing w:before="100" w:beforeAutospacing="1" w:after="100" w:afterAutospacing="1" w:line="240" w:lineRule="auto"/>
+        <w:rPr>
+          <w:rFonts w:ascii="Times New Roman" w:eastAsia="Times New Roman" w:hAnsi="Times New Roman" w:cs="Times New Roman"/>
+          <w:sz w:val="24"/>
+          <w:szCs w:val="24"/>
+        </w:rPr>
+      </w:pPr>
+    </w:p>
+    <w:p>
+      <w:pPr>
+        <w:pStyle w:val="Heading3"/>
+      </w:pPr>
+      <w:proofErr w:type="gramStart"/>
+      <w:r>
+        <w:t>p</w:t>
+      </w:r>
+      <w:r>
+        <w:t>hase</w:t>
+      </w:r>
+      <w:proofErr w:type="gramEnd"/>
+      <w:r>
+        <w:t xml:space="preserve"> 1: Visual Upgrades (High Impact, Low Effort)</w:t>
+      </w:r>
+    </w:p>
+    <w:p>
+      <w:pPr>
+        <w:pStyle w:val="NormalWeb"/>
+      </w:pPr>
+      <w:r>
+        <w:t>Right now, your dashboard is very text-heavy. Humans process visuals 60,000 times faster than text.</w:t>
+      </w:r>
+    </w:p>
+    <w:p>
+      <w:pPr>
+        <w:pStyle w:val="NormalWeb"/>
+        <w:numPr>
+          <w:ilvl w:val="0"/>
+          <w:numId w:val="6"/>
+        </w:numPr>
+      </w:pPr>
+      <w:r>
+        <w:rPr>
+          <w:b/>
+          <w:bCs/>
+        </w:rPr>
+        <w:t>Add Interactive Charts (</w:t>
+      </w:r>
+      <w:proofErr w:type="spellStart"/>
+      <w:r>
+        <w:rPr>
+          <w:b/>
+          <w:bCs/>
+        </w:rPr>
+        <w:t>Recharts</w:t>
+      </w:r>
+      <w:proofErr w:type="spellEnd"/>
+      <w:r>
+        <w:rPr>
+          <w:b/>
+          <w:bCs/>
+        </w:rPr>
+        <w:t xml:space="preserve"> or Chart.js)</w:t>
+      </w:r>
+    </w:p>
+    <w:p>
+      <w:pPr>
+        <w:pStyle w:val="NormalWeb"/>
+        <w:numPr>
+          <w:ilvl w:val="1"/>
+          <w:numId w:val="6"/>
+        </w:numPr>
+      </w:pPr>
+      <w:r>
+        <w:rPr>
+          <w:b/>
+          <w:bCs/>
+        </w:rPr>
+        <w:t>What to add:</w:t>
+      </w:r>
+      <w:r>
+        <w:t xml:space="preserve"> A Pie Chart showing the spending breakdown by category for the </w:t>
+      </w:r>
+      <w:r>
+        <w:rPr>
+          <w:rStyle w:val="HTMLCode"/>
+        </w:rPr>
+        <w:t>current</w:t>
+      </w:r>
+      <w:r>
+        <w:t xml:space="preserve"> month, and a Bar Chart showing the month-over-month trend.</w:t>
+      </w:r>
+    </w:p>
+    <w:p>
+      <w:pPr>
+        <w:pStyle w:val="NormalWeb"/>
+        <w:numPr>
+          <w:ilvl w:val="1"/>
+          <w:numId w:val="6"/>
+        </w:numPr>
+      </w:pPr>
+      <w:r>
+        <w:rPr>
+          <w:b/>
+          <w:bCs/>
+        </w:rPr>
+        <w:t>User Value:</w:t>
+      </w:r>
+      <w:r>
+        <w:t xml:space="preserve"> Instantly seeing a massive red slice of a pie chart for "Food" is a much stronger financial wake-up call than reading a table row.</w:t>
+      </w:r>
+    </w:p>
+    <w:p>
+      <w:pPr>
+        <w:pStyle w:val="NormalWeb"/>
+        <w:numPr>
+          <w:ilvl w:val="0"/>
+          <w:numId w:val="6"/>
+        </w:numPr>
+      </w:pPr>
+      <w:r>
+        <w:rPr>
+          <w:b/>
+          <w:bCs/>
+        </w:rPr>
+        <w:t>Export to CSV/Excel Button</w:t>
+      </w:r>
+    </w:p>
+    <w:p>
+      <w:pPr>
+        <w:pStyle w:val="NormalWeb"/>
+        <w:numPr>
+          <w:ilvl w:val="1"/>
+          <w:numId w:val="6"/>
+        </w:numPr>
+      </w:pPr>
+      <w:r>
+        <w:rPr>
+          <w:b/>
+          <w:bCs/>
+        </w:rPr>
+        <w:t>What to add:</w:t>
+      </w:r>
+      <w:r>
+        <w:t xml:space="preserve"> A button below the comparison table that downloads the MongoDB aggregation as a clean spreadsheet.</w:t>
+      </w:r>
+    </w:p>
+    <w:p>
+      <w:pPr>
+        <w:pStyle w:val="NormalWeb"/>
+        <w:numPr>
+          <w:ilvl w:val="1"/>
+          <w:numId w:val="6"/>
+        </w:numPr>
+      </w:pPr>
+      <w:r>
+        <w:rPr>
+          <w:b/>
+          <w:bCs/>
+        </w:rPr>
+        <w:t>User Value:</w:t>
+      </w:r>
+      <w:r>
+        <w:t xml:space="preserve"> Power users and accountants love their spreadsheets. Letting them export the AI's hard work saves them hours of manual data entry.</w:t>
+      </w:r>
+    </w:p>
+    <w:p>
+      <w:pPr>
+        <w:pStyle w:val="Heading3"/>
+      </w:pPr>
+      <w:r>
+        <w:rPr>
+          <w:rFonts w:ascii="Calibri Light" w:hAnsi="Calibri Light" w:cs="Calibri Light"/>
+        </w:rPr>
+        <w:lastRenderedPageBreak/>
+        <w:t>🧠</w:t>
+      </w:r>
+      <w:r>
+        <w:t xml:space="preserve"> Phase 2: AI &amp; </w:t>
+      </w:r>
+      <w:proofErr w:type="spellStart"/>
+      <w:r>
+        <w:t>Chatbot</w:t>
+      </w:r>
+      <w:proofErr w:type="spellEnd"/>
+      <w:r>
+        <w:t xml:space="preserve"> Power-Ups</w:t>
+      </w:r>
+    </w:p>
+    <w:p>
+      <w:pPr>
+        <w:pStyle w:val="NormalWeb"/>
+      </w:pPr>
+      <w:r>
+        <w:t xml:space="preserve">Your RAG pipeline is great for exact queries, but it currently has a fundamental limit: it only fetches the </w:t>
+      </w:r>
+      <w:proofErr w:type="spellStart"/>
+      <w:r>
+        <w:rPr>
+          <w:rStyle w:val="HTMLCode"/>
+        </w:rPr>
+        <w:t>top_k</w:t>
+      </w:r>
+      <w:proofErr w:type="spellEnd"/>
+      <w:r>
+        <w:rPr>
+          <w:rStyle w:val="HTMLCode"/>
+        </w:rPr>
+        <w:t>=5</w:t>
+      </w:r>
+      <w:r>
+        <w:t xml:space="preserve"> transactions.</w:t>
+      </w:r>
+    </w:p>
+    <w:p>
+      <w:pPr>
+        <w:pStyle w:val="NormalWeb"/>
+        <w:numPr>
+          <w:ilvl w:val="0"/>
+          <w:numId w:val="7"/>
+        </w:numPr>
+      </w:pPr>
+      <w:r>
+        <w:rPr>
+          <w:b/>
+          <w:bCs/>
+        </w:rPr>
+        <w:t>Agentic Database Querying (Text-to-SQL/Mongo)</w:t>
+      </w:r>
+    </w:p>
+    <w:p>
+      <w:pPr>
+        <w:pStyle w:val="NormalWeb"/>
+        <w:numPr>
+          <w:ilvl w:val="1"/>
+          <w:numId w:val="7"/>
+        </w:numPr>
+      </w:pPr>
+      <w:r>
+        <w:rPr>
+          <w:b/>
+          <w:bCs/>
+        </w:rPr>
+        <w:t>What to improve:</w:t>
+      </w:r>
+      <w:r>
+        <w:t xml:space="preserve"> If a user asks, </w:t>
+      </w:r>
+      <w:r>
+        <w:rPr>
+          <w:i/>
+          <w:iCs/>
+        </w:rPr>
+        <w:t>"How much did I spend on Food in all of 2023?</w:t>
+      </w:r>
+      <w:proofErr w:type="gramStart"/>
+      <w:r>
+        <w:rPr>
+          <w:i/>
+          <w:iCs/>
+        </w:rPr>
+        <w:t>"</w:t>
+      </w:r>
+      <w:r>
+        <w:t>,</w:t>
+      </w:r>
+      <w:proofErr w:type="gramEnd"/>
+      <w:r>
+        <w:t xml:space="preserve"> fetching 5 random food transactions won't give them the total.</w:t>
+      </w:r>
+    </w:p>
+    <w:p>
+      <w:pPr>
+        <w:pStyle w:val="NormalWeb"/>
+        <w:numPr>
+          <w:ilvl w:val="1"/>
+          <w:numId w:val="7"/>
+        </w:numPr>
+      </w:pPr>
+      <w:r>
+        <w:rPr>
+          <w:b/>
+          <w:bCs/>
+        </w:rPr>
+        <w:t>How to fix it:</w:t>
+      </w:r>
+      <w:r>
+        <w:t xml:space="preserve"> Upgrade the AI so that it can dynamically trigger your Node.js MongoDB aggregations to calculate massive totals, rather than trying to do math on just 5 text chunks.</w:t>
+      </w:r>
+    </w:p>
+    <w:p>
+      <w:pPr>
+        <w:pStyle w:val="NormalWeb"/>
+        <w:numPr>
+          <w:ilvl w:val="0"/>
+          <w:numId w:val="7"/>
+        </w:numPr>
+      </w:pPr>
+      <w:r>
+        <w:rPr>
+          <w:b/>
+          <w:bCs/>
+        </w:rPr>
+        <w:t>Persistent Chat History</w:t>
+      </w:r>
+    </w:p>
+    <w:p>
+      <w:pPr>
+        <w:pStyle w:val="NormalWeb"/>
+        <w:numPr>
+          <w:ilvl w:val="1"/>
+          <w:numId w:val="7"/>
+        </w:numPr>
+      </w:pPr>
+      <w:r>
+        <w:rPr>
+          <w:b/>
+          <w:bCs/>
+        </w:rPr>
+        <w:t>What to add:</w:t>
+      </w:r>
+      <w:r>
+        <w:t xml:space="preserve"> Right now, if you refresh the React page, the </w:t>
+      </w:r>
+      <w:proofErr w:type="spellStart"/>
+      <w:r>
+        <w:t>chatbot</w:t>
+      </w:r>
+      <w:proofErr w:type="spellEnd"/>
+      <w:r>
+        <w:t xml:space="preserve"> forgets the conversation. You should save the </w:t>
+      </w:r>
+      <w:r>
+        <w:rPr>
+          <w:rStyle w:val="HTMLCode"/>
+        </w:rPr>
+        <w:t>messages</w:t>
+      </w:r>
+      <w:r>
+        <w:t xml:space="preserve"> array to a new MongoDB collection (</w:t>
+      </w:r>
+      <w:proofErr w:type="spellStart"/>
+      <w:r>
+        <w:rPr>
+          <w:rStyle w:val="HTMLCode"/>
+        </w:rPr>
+        <w:t>ChatHistory</w:t>
+      </w:r>
+      <w:proofErr w:type="spellEnd"/>
+      <w:r>
+        <w:t>).</w:t>
+      </w:r>
+    </w:p>
+    <w:p>
+      <w:pPr>
+        <w:pStyle w:val="NormalWeb"/>
+        <w:numPr>
+          <w:ilvl w:val="1"/>
+          <w:numId w:val="7"/>
+        </w:numPr>
+      </w:pPr>
+      <w:r>
+        <w:rPr>
+          <w:b/>
+          <w:bCs/>
+        </w:rPr>
+        <w:t>User Value:</w:t>
+      </w:r>
+      <w:r>
+        <w:t xml:space="preserve"> Users expect </w:t>
+      </w:r>
+      <w:proofErr w:type="spellStart"/>
+      <w:r>
+        <w:t>chatbots</w:t>
+      </w:r>
+      <w:proofErr w:type="spellEnd"/>
+      <w:r>
+        <w:t xml:space="preserve"> to remember their context across sessions, just like </w:t>
+      </w:r>
+      <w:proofErr w:type="spellStart"/>
+      <w:r>
+        <w:t>ChatGPT</w:t>
+      </w:r>
+      <w:proofErr w:type="spellEnd"/>
+      <w:r>
+        <w:t>.</w:t>
+      </w:r>
+    </w:p>
+    <w:p>
+      <w:pPr>
+        <w:pStyle w:val="Heading3"/>
+      </w:pPr>
+      <w:r>
+        <w:rPr>
+          <w:rFonts w:ascii="Segoe UI Symbol" w:hAnsi="Segoe UI Symbol" w:cs="Segoe UI Symbol"/>
+        </w:rPr>
+        <w:t>🔐</w:t>
+      </w:r>
+      <w:r>
+        <w:t xml:space="preserve"> Phase 3: SaaS Readiness (Making it a real product)</w:t>
+      </w:r>
+    </w:p>
+    <w:p>
+      <w:pPr>
+        <w:pStyle w:val="NormalWeb"/>
+      </w:pPr>
+      <w:r>
+        <w:t xml:space="preserve">If you look at your </w:t>
+      </w:r>
+      <w:r>
+        <w:rPr>
+          <w:rStyle w:val="HTMLCode"/>
+        </w:rPr>
+        <w:t>Transaction.js</w:t>
+      </w:r>
+      <w:r>
+        <w:t xml:space="preserve"> model, you currently have </w:t>
+      </w:r>
+      <w:proofErr w:type="spellStart"/>
+      <w:r>
+        <w:rPr>
+          <w:rStyle w:val="HTMLCode"/>
+        </w:rPr>
+        <w:t>userId</w:t>
+      </w:r>
+      <w:proofErr w:type="spellEnd"/>
+      <w:r>
+        <w:rPr>
+          <w:rStyle w:val="HTMLCode"/>
+        </w:rPr>
+        <w:t>: String</w:t>
+      </w:r>
+      <w:r>
+        <w:t xml:space="preserve"> hardcoded to </w:t>
+      </w:r>
+      <w:r>
+        <w:rPr>
+          <w:rStyle w:val="HTMLCode"/>
+        </w:rPr>
+        <w:t>"user1"</w:t>
+      </w:r>
+      <w:r>
+        <w:t>. To let real people use this, you need isolation.</w:t>
+      </w:r>
+    </w:p>
+    <w:p>
+      <w:pPr>
+        <w:pStyle w:val="NormalWeb"/>
+        <w:numPr>
+          <w:ilvl w:val="0"/>
+          <w:numId w:val="8"/>
+        </w:numPr>
+      </w:pPr>
+      <w:r>
+        <w:rPr>
+          <w:b/>
+          <w:bCs/>
+        </w:rPr>
+        <w:t>User Authentication (JWT + Node.js)</w:t>
+      </w:r>
+    </w:p>
+    <w:p>
+      <w:pPr>
+        <w:pStyle w:val="NormalWeb"/>
+        <w:numPr>
+          <w:ilvl w:val="1"/>
+          <w:numId w:val="8"/>
+        </w:numPr>
+      </w:pPr>
+      <w:r>
+        <w:rPr>
+          <w:b/>
+          <w:bCs/>
+        </w:rPr>
+        <w:t>What to add:</w:t>
+      </w:r>
+      <w:r>
+        <w:t xml:space="preserve"> A login/signup page. When a user logs in, React gets a JWT token. Every upload and chat request sends this token so MongoDB only fetches </w:t>
+      </w:r>
+      <w:r>
+        <w:rPr>
+          <w:i/>
+          <w:iCs/>
+        </w:rPr>
+        <w:t>their</w:t>
+      </w:r>
+      <w:r>
+        <w:t xml:space="preserve"> data, and </w:t>
+      </w:r>
+      <w:proofErr w:type="spellStart"/>
+      <w:r>
+        <w:t>ChromaDB</w:t>
+      </w:r>
+      <w:proofErr w:type="spellEnd"/>
+      <w:r>
+        <w:t xml:space="preserve"> only searches </w:t>
+      </w:r>
+      <w:r>
+        <w:rPr>
+          <w:i/>
+          <w:iCs/>
+        </w:rPr>
+        <w:t>their</w:t>
+      </w:r>
+      <w:r>
+        <w:t xml:space="preserve"> vectors.</w:t>
+      </w:r>
+    </w:p>
+    <w:p>
+      <w:pPr>
+        <w:pStyle w:val="NormalWeb"/>
+        <w:numPr>
+          <w:ilvl w:val="1"/>
+          <w:numId w:val="8"/>
+        </w:numPr>
+      </w:pPr>
+      <w:r>
+        <w:rPr>
+          <w:b/>
+          <w:bCs/>
+        </w:rPr>
+        <w:t>User Value:</w:t>
+      </w:r>
+      <w:r>
+        <w:t xml:space="preserve"> Absolute privacy. Financial data is highly sensitive; users need to know their data is locked behind their personal account.</w:t>
+      </w:r>
+    </w:p>
+    <w:p>
+      <w:pPr>
+        <w:pStyle w:val="NormalWeb"/>
+        <w:numPr>
+          <w:ilvl w:val="0"/>
+          <w:numId w:val="8"/>
+        </w:numPr>
+      </w:pPr>
+      <w:r>
+        <w:rPr>
+          <w:b/>
+          <w:bCs/>
+        </w:rPr>
+        <w:t>Custom Categories</w:t>
+      </w:r>
+    </w:p>
+    <w:p>
+      <w:pPr>
+        <w:pStyle w:val="NormalWeb"/>
+        <w:numPr>
+          <w:ilvl w:val="1"/>
+          <w:numId w:val="8"/>
+        </w:numPr>
+      </w:pPr>
+      <w:r>
+        <w:rPr>
+          <w:b/>
+          <w:bCs/>
+        </w:rPr>
+        <w:t>What to add:</w:t>
+      </w:r>
+      <w:r>
+        <w:t xml:space="preserve"> Right now, Python hardcodes categories (Food, Travel, EMI, etc.). Allow users to create custom rules in the UI (e.g., </w:t>
+      </w:r>
+      <w:r>
+        <w:rPr>
+          <w:i/>
+          <w:iCs/>
+        </w:rPr>
+        <w:t>"Always categorize '</w:t>
+      </w:r>
+      <w:proofErr w:type="spellStart"/>
+      <w:r>
+        <w:rPr>
+          <w:i/>
+          <w:iCs/>
+        </w:rPr>
+        <w:t>Swiggy</w:t>
+      </w:r>
+      <w:proofErr w:type="spellEnd"/>
+      <w:r>
+        <w:rPr>
+          <w:i/>
+          <w:iCs/>
+        </w:rPr>
+        <w:t>' as 'Junk Food', not just 'Food'"</w:t>
+      </w:r>
+      <w:r>
+        <w:t>).</w:t>
+      </w:r>
+    </w:p>
+    <w:p>
+      <w:pPr>
+        <w:pStyle w:val="NormalWeb"/>
+        <w:numPr>
+          <w:ilvl w:val="1"/>
+          <w:numId w:val="8"/>
+        </w:numPr>
+      </w:pPr>
+      <w:r>
+        <w:rPr>
+          <w:b/>
+          <w:bCs/>
+        </w:rPr>
+        <w:t>User Value:</w:t>
+      </w:r>
+      <w:r>
+        <w:t xml:space="preserve"> Hyper-personalization. Everyone's budget looks different.</w:t>
+      </w:r>
+    </w:p>
+    <w:p>
+      <w:pPr>
+        <w:pStyle w:val="Heading3"/>
+      </w:pPr>
+      <w:r>
+        <w:rPr>
+          <w:rFonts w:ascii="Segoe UI Symbol" w:hAnsi="Segoe UI Symbol" w:cs="Segoe UI Symbol"/>
+        </w:rPr>
+        <w:t>🐳</w:t>
+      </w:r>
+      <w:r>
+        <w:t xml:space="preserve"> Phase 4: Developer Architecture</w:t>
+      </w:r>
+    </w:p>
+    <w:p>
+      <w:pPr>
+        <w:pStyle w:val="NormalWeb"/>
+        <w:numPr>
+          <w:ilvl w:val="0"/>
+          <w:numId w:val="9"/>
+        </w:numPr>
+      </w:pPr>
+      <w:proofErr w:type="spellStart"/>
+      <w:r>
+        <w:rPr>
+          <w:b/>
+          <w:bCs/>
+        </w:rPr>
+        <w:t>Dockerize</w:t>
+      </w:r>
+      <w:proofErr w:type="spellEnd"/>
+      <w:r>
+        <w:rPr>
+          <w:b/>
+          <w:bCs/>
+        </w:rPr>
+        <w:t xml:space="preserve"> the Application</w:t>
+      </w:r>
+    </w:p>
+    <w:p>
+      <w:pPr>
+        <w:pStyle w:val="NormalWeb"/>
+        <w:numPr>
+          <w:ilvl w:val="1"/>
+          <w:numId w:val="9"/>
+        </w:numPr>
+      </w:pPr>
+      <w:r>
+        <w:rPr>
+          <w:b/>
+          <w:bCs/>
+        </w:rPr>
+        <w:t>What to improve:</w:t>
+      </w:r>
+      <w:r>
+        <w:t xml:space="preserve"> Right now, to run your app, you have to open three terminals (</w:t>
+      </w:r>
+      <w:proofErr w:type="spellStart"/>
+      <w:r>
+        <w:rPr>
+          <w:rStyle w:val="HTMLCode"/>
+        </w:rPr>
+        <w:t>npm</w:t>
+      </w:r>
+      <w:proofErr w:type="spellEnd"/>
+      <w:r>
+        <w:rPr>
+          <w:rStyle w:val="HTMLCode"/>
+        </w:rPr>
+        <w:t xml:space="preserve"> start</w:t>
+      </w:r>
+      <w:r>
+        <w:t xml:space="preserve"> for React, </w:t>
+      </w:r>
+      <w:proofErr w:type="spellStart"/>
+      <w:r>
+        <w:rPr>
+          <w:rStyle w:val="HTMLCode"/>
+        </w:rPr>
+        <w:t>npm</w:t>
+      </w:r>
+      <w:proofErr w:type="spellEnd"/>
+      <w:r>
+        <w:rPr>
+          <w:rStyle w:val="HTMLCode"/>
+        </w:rPr>
+        <w:t xml:space="preserve"> start</w:t>
+      </w:r>
+      <w:r>
+        <w:t xml:space="preserve"> for Node, and </w:t>
+      </w:r>
+      <w:proofErr w:type="spellStart"/>
+      <w:r>
+        <w:rPr>
+          <w:rStyle w:val="HTMLCode"/>
+        </w:rPr>
+        <w:t>uvicorn</w:t>
+      </w:r>
+      <w:proofErr w:type="spellEnd"/>
+      <w:r>
+        <w:rPr>
+          <w:rStyle w:val="HTMLCode"/>
+        </w:rPr>
+        <w:t xml:space="preserve"> </w:t>
+      </w:r>
+      <w:proofErr w:type="spellStart"/>
+      <w:r>
+        <w:rPr>
+          <w:rStyle w:val="HTMLCode"/>
+        </w:rPr>
+        <w:t>main</w:t>
+      </w:r>
+      <w:proofErr w:type="gramStart"/>
+      <w:r>
+        <w:rPr>
+          <w:rStyle w:val="HTMLCode"/>
+        </w:rPr>
+        <w:t>:app</w:t>
+      </w:r>
+      <w:proofErr w:type="spellEnd"/>
+      <w:proofErr w:type="gramEnd"/>
+      <w:r>
+        <w:t xml:space="preserve"> for Python).</w:t>
+      </w:r>
+    </w:p>
+    <w:p>
+      <w:pPr>
+        <w:pStyle w:val="NormalWeb"/>
+        <w:numPr>
+          <w:ilvl w:val="1"/>
+          <w:numId w:val="9"/>
+        </w:numPr>
+      </w:pPr>
+      <w:r>
+        <w:rPr>
+          <w:b/>
+          <w:bCs/>
+        </w:rPr>
+        <w:t>The Fix:</w:t>
+      </w:r>
+      <w:r>
+        <w:t xml:space="preserve"> Create a </w:t>
+      </w:r>
+      <w:proofErr w:type="spellStart"/>
+      <w:r>
+        <w:rPr>
+          <w:rStyle w:val="HTMLCode"/>
+        </w:rPr>
+        <w:t>docker-compose.yml</w:t>
+      </w:r>
+      <w:proofErr w:type="spellEnd"/>
+      <w:r>
+        <w:t xml:space="preserve"> file. With one single command (</w:t>
+      </w:r>
+      <w:proofErr w:type="spellStart"/>
+      <w:r>
+        <w:rPr>
+          <w:rStyle w:val="HTMLCode"/>
+        </w:rPr>
+        <w:t>docker</w:t>
+      </w:r>
+      <w:proofErr w:type="spellEnd"/>
+      <w:r>
+        <w:rPr>
+          <w:rStyle w:val="HTMLCode"/>
+        </w:rPr>
+        <w:t>-compose up</w:t>
+      </w:r>
+      <w:r>
+        <w:t>), your entire MERN stack and Python AI engine boot up together.</w:t>
+      </w:r>
+    </w:p>
+    <w:p>
+      <w:pPr>
+        <w:spacing w:before="100" w:beforeAutospacing="1" w:after="100" w:afterAutospacing="1" w:line="240" w:lineRule="auto"/>
+        <w:rPr>
+          <w:rFonts w:ascii="Times New Roman" w:eastAsia="Times New Roman" w:hAnsi="Times New Roman" w:cs="Times New Roman"/>
+          <w:sz w:val="24"/>
+          <w:szCs w:val="24"/>
+        </w:rPr>
+      </w:pPr>
+    </w:p>
+    <w:p>
+      <w:pPr>
+        <w:pStyle w:val="Heading3"/>
+      </w:pPr>
+      <w:r>
+        <w:lastRenderedPageBreak/>
+        <w:t>The "Production-Ready" Feature Roadmap</w:t>
+      </w:r>
+    </w:p>
+    <w:p>
+      <w:pPr>
+        <w:pStyle w:val="Heading4"/>
+      </w:pPr>
+      <w:r>
+        <w:rPr>
+          <w:rFonts w:ascii="Segoe UI Symbol" w:hAnsi="Segoe UI Symbol" w:cs="Segoe UI Symbol"/>
+        </w:rPr>
+        <w:t>📊</w:t>
+      </w:r>
+      <w:r>
+        <w:t xml:space="preserve"> 1. Visual Analytics (Frontend)</w:t>
+      </w:r>
+    </w:p>
+    <w:p>
+      <w:pPr>
+        <w:pStyle w:val="NormalWeb"/>
+        <w:numPr>
+          <w:ilvl w:val="0"/>
+          <w:numId w:val="10"/>
+        </w:numPr>
+      </w:pPr>
+      <w:r>
+        <w:rPr>
+          <w:b/>
+          <w:bCs/>
+        </w:rPr>
+        <w:t>What it is:</w:t>
+      </w:r>
+      <w:r>
+        <w:t xml:space="preserve"> Adding beautiful, interactive charts.</w:t>
+      </w:r>
+    </w:p>
+    <w:p>
+      <w:pPr>
+        <w:pStyle w:val="NormalWeb"/>
+        <w:numPr>
+          <w:ilvl w:val="0"/>
+          <w:numId w:val="10"/>
+        </w:numPr>
+      </w:pPr>
+      <w:r>
+        <w:rPr>
+          <w:b/>
+          <w:bCs/>
+        </w:rPr>
+        <w:t>What we will code:</w:t>
+      </w:r>
+      <w:r>
+        <w:t xml:space="preserve"> We will install </w:t>
+      </w:r>
+      <w:proofErr w:type="spellStart"/>
+      <w:r>
+        <w:rPr>
+          <w:rStyle w:val="HTMLCode"/>
+          <w:rFonts w:eastAsiaTheme="majorEastAsia"/>
+        </w:rPr>
+        <w:t>recharts</w:t>
+      </w:r>
+      <w:proofErr w:type="spellEnd"/>
+      <w:r>
+        <w:t xml:space="preserve"> in your React app and turn your "Deep Analysis" table into a visual </w:t>
+      </w:r>
+      <w:r>
+        <w:rPr>
+          <w:b/>
+          <w:bCs/>
+        </w:rPr>
+        <w:t>Bar Chart</w:t>
+      </w:r>
+      <w:r>
+        <w:t xml:space="preserve"> (comparing months) and a </w:t>
+      </w:r>
+      <w:r>
+        <w:rPr>
+          <w:b/>
+          <w:bCs/>
+        </w:rPr>
+        <w:t>Pie Chart</w:t>
+      </w:r>
+      <w:r>
+        <w:t xml:space="preserve"> (showing where money went).</w:t>
+      </w:r>
+    </w:p>
+    <w:p>
+      <w:pPr>
+        <w:pStyle w:val="Heading4"/>
+      </w:pPr>
+      <w:r>
+        <w:rPr>
+          <w:rFonts w:ascii="Segoe UI Symbol" w:hAnsi="Segoe UI Symbol" w:cs="Segoe UI Symbol"/>
+        </w:rPr>
+        <w:t>🔐</w:t>
+      </w:r>
+      <w:r>
+        <w:t xml:space="preserve"> 2. Real User Authentication (Full Stack)</w:t>
+      </w:r>
+    </w:p>
+    <w:p>
+      <w:pPr>
+        <w:pStyle w:val="NormalWeb"/>
+        <w:numPr>
+          <w:ilvl w:val="0"/>
+          <w:numId w:val="11"/>
+        </w:numPr>
+      </w:pPr>
+      <w:r>
+        <w:rPr>
+          <w:b/>
+          <w:bCs/>
+        </w:rPr>
+        <w:t>What it is:</w:t>
+      </w:r>
+      <w:r>
+        <w:t xml:space="preserve"> Right now, your Node.js schema hardcodes </w:t>
+      </w:r>
+      <w:proofErr w:type="spellStart"/>
+      <w:r>
+        <w:rPr>
+          <w:rStyle w:val="HTMLCode"/>
+          <w:rFonts w:eastAsiaTheme="majorEastAsia"/>
+        </w:rPr>
+        <w:t>userId</w:t>
+      </w:r>
+      <w:proofErr w:type="spellEnd"/>
+      <w:r>
+        <w:rPr>
+          <w:rStyle w:val="HTMLCode"/>
+          <w:rFonts w:eastAsiaTheme="majorEastAsia"/>
+        </w:rPr>
+        <w:t>: "user1"</w:t>
+      </w:r>
+      <w:r>
+        <w:t>. If two people use your app, their bank statements will merge!</w:t>
+      </w:r>
+    </w:p>
+    <w:p>
+      <w:pPr>
+        <w:pStyle w:val="NormalWeb"/>
+        <w:numPr>
+          <w:ilvl w:val="0"/>
+          <w:numId w:val="11"/>
+        </w:numPr>
+      </w:pPr>
+      <w:r>
+        <w:rPr>
+          <w:b/>
+          <w:bCs/>
+        </w:rPr>
+        <w:t>What we will code:</w:t>
+      </w:r>
+      <w:r>
+        <w:t xml:space="preserve"> * </w:t>
+      </w:r>
+      <w:r>
+        <w:rPr>
+          <w:b/>
+          <w:bCs/>
+        </w:rPr>
+        <w:t>Node.js:</w:t>
+      </w:r>
+      <w:r>
+        <w:t xml:space="preserve"> Add login/signup routes using </w:t>
+      </w:r>
+      <w:proofErr w:type="spellStart"/>
+      <w:r>
+        <w:rPr>
+          <w:rStyle w:val="HTMLCode"/>
+          <w:rFonts w:eastAsiaTheme="majorEastAsia"/>
+        </w:rPr>
+        <w:t>jsonwebtoken</w:t>
+      </w:r>
+      <w:proofErr w:type="spellEnd"/>
+      <w:r>
+        <w:t xml:space="preserve"> (JWT) and </w:t>
+      </w:r>
+      <w:proofErr w:type="spellStart"/>
+      <w:r>
+        <w:rPr>
+          <w:rStyle w:val="HTMLCode"/>
+          <w:rFonts w:eastAsiaTheme="majorEastAsia"/>
+        </w:rPr>
+        <w:t>bcrypt</w:t>
+      </w:r>
+      <w:proofErr w:type="spellEnd"/>
+      <w:r>
+        <w:t xml:space="preserve"> for passwords.</w:t>
+      </w:r>
+    </w:p>
+    <w:p>
+      <w:pPr>
+        <w:pStyle w:val="NormalWeb"/>
+        <w:numPr>
+          <w:ilvl w:val="1"/>
+          <w:numId w:val="11"/>
+        </w:numPr>
+      </w:pPr>
+      <w:r>
+        <w:rPr>
+          <w:b/>
+          <w:bCs/>
+        </w:rPr>
+        <w:t>React:</w:t>
+      </w:r>
+      <w:r>
+        <w:t xml:space="preserve"> Add a Login screen.</w:t>
+      </w:r>
+    </w:p>
+    <w:p>
+      <w:pPr>
+        <w:pStyle w:val="NormalWeb"/>
+        <w:numPr>
+          <w:ilvl w:val="1"/>
+          <w:numId w:val="11"/>
+        </w:numPr>
+      </w:pPr>
+      <w:r>
+        <w:rPr>
+          <w:b/>
+          <w:bCs/>
+        </w:rPr>
+        <w:t>Python/</w:t>
+      </w:r>
+      <w:proofErr w:type="spellStart"/>
+      <w:r>
+        <w:rPr>
+          <w:b/>
+          <w:bCs/>
+        </w:rPr>
+        <w:t>ChromaDB</w:t>
+      </w:r>
+      <w:proofErr w:type="spellEnd"/>
+      <w:r>
+        <w:rPr>
+          <w:b/>
+          <w:bCs/>
+        </w:rPr>
+        <w:t>:</w:t>
+      </w:r>
+      <w:r>
+        <w:t xml:space="preserve"> Add metadata filtering so the AI only searches the logged-in user's data.</w:t>
+      </w:r>
+    </w:p>
+    <w:p>
+      <w:pPr>
+        <w:pStyle w:val="Heading4"/>
+      </w:pPr>
+      <w:r>
+        <w:rPr>
+          <w:rFonts w:ascii="Calibri Light" w:hAnsi="Calibri Light" w:cs="Calibri Light"/>
+        </w:rPr>
+        <w:t>🧠</w:t>
+      </w:r>
+      <w:r>
+        <w:t xml:space="preserve"> 3. Persistent Chat History (Backend &amp; Frontend)</w:t>
+      </w:r>
+    </w:p>
+    <w:p>
+      <w:pPr>
+        <w:pStyle w:val="NormalWeb"/>
+        <w:numPr>
+          <w:ilvl w:val="0"/>
+          <w:numId w:val="12"/>
+        </w:numPr>
+      </w:pPr>
+      <w:r>
+        <w:rPr>
+          <w:b/>
+          <w:bCs/>
+        </w:rPr>
+        <w:t>What it is:</w:t>
+      </w:r>
+      <w:r>
+        <w:t xml:space="preserve"> If you refresh your React</w:t>
+      </w:r>
+      <w:bookmarkStart w:id="0" w:name="_GoBack"/>
+      <w:bookmarkEnd w:id="0"/>
+      <w:r>
+        <w:t xml:space="preserve"> page right now, the entire AI conversation disappears.</w:t>
+      </w:r>
+    </w:p>
+    <w:p>
+      <w:pPr>
+        <w:pStyle w:val="NormalWeb"/>
+        <w:numPr>
+          <w:ilvl w:val="0"/>
+          <w:numId w:val="12"/>
+        </w:numPr>
+      </w:pPr>
+      <w:r>
+        <w:rPr>
+          <w:b/>
+          <w:bCs/>
+        </w:rPr>
+        <w:t>What we will code:</w:t>
+      </w:r>
+      <w:r>
+        <w:t xml:space="preserve"> We will create a </w:t>
+      </w:r>
+      <w:r>
+        <w:rPr>
+          <w:rStyle w:val="HTMLCode"/>
+          <w:rFonts w:eastAsiaTheme="majorEastAsia"/>
+        </w:rPr>
+        <w:t>Chat.js</w:t>
+      </w:r>
+      <w:r>
+        <w:t xml:space="preserve"> model in MongoDB. When the user sends a message, Node.js saves it. When </w:t>
+      </w:r>
+      <w:proofErr w:type="gramStart"/>
+      <w:r>
+        <w:t>React</w:t>
+      </w:r>
+      <w:proofErr w:type="gramEnd"/>
+      <w:r>
+        <w:t xml:space="preserve"> loads, it fetches the history so the conversation picks up right where it left off.</w:t>
+      </w:r>
+    </w:p>
+    <w:p>
+      <w:pPr>
+        <w:pStyle w:val="Heading4"/>
+      </w:pPr>
+      <w:r>
+        <w:rPr>
+          <w:rFonts w:ascii="Segoe UI Symbol" w:hAnsi="Segoe UI Symbol" w:cs="Segoe UI Symbol"/>
+        </w:rPr>
+        <w:t>📥</w:t>
+      </w:r>
+      <w:r>
+        <w:t xml:space="preserve"> 4. Export to CSV / Excel (Frontend)</w:t>
+      </w:r>
+    </w:p>
+    <w:p>
+      <w:pPr>
+        <w:pStyle w:val="NormalWeb"/>
+        <w:numPr>
+          <w:ilvl w:val="0"/>
+          <w:numId w:val="13"/>
+        </w:numPr>
+      </w:pPr>
+      <w:r>
+        <w:rPr>
+          <w:b/>
+          <w:bCs/>
+        </w:rPr>
+        <w:t>What it is:</w:t>
+      </w:r>
+      <w:r>
+        <w:t xml:space="preserve"> Users want to own their data. After the AI parses 100 transactions from the PDF, they should be able to download it.</w:t>
+      </w:r>
+    </w:p>
+    <w:p>
+      <w:pPr>
+        <w:pStyle w:val="NormalWeb"/>
+        <w:numPr>
+          <w:ilvl w:val="0"/>
+          <w:numId w:val="13"/>
+        </w:numPr>
+      </w:pPr>
+      <w:r>
+        <w:rPr>
+          <w:b/>
+          <w:bCs/>
+        </w:rPr>
+        <w:t>What we will code:</w:t>
+      </w:r>
+      <w:r>
+        <w:t xml:space="preserve"> A simple "Export" button in React that converts your JSON data into a clean </w:t>
+      </w:r>
+      <w:r>
+        <w:rPr>
+          <w:rStyle w:val="HTMLCode"/>
+          <w:rFonts w:eastAsiaTheme="majorEastAsia"/>
+        </w:rPr>
+        <w:t>.csv</w:t>
+      </w:r>
+      <w:r>
+        <w:t xml:space="preserve"> file they can open in Excel.</w:t>
+      </w:r>
+    </w:p>
+    <w:p>
+      <w:pPr>
+        <w:pStyle w:val="Heading4"/>
+      </w:pPr>
+      <w:r>
+        <w:rPr>
+          <w:rFonts w:ascii="Segoe UI Symbol" w:hAnsi="Segoe UI Symbol" w:cs="Segoe UI Symbol"/>
+        </w:rPr>
+        <w:t>🐳</w:t>
+      </w:r>
+      <w:r>
+        <w:t xml:space="preserve"> 5. </w:t>
+      </w:r>
+      <w:proofErr w:type="spellStart"/>
+      <w:r>
+        <w:t>Dockerization</w:t>
+      </w:r>
+      <w:proofErr w:type="spellEnd"/>
+      <w:r>
+        <w:t xml:space="preserve"> (DevOps)</w:t>
+      </w:r>
+    </w:p>
+    <w:p>
+      <w:pPr>
+        <w:pStyle w:val="NormalWeb"/>
+        <w:numPr>
+          <w:ilvl w:val="0"/>
+          <w:numId w:val="14"/>
+        </w:numPr>
+      </w:pPr>
+      <w:r>
+        <w:rPr>
+          <w:b/>
+          <w:bCs/>
+        </w:rPr>
+        <w:t>What it is:</w:t>
+      </w:r>
+      <w:r>
+        <w:t xml:space="preserve"> Right now, you have to run </w:t>
+      </w:r>
+      <w:proofErr w:type="spellStart"/>
+      <w:r>
+        <w:rPr>
+          <w:rStyle w:val="HTMLCode"/>
+          <w:rFonts w:eastAsiaTheme="majorEastAsia"/>
+        </w:rPr>
+        <w:t>npm</w:t>
+      </w:r>
+      <w:proofErr w:type="spellEnd"/>
+      <w:r>
+        <w:rPr>
+          <w:rStyle w:val="HTMLCode"/>
+          <w:rFonts w:eastAsiaTheme="majorEastAsia"/>
+        </w:rPr>
+        <w:t xml:space="preserve"> start</w:t>
+      </w:r>
+      <w:r>
+        <w:t xml:space="preserve"> (React), </w:t>
+      </w:r>
+      <w:proofErr w:type="spellStart"/>
+      <w:r>
+        <w:rPr>
+          <w:rStyle w:val="HTMLCode"/>
+          <w:rFonts w:eastAsiaTheme="majorEastAsia"/>
+        </w:rPr>
+        <w:t>npm</w:t>
+      </w:r>
+      <w:proofErr w:type="spellEnd"/>
+      <w:r>
+        <w:rPr>
+          <w:rStyle w:val="HTMLCode"/>
+          <w:rFonts w:eastAsiaTheme="majorEastAsia"/>
+        </w:rPr>
+        <w:t xml:space="preserve"> start</w:t>
+      </w:r>
+      <w:r>
+        <w:t xml:space="preserve"> (Node), and </w:t>
+      </w:r>
+      <w:proofErr w:type="spellStart"/>
+      <w:r>
+        <w:rPr>
+          <w:rStyle w:val="HTMLCode"/>
+          <w:rFonts w:eastAsiaTheme="majorEastAsia"/>
+        </w:rPr>
+        <w:t>uvicorn</w:t>
+      </w:r>
+      <w:proofErr w:type="spellEnd"/>
+      <w:r>
+        <w:rPr>
+          <w:rStyle w:val="HTMLCode"/>
+          <w:rFonts w:eastAsiaTheme="majorEastAsia"/>
+        </w:rPr>
+        <w:t xml:space="preserve"> </w:t>
+      </w:r>
+      <w:proofErr w:type="spellStart"/>
+      <w:r>
+        <w:rPr>
+          <w:rStyle w:val="HTMLCode"/>
+          <w:rFonts w:eastAsiaTheme="majorEastAsia"/>
+        </w:rPr>
+        <w:t>main</w:t>
+      </w:r>
+      <w:proofErr w:type="gramStart"/>
+      <w:r>
+        <w:rPr>
+          <w:rStyle w:val="HTMLCode"/>
+          <w:rFonts w:eastAsiaTheme="majorEastAsia"/>
+        </w:rPr>
+        <w:t>:app</w:t>
+      </w:r>
+      <w:proofErr w:type="spellEnd"/>
+      <w:proofErr w:type="gramEnd"/>
+      <w:r>
+        <w:t xml:space="preserve"> (Python) in three separate terminals.</w:t>
+      </w:r>
+    </w:p>
+    <w:p>
+      <w:pPr>
+        <w:pStyle w:val="NormalWeb"/>
+        <w:numPr>
+          <w:ilvl w:val="0"/>
+          <w:numId w:val="14"/>
+        </w:numPr>
+      </w:pPr>
+      <w:r>
+        <w:rPr>
+          <w:b/>
+          <w:bCs/>
+        </w:rPr>
+        <w:t>What we will code:</w:t>
+      </w:r>
+      <w:r>
+        <w:t xml:space="preserve"> A </w:t>
+      </w:r>
+      <w:proofErr w:type="spellStart"/>
+      <w:r>
+        <w:rPr>
+          <w:rStyle w:val="HTMLCode"/>
+          <w:rFonts w:eastAsiaTheme="majorEastAsia"/>
+        </w:rPr>
+        <w:t>docker-compose.yml</w:t>
+      </w:r>
+      <w:proofErr w:type="spellEnd"/>
+      <w:r>
+        <w:t xml:space="preserve"> file. You will run ONE command (</w:t>
+      </w:r>
+      <w:proofErr w:type="spellStart"/>
+      <w:r>
+        <w:rPr>
+          <w:rStyle w:val="HTMLCode"/>
+          <w:rFonts w:eastAsiaTheme="majorEastAsia"/>
+        </w:rPr>
+        <w:t>docker</w:t>
+      </w:r>
+      <w:proofErr w:type="spellEnd"/>
+      <w:r>
+        <w:rPr>
+          <w:rStyle w:val="HTMLCode"/>
+          <w:rFonts w:eastAsiaTheme="majorEastAsia"/>
+        </w:rPr>
+        <w:t>-compose up</w:t>
+      </w:r>
+      <w:r>
+        <w:t>), and all three servers will perfectly boot up and connect to each other.</w:t>
+      </w:r>
+    </w:p>
+    <w:p>
+      <w:pPr>
+        <w:spacing w:before="100" w:beforeAutospacing="1" w:after="100" w:afterAutospacing="1" w:line="240" w:lineRule="auto"/>
+        <w:rPr>
+          <w:rFonts w:ascii="Times New Roman" w:eastAsia="Times New Roman" w:hAnsi="Times New Roman" w:cs="Times New Roman"/>
+          <w:sz w:val="24"/>
+          <w:szCs w:val="24"/>
+        </w:rPr>
+      </w:pPr>
     </w:p>
     <w:p/>
     <w:sectPr>
@@ -1154,6 +2527,421 @@
     </w:lvl>
   </w:abstractNum>
   <w:abstractNum w:abstractNumId="2" w15:restartNumberingAfterBreak="0">
+    <w:nsid w:val="22D20861"/>
+    <w:multiLevelType w:val="multilevel"/>
+    <w:tmpl w:val="4D86A064"/>
+    <w:lvl w:ilvl="0">
+      <w:start w:val="1"/>
+      <w:numFmt w:val="bullet"/>
+      <w:lvlText w:val=""/>
+      <w:lvlJc w:val="left"/>
+      <w:pPr>
+        <w:tabs>
+          <w:tab w:val="num" w:pos="720"/>
+        </w:tabs>
+        <w:ind w:left="720" w:hanging="360"/>
+      </w:pPr>
+      <w:rPr>
+        <w:rFonts w:ascii="Symbol" w:hAnsi="Symbol" w:hint="default"/>
+        <w:sz w:val="20"/>
+      </w:rPr>
+    </w:lvl>
+    <w:lvl w:ilvl="1">
+      <w:start w:val="1"/>
+      <w:numFmt w:val="bullet"/>
+      <w:lvlText w:val="o"/>
+      <w:lvlJc w:val="left"/>
+      <w:pPr>
+        <w:tabs>
+          <w:tab w:val="num" w:pos="1440"/>
+        </w:tabs>
+        <w:ind w:left="1440" w:hanging="360"/>
+      </w:pPr>
+      <w:rPr>
+        <w:rFonts w:ascii="Courier New" w:hAnsi="Courier New" w:hint="default"/>
+        <w:sz w:val="20"/>
+      </w:rPr>
+    </w:lvl>
+    <w:lvl w:ilvl="2" w:tentative="1">
+      <w:start w:val="1"/>
+      <w:numFmt w:val="bullet"/>
+      <w:lvlText w:val=""/>
+      <w:lvlJc w:val="left"/>
+      <w:pPr>
+        <w:tabs>
+          <w:tab w:val="num" w:pos="2160"/>
+        </w:tabs>
+        <w:ind w:left="2160" w:hanging="360"/>
+      </w:pPr>
+      <w:rPr>
+        <w:rFonts w:ascii="Wingdings" w:hAnsi="Wingdings" w:hint="default"/>
+        <w:sz w:val="20"/>
+      </w:rPr>
+    </w:lvl>
+    <w:lvl w:ilvl="3" w:tentative="1">
+      <w:start w:val="1"/>
+      <w:numFmt w:val="bullet"/>
+      <w:lvlText w:val=""/>
+      <w:lvlJc w:val="left"/>
+      <w:pPr>
+        <w:tabs>
+          <w:tab w:val="num" w:pos="2880"/>
+        </w:tabs>
+        <w:ind w:left="2880" w:hanging="360"/>
+      </w:pPr>
+      <w:rPr>
+        <w:rFonts w:ascii="Wingdings" w:hAnsi="Wingdings" w:hint="default"/>
+        <w:sz w:val="20"/>
+      </w:rPr>
+    </w:lvl>
+    <w:lvl w:ilvl="4" w:tentative="1">
+      <w:start w:val="1"/>
+      <w:numFmt w:val="bullet"/>
+      <w:lvlText w:val=""/>
+      <w:lvlJc w:val="left"/>
+      <w:pPr>
+        <w:tabs>
+          <w:tab w:val="num" w:pos="3600"/>
+        </w:tabs>
+        <w:ind w:left="3600" w:hanging="360"/>
+      </w:pPr>
+      <w:rPr>
+        <w:rFonts w:ascii="Wingdings" w:hAnsi="Wingdings" w:hint="default"/>
+        <w:sz w:val="20"/>
+      </w:rPr>
+    </w:lvl>
+    <w:lvl w:ilvl="5" w:tentative="1">
+      <w:start w:val="1"/>
+      <w:numFmt w:val="bullet"/>
+      <w:lvlText w:val=""/>
+      <w:lvlJc w:val="left"/>
+      <w:pPr>
+        <w:tabs>
+          <w:tab w:val="num" w:pos="4320"/>
+        </w:tabs>
+        <w:ind w:left="4320" w:hanging="360"/>
+      </w:pPr>
+      <w:rPr>
+        <w:rFonts w:ascii="Wingdings" w:hAnsi="Wingdings" w:hint="default"/>
+        <w:sz w:val="20"/>
+      </w:rPr>
+    </w:lvl>
+    <w:lvl w:ilvl="6" w:tentative="1">
+      <w:start w:val="1"/>
+      <w:numFmt w:val="bullet"/>
+      <w:lvlText w:val=""/>
+      <w:lvlJc w:val="left"/>
+      <w:pPr>
+        <w:tabs>
+          <w:tab w:val="num" w:pos="5040"/>
+        </w:tabs>
+        <w:ind w:left="5040" w:hanging="360"/>
+      </w:pPr>
+      <w:rPr>
+        <w:rFonts w:ascii="Wingdings" w:hAnsi="Wingdings" w:hint="default"/>
+        <w:sz w:val="20"/>
+      </w:rPr>
+    </w:lvl>
+    <w:lvl w:ilvl="7" w:tentative="1">
+      <w:start w:val="1"/>
+      <w:numFmt w:val="bullet"/>
+      <w:lvlText w:val=""/>
+      <w:lvlJc w:val="left"/>
+      <w:pPr>
+        <w:tabs>
+          <w:tab w:val="num" w:pos="5760"/>
+        </w:tabs>
+        <w:ind w:left="5760" w:hanging="360"/>
+      </w:pPr>
+      <w:rPr>
+        <w:rFonts w:ascii="Wingdings" w:hAnsi="Wingdings" w:hint="default"/>
+        <w:sz w:val="20"/>
+      </w:rPr>
+    </w:lvl>
+    <w:lvl w:ilvl="8" w:tentative="1">
+      <w:start w:val="1"/>
+      <w:numFmt w:val="bullet"/>
+      <w:lvlText w:val=""/>
+      <w:lvlJc w:val="left"/>
+      <w:pPr>
+        <w:tabs>
+          <w:tab w:val="num" w:pos="6480"/>
+        </w:tabs>
+        <w:ind w:left="6480" w:hanging="360"/>
+      </w:pPr>
+      <w:rPr>
+        <w:rFonts w:ascii="Wingdings" w:hAnsi="Wingdings" w:hint="default"/>
+        <w:sz w:val="20"/>
+      </w:rPr>
+    </w:lvl>
+  </w:abstractNum>
+  <w:abstractNum w:abstractNumId="3" w15:restartNumberingAfterBreak="0">
+    <w:nsid w:val="3CBF27E1"/>
+    <w:multiLevelType w:val="multilevel"/>
+    <w:tmpl w:val="1AD6E32C"/>
+    <w:lvl w:ilvl="0">
+      <w:start w:val="1"/>
+      <w:numFmt w:val="decimal"/>
+      <w:lvlText w:val="%1."/>
+      <w:lvlJc w:val="left"/>
+      <w:pPr>
+        <w:tabs>
+          <w:tab w:val="num" w:pos="720"/>
+        </w:tabs>
+        <w:ind w:left="720" w:hanging="360"/>
+      </w:pPr>
+    </w:lvl>
+    <w:lvl w:ilvl="1">
+      <w:start w:val="1"/>
+      <w:numFmt w:val="bullet"/>
+      <w:lvlText w:val="o"/>
+      <w:lvlJc w:val="left"/>
+      <w:pPr>
+        <w:tabs>
+          <w:tab w:val="num" w:pos="1440"/>
+        </w:tabs>
+        <w:ind w:left="1440" w:hanging="360"/>
+      </w:pPr>
+      <w:rPr>
+        <w:rFonts w:ascii="Courier New" w:hAnsi="Courier New" w:hint="default"/>
+        <w:sz w:val="20"/>
+      </w:rPr>
+    </w:lvl>
+    <w:lvl w:ilvl="2" w:tentative="1">
+      <w:start w:val="1"/>
+      <w:numFmt w:val="decimal"/>
+      <w:lvlText w:val="%3."/>
+      <w:lvlJc w:val="left"/>
+      <w:pPr>
+        <w:tabs>
+          <w:tab w:val="num" w:pos="2160"/>
+        </w:tabs>
+        <w:ind w:left="2160" w:hanging="360"/>
+      </w:pPr>
+    </w:lvl>
+    <w:lvl w:ilvl="3" w:tentative="1">
+      <w:start w:val="1"/>
+      <w:numFmt w:val="decimal"/>
+      <w:lvlText w:val="%4."/>
+      <w:lvlJc w:val="left"/>
+      <w:pPr>
+        <w:tabs>
+          <w:tab w:val="num" w:pos="2880"/>
+        </w:tabs>
+        <w:ind w:left="2880" w:hanging="360"/>
+      </w:pPr>
+    </w:lvl>
+    <w:lvl w:ilvl="4" w:tentative="1">
+      <w:start w:val="1"/>
+      <w:numFmt w:val="decimal"/>
+      <w:lvlText w:val="%5."/>
+      <w:lvlJc w:val="left"/>
+      <w:pPr>
+        <w:tabs>
+          <w:tab w:val="num" w:pos="3600"/>
+        </w:tabs>
+        <w:ind w:left="3600" w:hanging="360"/>
+      </w:pPr>
+    </w:lvl>
+    <w:lvl w:ilvl="5" w:tentative="1">
+      <w:start w:val="1"/>
+      <w:numFmt w:val="decimal"/>
+      <w:lvlText w:val="%6."/>
+      <w:lvlJc w:val="left"/>
+      <w:pPr>
+        <w:tabs>
+          <w:tab w:val="num" w:pos="4320"/>
+        </w:tabs>
+        <w:ind w:left="4320" w:hanging="360"/>
+      </w:pPr>
+    </w:lvl>
+    <w:lvl w:ilvl="6" w:tentative="1">
+      <w:start w:val="1"/>
+      <w:numFmt w:val="decimal"/>
+      <w:lvlText w:val="%7."/>
+      <w:lvlJc w:val="left"/>
+      <w:pPr>
+        <w:tabs>
+          <w:tab w:val="num" w:pos="5040"/>
+        </w:tabs>
+        <w:ind w:left="5040" w:hanging="360"/>
+      </w:pPr>
+    </w:lvl>
+    <w:lvl w:ilvl="7" w:tentative="1">
+      <w:start w:val="1"/>
+      <w:numFmt w:val="decimal"/>
+      <w:lvlText w:val="%8."/>
+      <w:lvlJc w:val="left"/>
+      <w:pPr>
+        <w:tabs>
+          <w:tab w:val="num" w:pos="5760"/>
+        </w:tabs>
+        <w:ind w:left="5760" w:hanging="360"/>
+      </w:pPr>
+    </w:lvl>
+    <w:lvl w:ilvl="8" w:tentative="1">
+      <w:start w:val="1"/>
+      <w:numFmt w:val="decimal"/>
+      <w:lvlText w:val="%9."/>
+      <w:lvlJc w:val="left"/>
+      <w:pPr>
+        <w:tabs>
+          <w:tab w:val="num" w:pos="6480"/>
+        </w:tabs>
+        <w:ind w:left="6480" w:hanging="360"/>
+      </w:pPr>
+    </w:lvl>
+  </w:abstractNum>
+  <w:abstractNum w:abstractNumId="4" w15:restartNumberingAfterBreak="0">
+    <w:nsid w:val="3D774E9A"/>
+    <w:multiLevelType w:val="multilevel"/>
+    <w:tmpl w:val="708C0E96"/>
+    <w:lvl w:ilvl="0">
+      <w:start w:val="1"/>
+      <w:numFmt w:val="bullet"/>
+      <w:lvlText w:val=""/>
+      <w:lvlJc w:val="left"/>
+      <w:pPr>
+        <w:tabs>
+          <w:tab w:val="num" w:pos="720"/>
+        </w:tabs>
+        <w:ind w:left="720" w:hanging="360"/>
+      </w:pPr>
+      <w:rPr>
+        <w:rFonts w:ascii="Symbol" w:hAnsi="Symbol" w:hint="default"/>
+        <w:sz w:val="20"/>
+      </w:rPr>
+    </w:lvl>
+    <w:lvl w:ilvl="1" w:tentative="1">
+      <w:start w:val="1"/>
+      <w:numFmt w:val="bullet"/>
+      <w:lvlText w:val="o"/>
+      <w:lvlJc w:val="left"/>
+      <w:pPr>
+        <w:tabs>
+          <w:tab w:val="num" w:pos="1440"/>
+        </w:tabs>
+        <w:ind w:left="1440" w:hanging="360"/>
+      </w:pPr>
+      <w:rPr>
+        <w:rFonts w:ascii="Courier New" w:hAnsi="Courier New" w:hint="default"/>
+        <w:sz w:val="20"/>
+      </w:rPr>
+    </w:lvl>
+    <w:lvl w:ilvl="2" w:tentative="1">
+      <w:start w:val="1"/>
+      <w:numFmt w:val="bullet"/>
+      <w:lvlText w:val=""/>
+      <w:lvlJc w:val="left"/>
+      <w:pPr>
+        <w:tabs>
+          <w:tab w:val="num" w:pos="2160"/>
+        </w:tabs>
+        <w:ind w:left="2160" w:hanging="360"/>
+      </w:pPr>
+      <w:rPr>
+        <w:rFonts w:ascii="Wingdings" w:hAnsi="Wingdings" w:hint="default"/>
+        <w:sz w:val="20"/>
+      </w:rPr>
+    </w:lvl>
+    <w:lvl w:ilvl="3" w:tentative="1">
+      <w:start w:val="1"/>
+      <w:numFmt w:val="bullet"/>
+      <w:lvlText w:val=""/>
+      <w:lvlJc w:val="left"/>
+      <w:pPr>
+        <w:tabs>
+          <w:tab w:val="num" w:pos="2880"/>
+        </w:tabs>
+        <w:ind w:left="2880" w:hanging="360"/>
+      </w:pPr>
+      <w:rPr>
+        <w:rFonts w:ascii="Wingdings" w:hAnsi="Wingdings" w:hint="default"/>
+        <w:sz w:val="20"/>
+      </w:rPr>
+    </w:lvl>
+    <w:lvl w:ilvl="4" w:tentative="1">
+      <w:start w:val="1"/>
+      <w:numFmt w:val="bullet"/>
+      <w:lvlText w:val=""/>
+      <w:lvlJc w:val="left"/>
+      <w:pPr>
+        <w:tabs>
+          <w:tab w:val="num" w:pos="3600"/>
+        </w:tabs>
+        <w:ind w:left="3600" w:hanging="360"/>
+      </w:pPr>
+      <w:rPr>
+        <w:rFonts w:ascii="Wingdings" w:hAnsi="Wingdings" w:hint="default"/>
+        <w:sz w:val="20"/>
+      </w:rPr>
+    </w:lvl>
+    <w:lvl w:ilvl="5" w:tentative="1">
+      <w:start w:val="1"/>
+      <w:numFmt w:val="bullet"/>
+      <w:lvlText w:val=""/>
+      <w:lvlJc w:val="left"/>
+      <w:pPr>
+        <w:tabs>
+          <w:tab w:val="num" w:pos="4320"/>
+        </w:tabs>
+        <w:ind w:left="4320" w:hanging="360"/>
+      </w:pPr>
+      <w:rPr>
+        <w:rFonts w:ascii="Wingdings" w:hAnsi="Wingdings" w:hint="default"/>
+        <w:sz w:val="20"/>
+      </w:rPr>
+    </w:lvl>
+    <w:lvl w:ilvl="6" w:tentative="1">
+      <w:start w:val="1"/>
+      <w:numFmt w:val="bullet"/>
+      <w:lvlText w:val=""/>
+      <w:lvlJc w:val="left"/>
+      <w:pPr>
+        <w:tabs>
+          <w:tab w:val="num" w:pos="5040"/>
+        </w:tabs>
+        <w:ind w:left="5040" w:hanging="360"/>
+      </w:pPr>
+      <w:rPr>
+        <w:rFonts w:ascii="Wingdings" w:hAnsi="Wingdings" w:hint="default"/>
+        <w:sz w:val="20"/>
+      </w:rPr>
+    </w:lvl>
+    <w:lvl w:ilvl="7" w:tentative="1">
+      <w:start w:val="1"/>
+      <w:numFmt w:val="bullet"/>
+      <w:lvlText w:val=""/>
+      <w:lvlJc w:val="left"/>
+      <w:pPr>
+        <w:tabs>
+          <w:tab w:val="num" w:pos="5760"/>
+        </w:tabs>
+        <w:ind w:left="5760" w:hanging="360"/>
+      </w:pPr>
+      <w:rPr>
+        <w:rFonts w:ascii="Wingdings" w:hAnsi="Wingdings" w:hint="default"/>
+        <w:sz w:val="20"/>
+      </w:rPr>
+    </w:lvl>
+    <w:lvl w:ilvl="8" w:tentative="1">
+      <w:start w:val="1"/>
+      <w:numFmt w:val="bullet"/>
+      <w:lvlText w:val=""/>
+      <w:lvlJc w:val="left"/>
+      <w:pPr>
+        <w:tabs>
+          <w:tab w:val="num" w:pos="6480"/>
+        </w:tabs>
+        <w:ind w:left="6480" w:hanging="360"/>
+      </w:pPr>
+      <w:rPr>
+        <w:rFonts w:ascii="Wingdings" w:hAnsi="Wingdings" w:hint="default"/>
+        <w:sz w:val="20"/>
+      </w:rPr>
+    </w:lvl>
+  </w:abstractNum>
+  <w:abstractNum w:abstractNumId="5" w15:restartNumberingAfterBreak="0">
     <w:nsid w:val="3E7123D5"/>
     <w:multiLevelType w:val="multilevel"/>
     <w:tmpl w:val="B1BE527E"/>
@@ -1302,7 +3090,7 @@
       </w:rPr>
     </w:lvl>
   </w:abstractNum>
-  <w:abstractNum w:abstractNumId="3" w15:restartNumberingAfterBreak="0">
+  <w:abstractNum w:abstractNumId="6" w15:restartNumberingAfterBreak="0">
     <w:nsid w:val="417601BE"/>
     <w:multiLevelType w:val="multilevel"/>
     <w:tmpl w:val="2D4AC106"/>
@@ -1451,7 +3239,422 @@
       </w:rPr>
     </w:lvl>
   </w:abstractNum>
-  <w:abstractNum w:abstractNumId="4" w15:restartNumberingAfterBreak="0">
+  <w:abstractNum w:abstractNumId="7" w15:restartNumberingAfterBreak="0">
+    <w:nsid w:val="446B0A61"/>
+    <w:multiLevelType w:val="multilevel"/>
+    <w:tmpl w:val="B3CC4FA2"/>
+    <w:lvl w:ilvl="0">
+      <w:start w:val="1"/>
+      <w:numFmt w:val="bullet"/>
+      <w:lvlText w:val=""/>
+      <w:lvlJc w:val="left"/>
+      <w:pPr>
+        <w:tabs>
+          <w:tab w:val="num" w:pos="720"/>
+        </w:tabs>
+        <w:ind w:left="720" w:hanging="360"/>
+      </w:pPr>
+      <w:rPr>
+        <w:rFonts w:ascii="Symbol" w:hAnsi="Symbol" w:hint="default"/>
+        <w:sz w:val="20"/>
+      </w:rPr>
+    </w:lvl>
+    <w:lvl w:ilvl="1" w:tentative="1">
+      <w:start w:val="1"/>
+      <w:numFmt w:val="bullet"/>
+      <w:lvlText w:val="o"/>
+      <w:lvlJc w:val="left"/>
+      <w:pPr>
+        <w:tabs>
+          <w:tab w:val="num" w:pos="1440"/>
+        </w:tabs>
+        <w:ind w:left="1440" w:hanging="360"/>
+      </w:pPr>
+      <w:rPr>
+        <w:rFonts w:ascii="Courier New" w:hAnsi="Courier New" w:hint="default"/>
+        <w:sz w:val="20"/>
+      </w:rPr>
+    </w:lvl>
+    <w:lvl w:ilvl="2" w:tentative="1">
+      <w:start w:val="1"/>
+      <w:numFmt w:val="bullet"/>
+      <w:lvlText w:val=""/>
+      <w:lvlJc w:val="left"/>
+      <w:pPr>
+        <w:tabs>
+          <w:tab w:val="num" w:pos="2160"/>
+        </w:tabs>
+        <w:ind w:left="2160" w:hanging="360"/>
+      </w:pPr>
+      <w:rPr>
+        <w:rFonts w:ascii="Wingdings" w:hAnsi="Wingdings" w:hint="default"/>
+        <w:sz w:val="20"/>
+      </w:rPr>
+    </w:lvl>
+    <w:lvl w:ilvl="3" w:tentative="1">
+      <w:start w:val="1"/>
+      <w:numFmt w:val="bullet"/>
+      <w:lvlText w:val=""/>
+      <w:lvlJc w:val="left"/>
+      <w:pPr>
+        <w:tabs>
+          <w:tab w:val="num" w:pos="2880"/>
+        </w:tabs>
+        <w:ind w:left="2880" w:hanging="360"/>
+      </w:pPr>
+      <w:rPr>
+        <w:rFonts w:ascii="Wingdings" w:hAnsi="Wingdings" w:hint="default"/>
+        <w:sz w:val="20"/>
+      </w:rPr>
+    </w:lvl>
+    <w:lvl w:ilvl="4" w:tentative="1">
+      <w:start w:val="1"/>
+      <w:numFmt w:val="bullet"/>
+      <w:lvlText w:val=""/>
+      <w:lvlJc w:val="left"/>
+      <w:pPr>
+        <w:tabs>
+          <w:tab w:val="num" w:pos="3600"/>
+        </w:tabs>
+        <w:ind w:left="3600" w:hanging="360"/>
+      </w:pPr>
+      <w:rPr>
+        <w:rFonts w:ascii="Wingdings" w:hAnsi="Wingdings" w:hint="default"/>
+        <w:sz w:val="20"/>
+      </w:rPr>
+    </w:lvl>
+    <w:lvl w:ilvl="5" w:tentative="1">
+      <w:start w:val="1"/>
+      <w:numFmt w:val="bullet"/>
+      <w:lvlText w:val=""/>
+      <w:lvlJc w:val="left"/>
+      <w:pPr>
+        <w:tabs>
+          <w:tab w:val="num" w:pos="4320"/>
+        </w:tabs>
+        <w:ind w:left="4320" w:hanging="360"/>
+      </w:pPr>
+      <w:rPr>
+        <w:rFonts w:ascii="Wingdings" w:hAnsi="Wingdings" w:hint="default"/>
+        <w:sz w:val="20"/>
+      </w:rPr>
+    </w:lvl>
+    <w:lvl w:ilvl="6" w:tentative="1">
+      <w:start w:val="1"/>
+      <w:numFmt w:val="bullet"/>
+      <w:lvlText w:val=""/>
+      <w:lvlJc w:val="left"/>
+      <w:pPr>
+        <w:tabs>
+          <w:tab w:val="num" w:pos="5040"/>
+        </w:tabs>
+        <w:ind w:left="5040" w:hanging="360"/>
+      </w:pPr>
+      <w:rPr>
+        <w:rFonts w:ascii="Wingdings" w:hAnsi="Wingdings" w:hint="default"/>
+        <w:sz w:val="20"/>
+      </w:rPr>
+    </w:lvl>
+    <w:lvl w:ilvl="7" w:tentative="1">
+      <w:start w:val="1"/>
+      <w:numFmt w:val="bullet"/>
+      <w:lvlText w:val=""/>
+      <w:lvlJc w:val="left"/>
+      <w:pPr>
+        <w:tabs>
+          <w:tab w:val="num" w:pos="5760"/>
+        </w:tabs>
+        <w:ind w:left="5760" w:hanging="360"/>
+      </w:pPr>
+      <w:rPr>
+        <w:rFonts w:ascii="Wingdings" w:hAnsi="Wingdings" w:hint="default"/>
+        <w:sz w:val="20"/>
+      </w:rPr>
+    </w:lvl>
+    <w:lvl w:ilvl="8" w:tentative="1">
+      <w:start w:val="1"/>
+      <w:numFmt w:val="bullet"/>
+      <w:lvlText w:val=""/>
+      <w:lvlJc w:val="left"/>
+      <w:pPr>
+        <w:tabs>
+          <w:tab w:val="num" w:pos="6480"/>
+        </w:tabs>
+        <w:ind w:left="6480" w:hanging="360"/>
+      </w:pPr>
+      <w:rPr>
+        <w:rFonts w:ascii="Wingdings" w:hAnsi="Wingdings" w:hint="default"/>
+        <w:sz w:val="20"/>
+      </w:rPr>
+    </w:lvl>
+  </w:abstractNum>
+  <w:abstractNum w:abstractNumId="8" w15:restartNumberingAfterBreak="0">
+    <w:nsid w:val="461567C6"/>
+    <w:multiLevelType w:val="multilevel"/>
+    <w:tmpl w:val="DA987604"/>
+    <w:lvl w:ilvl="0">
+      <w:start w:val="1"/>
+      <w:numFmt w:val="decimal"/>
+      <w:lvlText w:val="%1."/>
+      <w:lvlJc w:val="left"/>
+      <w:pPr>
+        <w:tabs>
+          <w:tab w:val="num" w:pos="720"/>
+        </w:tabs>
+        <w:ind w:left="720" w:hanging="360"/>
+      </w:pPr>
+    </w:lvl>
+    <w:lvl w:ilvl="1">
+      <w:start w:val="1"/>
+      <w:numFmt w:val="bullet"/>
+      <w:lvlText w:val="o"/>
+      <w:lvlJc w:val="left"/>
+      <w:pPr>
+        <w:tabs>
+          <w:tab w:val="num" w:pos="1440"/>
+        </w:tabs>
+        <w:ind w:left="1440" w:hanging="360"/>
+      </w:pPr>
+      <w:rPr>
+        <w:rFonts w:ascii="Courier New" w:hAnsi="Courier New" w:hint="default"/>
+        <w:sz w:val="20"/>
+      </w:rPr>
+    </w:lvl>
+    <w:lvl w:ilvl="2" w:tentative="1">
+      <w:start w:val="1"/>
+      <w:numFmt w:val="decimal"/>
+      <w:lvlText w:val="%3."/>
+      <w:lvlJc w:val="left"/>
+      <w:pPr>
+        <w:tabs>
+          <w:tab w:val="num" w:pos="2160"/>
+        </w:tabs>
+        <w:ind w:left="2160" w:hanging="360"/>
+      </w:pPr>
+    </w:lvl>
+    <w:lvl w:ilvl="3" w:tentative="1">
+      <w:start w:val="1"/>
+      <w:numFmt w:val="decimal"/>
+      <w:lvlText w:val="%4."/>
+      <w:lvlJc w:val="left"/>
+      <w:pPr>
+        <w:tabs>
+          <w:tab w:val="num" w:pos="2880"/>
+        </w:tabs>
+        <w:ind w:left="2880" w:hanging="360"/>
+      </w:pPr>
+    </w:lvl>
+    <w:lvl w:ilvl="4" w:tentative="1">
+      <w:start w:val="1"/>
+      <w:numFmt w:val="decimal"/>
+      <w:lvlText w:val="%5."/>
+      <w:lvlJc w:val="left"/>
+      <w:pPr>
+        <w:tabs>
+          <w:tab w:val="num" w:pos="3600"/>
+        </w:tabs>
+        <w:ind w:left="3600" w:hanging="360"/>
+      </w:pPr>
+    </w:lvl>
+    <w:lvl w:ilvl="5" w:tentative="1">
+      <w:start w:val="1"/>
+      <w:numFmt w:val="decimal"/>
+      <w:lvlText w:val="%6."/>
+      <w:lvlJc w:val="left"/>
+      <w:pPr>
+        <w:tabs>
+          <w:tab w:val="num" w:pos="4320"/>
+        </w:tabs>
+        <w:ind w:left="4320" w:hanging="360"/>
+      </w:pPr>
+    </w:lvl>
+    <w:lvl w:ilvl="6" w:tentative="1">
+      <w:start w:val="1"/>
+      <w:numFmt w:val="decimal"/>
+      <w:lvlText w:val="%7."/>
+      <w:lvlJc w:val="left"/>
+      <w:pPr>
+        <w:tabs>
+          <w:tab w:val="num" w:pos="5040"/>
+        </w:tabs>
+        <w:ind w:left="5040" w:hanging="360"/>
+      </w:pPr>
+    </w:lvl>
+    <w:lvl w:ilvl="7" w:tentative="1">
+      <w:start w:val="1"/>
+      <w:numFmt w:val="decimal"/>
+      <w:lvlText w:val="%8."/>
+      <w:lvlJc w:val="left"/>
+      <w:pPr>
+        <w:tabs>
+          <w:tab w:val="num" w:pos="5760"/>
+        </w:tabs>
+        <w:ind w:left="5760" w:hanging="360"/>
+      </w:pPr>
+    </w:lvl>
+    <w:lvl w:ilvl="8" w:tentative="1">
+      <w:start w:val="1"/>
+      <w:numFmt w:val="decimal"/>
+      <w:lvlText w:val="%9."/>
+      <w:lvlJc w:val="left"/>
+      <w:pPr>
+        <w:tabs>
+          <w:tab w:val="num" w:pos="6480"/>
+        </w:tabs>
+        <w:ind w:left="6480" w:hanging="360"/>
+      </w:pPr>
+    </w:lvl>
+  </w:abstractNum>
+  <w:abstractNum w:abstractNumId="9" w15:restartNumberingAfterBreak="0">
+    <w:nsid w:val="5B9814EA"/>
+    <w:multiLevelType w:val="multilevel"/>
+    <w:tmpl w:val="FC9EC6E8"/>
+    <w:lvl w:ilvl="0">
+      <w:start w:val="1"/>
+      <w:numFmt w:val="bullet"/>
+      <w:lvlText w:val=""/>
+      <w:lvlJc w:val="left"/>
+      <w:pPr>
+        <w:tabs>
+          <w:tab w:val="num" w:pos="720"/>
+        </w:tabs>
+        <w:ind w:left="720" w:hanging="360"/>
+      </w:pPr>
+      <w:rPr>
+        <w:rFonts w:ascii="Symbol" w:hAnsi="Symbol" w:hint="default"/>
+        <w:sz w:val="20"/>
+      </w:rPr>
+    </w:lvl>
+    <w:lvl w:ilvl="1" w:tentative="1">
+      <w:start w:val="1"/>
+      <w:numFmt w:val="bullet"/>
+      <w:lvlText w:val="o"/>
+      <w:lvlJc w:val="left"/>
+      <w:pPr>
+        <w:tabs>
+          <w:tab w:val="num" w:pos="1440"/>
+        </w:tabs>
+        <w:ind w:left="1440" w:hanging="360"/>
+      </w:pPr>
+      <w:rPr>
+        <w:rFonts w:ascii="Courier New" w:hAnsi="Courier New" w:hint="default"/>
+        <w:sz w:val="20"/>
+      </w:rPr>
+    </w:lvl>
+    <w:lvl w:ilvl="2" w:tentative="1">
+      <w:start w:val="1"/>
+      <w:numFmt w:val="bullet"/>
+      <w:lvlText w:val=""/>
+      <w:lvlJc w:val="left"/>
+      <w:pPr>
+        <w:tabs>
+          <w:tab w:val="num" w:pos="2160"/>
+        </w:tabs>
+        <w:ind w:left="2160" w:hanging="360"/>
+      </w:pPr>
+      <w:rPr>
+        <w:rFonts w:ascii="Wingdings" w:hAnsi="Wingdings" w:hint="default"/>
+        <w:sz w:val="20"/>
+      </w:rPr>
+    </w:lvl>
+    <w:lvl w:ilvl="3" w:tentative="1">
+      <w:start w:val="1"/>
+      <w:numFmt w:val="bullet"/>
+      <w:lvlText w:val=""/>
+      <w:lvlJc w:val="left"/>
+      <w:pPr>
+        <w:tabs>
+          <w:tab w:val="num" w:pos="2880"/>
+        </w:tabs>
+        <w:ind w:left="2880" w:hanging="360"/>
+      </w:pPr>
+      <w:rPr>
+        <w:rFonts w:ascii="Wingdings" w:hAnsi="Wingdings" w:hint="default"/>
+        <w:sz w:val="20"/>
+      </w:rPr>
+    </w:lvl>
+    <w:lvl w:ilvl="4" w:tentative="1">
+      <w:start w:val="1"/>
+      <w:numFmt w:val="bullet"/>
+      <w:lvlText w:val=""/>
+      <w:lvlJc w:val="left"/>
+      <w:pPr>
+        <w:tabs>
+          <w:tab w:val="num" w:pos="3600"/>
+        </w:tabs>
+        <w:ind w:left="3600" w:hanging="360"/>
+      </w:pPr>
+      <w:rPr>
+        <w:rFonts w:ascii="Wingdings" w:hAnsi="Wingdings" w:hint="default"/>
+        <w:sz w:val="20"/>
+      </w:rPr>
+    </w:lvl>
+    <w:lvl w:ilvl="5" w:tentative="1">
+      <w:start w:val="1"/>
+      <w:numFmt w:val="bullet"/>
+      <w:lvlText w:val=""/>
+      <w:lvlJc w:val="left"/>
+      <w:pPr>
+        <w:tabs>
+          <w:tab w:val="num" w:pos="4320"/>
+        </w:tabs>
+        <w:ind w:left="4320" w:hanging="360"/>
+      </w:pPr>
+      <w:rPr>
+        <w:rFonts w:ascii="Wingdings" w:hAnsi="Wingdings" w:hint="default"/>
+        <w:sz w:val="20"/>
+      </w:rPr>
+    </w:lvl>
+    <w:lvl w:ilvl="6" w:tentative="1">
+      <w:start w:val="1"/>
+      <w:numFmt w:val="bullet"/>
+      <w:lvlText w:val=""/>
+      <w:lvlJc w:val="left"/>
+      <w:pPr>
+        <w:tabs>
+          <w:tab w:val="num" w:pos="5040"/>
+        </w:tabs>
+        <w:ind w:left="5040" w:hanging="360"/>
+      </w:pPr>
+      <w:rPr>
+        <w:rFonts w:ascii="Wingdings" w:hAnsi="Wingdings" w:hint="default"/>
+        <w:sz w:val="20"/>
+      </w:rPr>
+    </w:lvl>
+    <w:lvl w:ilvl="7" w:tentative="1">
+      <w:start w:val="1"/>
+      <w:numFmt w:val="bullet"/>
+      <w:lvlText w:val=""/>
+      <w:lvlJc w:val="left"/>
+      <w:pPr>
+        <w:tabs>
+          <w:tab w:val="num" w:pos="5760"/>
+        </w:tabs>
+        <w:ind w:left="5760" w:hanging="360"/>
+      </w:pPr>
+      <w:rPr>
+        <w:rFonts w:ascii="Wingdings" w:hAnsi="Wingdings" w:hint="default"/>
+        <w:sz w:val="20"/>
+      </w:rPr>
+    </w:lvl>
+    <w:lvl w:ilvl="8" w:tentative="1">
+      <w:start w:val="1"/>
+      <w:numFmt w:val="bullet"/>
+      <w:lvlText w:val=""/>
+      <w:lvlJc w:val="left"/>
+      <w:pPr>
+        <w:tabs>
+          <w:tab w:val="num" w:pos="6480"/>
+        </w:tabs>
+        <w:ind w:left="6480" w:hanging="360"/>
+      </w:pPr>
+      <w:rPr>
+        <w:rFonts w:ascii="Wingdings" w:hAnsi="Wingdings" w:hint="default"/>
+        <w:sz w:val="20"/>
+      </w:rPr>
+    </w:lvl>
+  </w:abstractNum>
+  <w:abstractNum w:abstractNumId="10" w15:restartNumberingAfterBreak="0">
     <w:nsid w:val="77001B87"/>
     <w:multiLevelType w:val="multilevel"/>
     <w:tmpl w:val="71CAEBD0"/>
@@ -1600,20 +3803,430 @@
       </w:rPr>
     </w:lvl>
   </w:abstractNum>
+  <w:abstractNum w:abstractNumId="11" w15:restartNumberingAfterBreak="0">
+    <w:nsid w:val="7DFD2683"/>
+    <w:multiLevelType w:val="multilevel"/>
+    <w:tmpl w:val="2F90FD18"/>
+    <w:lvl w:ilvl="0">
+      <w:start w:val="1"/>
+      <w:numFmt w:val="bullet"/>
+      <w:lvlText w:val=""/>
+      <w:lvlJc w:val="left"/>
+      <w:pPr>
+        <w:tabs>
+          <w:tab w:val="num" w:pos="720"/>
+        </w:tabs>
+        <w:ind w:left="720" w:hanging="360"/>
+      </w:pPr>
+      <w:rPr>
+        <w:rFonts w:ascii="Symbol" w:hAnsi="Symbol" w:hint="default"/>
+        <w:sz w:val="20"/>
+      </w:rPr>
+    </w:lvl>
+    <w:lvl w:ilvl="1" w:tentative="1">
+      <w:start w:val="1"/>
+      <w:numFmt w:val="bullet"/>
+      <w:lvlText w:val="o"/>
+      <w:lvlJc w:val="left"/>
+      <w:pPr>
+        <w:tabs>
+          <w:tab w:val="num" w:pos="1440"/>
+        </w:tabs>
+        <w:ind w:left="1440" w:hanging="360"/>
+      </w:pPr>
+      <w:rPr>
+        <w:rFonts w:ascii="Courier New" w:hAnsi="Courier New" w:hint="default"/>
+        <w:sz w:val="20"/>
+      </w:rPr>
+    </w:lvl>
+    <w:lvl w:ilvl="2" w:tentative="1">
+      <w:start w:val="1"/>
+      <w:numFmt w:val="bullet"/>
+      <w:lvlText w:val=""/>
+      <w:lvlJc w:val="left"/>
+      <w:pPr>
+        <w:tabs>
+          <w:tab w:val="num" w:pos="2160"/>
+        </w:tabs>
+        <w:ind w:left="2160" w:hanging="360"/>
+      </w:pPr>
+      <w:rPr>
+        <w:rFonts w:ascii="Wingdings" w:hAnsi="Wingdings" w:hint="default"/>
+        <w:sz w:val="20"/>
+      </w:rPr>
+    </w:lvl>
+    <w:lvl w:ilvl="3" w:tentative="1">
+      <w:start w:val="1"/>
+      <w:numFmt w:val="bullet"/>
+      <w:lvlText w:val=""/>
+      <w:lvlJc w:val="left"/>
+      <w:pPr>
+        <w:tabs>
+          <w:tab w:val="num" w:pos="2880"/>
+        </w:tabs>
+        <w:ind w:left="2880" w:hanging="360"/>
+      </w:pPr>
+      <w:rPr>
+        <w:rFonts w:ascii="Wingdings" w:hAnsi="Wingdings" w:hint="default"/>
+        <w:sz w:val="20"/>
+      </w:rPr>
+    </w:lvl>
+    <w:lvl w:ilvl="4" w:tentative="1">
+      <w:start w:val="1"/>
+      <w:numFmt w:val="bullet"/>
+      <w:lvlText w:val=""/>
+      <w:lvlJc w:val="left"/>
+      <w:pPr>
+        <w:tabs>
+          <w:tab w:val="num" w:pos="3600"/>
+        </w:tabs>
+        <w:ind w:left="3600" w:hanging="360"/>
+      </w:pPr>
+      <w:rPr>
+        <w:rFonts w:ascii="Wingdings" w:hAnsi="Wingdings" w:hint="default"/>
+        <w:sz w:val="20"/>
+      </w:rPr>
+    </w:lvl>
+    <w:lvl w:ilvl="5" w:tentative="1">
+      <w:start w:val="1"/>
+      <w:numFmt w:val="bullet"/>
+      <w:lvlText w:val=""/>
+      <w:lvlJc w:val="left"/>
+      <w:pPr>
+        <w:tabs>
+          <w:tab w:val="num" w:pos="4320"/>
+        </w:tabs>
+        <w:ind w:left="4320" w:hanging="360"/>
+      </w:pPr>
+      <w:rPr>
+        <w:rFonts w:ascii="Wingdings" w:hAnsi="Wingdings" w:hint="default"/>
+        <w:sz w:val="20"/>
+      </w:rPr>
+    </w:lvl>
+    <w:lvl w:ilvl="6" w:tentative="1">
+      <w:start w:val="1"/>
+      <w:numFmt w:val="bullet"/>
+      <w:lvlText w:val=""/>
+      <w:lvlJc w:val="left"/>
+      <w:pPr>
+        <w:tabs>
+          <w:tab w:val="num" w:pos="5040"/>
+        </w:tabs>
+        <w:ind w:left="5040" w:hanging="360"/>
+      </w:pPr>
+      <w:rPr>
+        <w:rFonts w:ascii="Wingdings" w:hAnsi="Wingdings" w:hint="default"/>
+        <w:sz w:val="20"/>
+      </w:rPr>
+    </w:lvl>
+    <w:lvl w:ilvl="7" w:tentative="1">
+      <w:start w:val="1"/>
+      <w:numFmt w:val="bullet"/>
+      <w:lvlText w:val=""/>
+      <w:lvlJc w:val="left"/>
+      <w:pPr>
+        <w:tabs>
+          <w:tab w:val="num" w:pos="5760"/>
+        </w:tabs>
+        <w:ind w:left="5760" w:hanging="360"/>
+      </w:pPr>
+      <w:rPr>
+        <w:rFonts w:ascii="Wingdings" w:hAnsi="Wingdings" w:hint="default"/>
+        <w:sz w:val="20"/>
+      </w:rPr>
+    </w:lvl>
+    <w:lvl w:ilvl="8" w:tentative="1">
+      <w:start w:val="1"/>
+      <w:numFmt w:val="bullet"/>
+      <w:lvlText w:val=""/>
+      <w:lvlJc w:val="left"/>
+      <w:pPr>
+        <w:tabs>
+          <w:tab w:val="num" w:pos="6480"/>
+        </w:tabs>
+        <w:ind w:left="6480" w:hanging="360"/>
+      </w:pPr>
+      <w:rPr>
+        <w:rFonts w:ascii="Wingdings" w:hAnsi="Wingdings" w:hint="default"/>
+        <w:sz w:val="20"/>
+      </w:rPr>
+    </w:lvl>
+  </w:abstractNum>
+  <w:abstractNum w:abstractNumId="12" w15:restartNumberingAfterBreak="0">
+    <w:nsid w:val="7E6C3D42"/>
+    <w:multiLevelType w:val="multilevel"/>
+    <w:tmpl w:val="C0482644"/>
+    <w:lvl w:ilvl="0">
+      <w:start w:val="1"/>
+      <w:numFmt w:val="decimal"/>
+      <w:lvlText w:val="%1."/>
+      <w:lvlJc w:val="left"/>
+      <w:pPr>
+        <w:tabs>
+          <w:tab w:val="num" w:pos="720"/>
+        </w:tabs>
+        <w:ind w:left="720" w:hanging="360"/>
+      </w:pPr>
+    </w:lvl>
+    <w:lvl w:ilvl="1">
+      <w:start w:val="1"/>
+      <w:numFmt w:val="bullet"/>
+      <w:lvlText w:val="o"/>
+      <w:lvlJc w:val="left"/>
+      <w:pPr>
+        <w:tabs>
+          <w:tab w:val="num" w:pos="1440"/>
+        </w:tabs>
+        <w:ind w:left="1440" w:hanging="360"/>
+      </w:pPr>
+      <w:rPr>
+        <w:rFonts w:ascii="Courier New" w:hAnsi="Courier New" w:hint="default"/>
+        <w:sz w:val="20"/>
+      </w:rPr>
+    </w:lvl>
+    <w:lvl w:ilvl="2" w:tentative="1">
+      <w:start w:val="1"/>
+      <w:numFmt w:val="decimal"/>
+      <w:lvlText w:val="%3."/>
+      <w:lvlJc w:val="left"/>
+      <w:pPr>
+        <w:tabs>
+          <w:tab w:val="num" w:pos="2160"/>
+        </w:tabs>
+        <w:ind w:left="2160" w:hanging="360"/>
+      </w:pPr>
+    </w:lvl>
+    <w:lvl w:ilvl="3" w:tentative="1">
+      <w:start w:val="1"/>
+      <w:numFmt w:val="decimal"/>
+      <w:lvlText w:val="%4."/>
+      <w:lvlJc w:val="left"/>
+      <w:pPr>
+        <w:tabs>
+          <w:tab w:val="num" w:pos="2880"/>
+        </w:tabs>
+        <w:ind w:left="2880" w:hanging="360"/>
+      </w:pPr>
+    </w:lvl>
+    <w:lvl w:ilvl="4" w:tentative="1">
+      <w:start w:val="1"/>
+      <w:numFmt w:val="decimal"/>
+      <w:lvlText w:val="%5."/>
+      <w:lvlJc w:val="left"/>
+      <w:pPr>
+        <w:tabs>
+          <w:tab w:val="num" w:pos="3600"/>
+        </w:tabs>
+        <w:ind w:left="3600" w:hanging="360"/>
+      </w:pPr>
+    </w:lvl>
+    <w:lvl w:ilvl="5" w:tentative="1">
+      <w:start w:val="1"/>
+      <w:numFmt w:val="decimal"/>
+      <w:lvlText w:val="%6."/>
+      <w:lvlJc w:val="left"/>
+      <w:pPr>
+        <w:tabs>
+          <w:tab w:val="num" w:pos="4320"/>
+        </w:tabs>
+        <w:ind w:left="4320" w:hanging="360"/>
+      </w:pPr>
+    </w:lvl>
+    <w:lvl w:ilvl="6" w:tentative="1">
+      <w:start w:val="1"/>
+      <w:numFmt w:val="decimal"/>
+      <w:lvlText w:val="%7."/>
+      <w:lvlJc w:val="left"/>
+      <w:pPr>
+        <w:tabs>
+          <w:tab w:val="num" w:pos="5040"/>
+        </w:tabs>
+        <w:ind w:left="5040" w:hanging="360"/>
+      </w:pPr>
+    </w:lvl>
+    <w:lvl w:ilvl="7" w:tentative="1">
+      <w:start w:val="1"/>
+      <w:numFmt w:val="decimal"/>
+      <w:lvlText w:val="%8."/>
+      <w:lvlJc w:val="left"/>
+      <w:pPr>
+        <w:tabs>
+          <w:tab w:val="num" w:pos="5760"/>
+        </w:tabs>
+        <w:ind w:left="5760" w:hanging="360"/>
+      </w:pPr>
+    </w:lvl>
+    <w:lvl w:ilvl="8" w:tentative="1">
+      <w:start w:val="1"/>
+      <w:numFmt w:val="decimal"/>
+      <w:lvlText w:val="%9."/>
+      <w:lvlJc w:val="left"/>
+      <w:pPr>
+        <w:tabs>
+          <w:tab w:val="num" w:pos="6480"/>
+        </w:tabs>
+        <w:ind w:left="6480" w:hanging="360"/>
+      </w:pPr>
+    </w:lvl>
+  </w:abstractNum>
+  <w:abstractNum w:abstractNumId="13" w15:restartNumberingAfterBreak="0">
+    <w:nsid w:val="7FE84050"/>
+    <w:multiLevelType w:val="multilevel"/>
+    <w:tmpl w:val="DA92A2B6"/>
+    <w:lvl w:ilvl="0">
+      <w:start w:val="1"/>
+      <w:numFmt w:val="decimal"/>
+      <w:lvlText w:val="%1."/>
+      <w:lvlJc w:val="left"/>
+      <w:pPr>
+        <w:tabs>
+          <w:tab w:val="num" w:pos="720"/>
+        </w:tabs>
+        <w:ind w:left="720" w:hanging="360"/>
+      </w:pPr>
+    </w:lvl>
+    <w:lvl w:ilvl="1">
+      <w:start w:val="1"/>
+      <w:numFmt w:val="bullet"/>
+      <w:lvlText w:val="o"/>
+      <w:lvlJc w:val="left"/>
+      <w:pPr>
+        <w:tabs>
+          <w:tab w:val="num" w:pos="1440"/>
+        </w:tabs>
+        <w:ind w:left="1440" w:hanging="360"/>
+      </w:pPr>
+      <w:rPr>
+        <w:rFonts w:ascii="Courier New" w:hAnsi="Courier New" w:hint="default"/>
+        <w:sz w:val="20"/>
+      </w:rPr>
+    </w:lvl>
+    <w:lvl w:ilvl="2" w:tentative="1">
+      <w:start w:val="1"/>
+      <w:numFmt w:val="decimal"/>
+      <w:lvlText w:val="%3."/>
+      <w:lvlJc w:val="left"/>
+      <w:pPr>
+        <w:tabs>
+          <w:tab w:val="num" w:pos="2160"/>
+        </w:tabs>
+        <w:ind w:left="2160" w:hanging="360"/>
+      </w:pPr>
+    </w:lvl>
+    <w:lvl w:ilvl="3" w:tentative="1">
+      <w:start w:val="1"/>
+      <w:numFmt w:val="decimal"/>
+      <w:lvlText w:val="%4."/>
+      <w:lvlJc w:val="left"/>
+      <w:pPr>
+        <w:tabs>
+          <w:tab w:val="num" w:pos="2880"/>
+        </w:tabs>
+        <w:ind w:left="2880" w:hanging="360"/>
+      </w:pPr>
+    </w:lvl>
+    <w:lvl w:ilvl="4" w:tentative="1">
+      <w:start w:val="1"/>
+      <w:numFmt w:val="decimal"/>
+      <w:lvlText w:val="%5."/>
+      <w:lvlJc w:val="left"/>
+      <w:pPr>
+        <w:tabs>
+          <w:tab w:val="num" w:pos="3600"/>
+        </w:tabs>
+        <w:ind w:left="3600" w:hanging="360"/>
+      </w:pPr>
+    </w:lvl>
+    <w:lvl w:ilvl="5" w:tentative="1">
+      <w:start w:val="1"/>
+      <w:numFmt w:val="decimal"/>
+      <w:lvlText w:val="%6."/>
+      <w:lvlJc w:val="left"/>
+      <w:pPr>
+        <w:tabs>
+          <w:tab w:val="num" w:pos="4320"/>
+        </w:tabs>
+        <w:ind w:left="4320" w:hanging="360"/>
+      </w:pPr>
+    </w:lvl>
+    <w:lvl w:ilvl="6" w:tentative="1">
+      <w:start w:val="1"/>
+      <w:numFmt w:val="decimal"/>
+      <w:lvlText w:val="%7."/>
+      <w:lvlJc w:val="left"/>
+      <w:pPr>
+        <w:tabs>
+          <w:tab w:val="num" w:pos="5040"/>
+        </w:tabs>
+        <w:ind w:left="5040" w:hanging="360"/>
+      </w:pPr>
+    </w:lvl>
+    <w:lvl w:ilvl="7" w:tentative="1">
+      <w:start w:val="1"/>
+      <w:numFmt w:val="decimal"/>
+      <w:lvlText w:val="%8."/>
+      <w:lvlJc w:val="left"/>
+      <w:pPr>
+        <w:tabs>
+          <w:tab w:val="num" w:pos="5760"/>
+        </w:tabs>
+        <w:ind w:left="5760" w:hanging="360"/>
+      </w:pPr>
+    </w:lvl>
+    <w:lvl w:ilvl="8" w:tentative="1">
+      <w:start w:val="1"/>
+      <w:numFmt w:val="decimal"/>
+      <w:lvlText w:val="%9."/>
+      <w:lvlJc w:val="left"/>
+      <w:pPr>
+        <w:tabs>
+          <w:tab w:val="num" w:pos="6480"/>
+        </w:tabs>
+        <w:ind w:left="6480" w:hanging="360"/>
+      </w:pPr>
+    </w:lvl>
+  </w:abstractNum>
   <w:num w:numId="1">
-    <w:abstractNumId w:val="4"/>
+    <w:abstractNumId w:val="10"/>
   </w:num>
   <w:num w:numId="2">
     <w:abstractNumId w:val="0"/>
   </w:num>
   <w:num w:numId="3">
-    <w:abstractNumId w:val="2"/>
+    <w:abstractNumId w:val="5"/>
   </w:num>
   <w:num w:numId="4">
     <w:abstractNumId w:val="1"/>
   </w:num>
   <w:num w:numId="5">
+    <w:abstractNumId w:val="6"/>
+  </w:num>
+  <w:num w:numId="6">
+    <w:abstractNumId w:val="13"/>
+  </w:num>
+  <w:num w:numId="7">
+    <w:abstractNumId w:val="8"/>
+  </w:num>
+  <w:num w:numId="8">
+    <w:abstractNumId w:val="12"/>
+  </w:num>
+  <w:num w:numId="9">
     <w:abstractNumId w:val="3"/>
+  </w:num>
+  <w:num w:numId="10">
+    <w:abstractNumId w:val="9"/>
+  </w:num>
+  <w:num w:numId="11">
+    <w:abstractNumId w:val="2"/>
+  </w:num>
+  <w:num w:numId="12">
+    <w:abstractNumId w:val="7"/>
+  </w:num>
+  <w:num w:numId="13">
+    <w:abstractNumId w:val="4"/>
+  </w:num>
+  <w:num w:numId="14">
+    <w:abstractNumId w:val="11"/>
   </w:num>
 </w:numbering>
 </file>
@@ -2051,6 +4664,52 @@
       <w:szCs w:val="36"/>
     </w:rPr>
   </w:style>
+  <w:style w:type="paragraph" w:styleId="Heading3">
+    <w:name w:val="heading 3"/>
+    <w:basedOn w:val="Normal"/>
+    <w:next w:val="Normal"/>
+    <w:link w:val="Heading3Char"/>
+    <w:uiPriority w:val="9"/>
+    <w:semiHidden/>
+    <w:unhideWhenUsed/>
+    <w:qFormat/>
+    <w:rsid w:val="005F690F"/>
+    <w:pPr>
+      <w:keepNext/>
+      <w:keepLines/>
+      <w:spacing w:before="40" w:after="0"/>
+      <w:outlineLvl w:val="2"/>
+    </w:pPr>
+    <w:rPr>
+      <w:rFonts w:asciiTheme="majorHAnsi" w:eastAsiaTheme="majorEastAsia" w:hAnsiTheme="majorHAnsi" w:cstheme="majorBidi"/>
+      <w:color w:val="1F4D78" w:themeColor="accent1" w:themeShade="7F"/>
+      <w:sz w:val="24"/>
+      <w:szCs w:val="24"/>
+    </w:rPr>
+  </w:style>
+  <w:style w:type="paragraph" w:styleId="Heading4">
+    <w:name w:val="heading 4"/>
+    <w:basedOn w:val="Normal"/>
+    <w:next w:val="Normal"/>
+    <w:link w:val="Heading4Char"/>
+    <w:uiPriority w:val="9"/>
+    <w:semiHidden/>
+    <w:unhideWhenUsed/>
+    <w:qFormat/>
+    <w:rsid w:val="005F690F"/>
+    <w:pPr>
+      <w:keepNext/>
+      <w:keepLines/>
+      <w:spacing w:before="40" w:after="0"/>
+      <w:outlineLvl w:val="3"/>
+    </w:pPr>
+    <w:rPr>
+      <w:rFonts w:asciiTheme="majorHAnsi" w:eastAsiaTheme="majorEastAsia" w:hAnsiTheme="majorHAnsi" w:cstheme="majorBidi"/>
+      <w:i/>
+      <w:iCs/>
+      <w:color w:val="2E74B5" w:themeColor="accent1" w:themeShade="BF"/>
+    </w:rPr>
+  </w:style>
   <w:style w:type="character" w:default="1" w:styleId="DefaultParagraphFont">
     <w:name w:val="Default Paragraph Font"/>
     <w:uiPriority w:val="1"/>
@@ -2121,6 +4780,47 @@
       <w:rFonts w:ascii="Times New Roman" w:eastAsia="Times New Roman" w:hAnsi="Times New Roman" w:cs="Times New Roman"/>
       <w:sz w:val="24"/>
       <w:szCs w:val="24"/>
+    </w:rPr>
+  </w:style>
+  <w:style w:type="character" w:customStyle="1" w:styleId="Heading3Char">
+    <w:name w:val="Heading 3 Char"/>
+    <w:basedOn w:val="DefaultParagraphFont"/>
+    <w:link w:val="Heading3"/>
+    <w:uiPriority w:val="9"/>
+    <w:semiHidden/>
+    <w:rsid w:val="005F690F"/>
+    <w:rPr>
+      <w:rFonts w:asciiTheme="majorHAnsi" w:eastAsiaTheme="majorEastAsia" w:hAnsiTheme="majorHAnsi" w:cstheme="majorBidi"/>
+      <w:color w:val="1F4D78" w:themeColor="accent1" w:themeShade="7F"/>
+      <w:sz w:val="24"/>
+      <w:szCs w:val="24"/>
+    </w:rPr>
+  </w:style>
+  <w:style w:type="character" w:styleId="HTMLCode">
+    <w:name w:val="HTML Code"/>
+    <w:basedOn w:val="DefaultParagraphFont"/>
+    <w:uiPriority w:val="99"/>
+    <w:semiHidden/>
+    <w:unhideWhenUsed/>
+    <w:rsid w:val="005F690F"/>
+    <w:rPr>
+      <w:rFonts w:ascii="Courier New" w:eastAsia="Times New Roman" w:hAnsi="Courier New" w:cs="Courier New"/>
+      <w:sz w:val="20"/>
+      <w:szCs w:val="20"/>
+    </w:rPr>
+  </w:style>
+  <w:style w:type="character" w:customStyle="1" w:styleId="Heading4Char">
+    <w:name w:val="Heading 4 Char"/>
+    <w:basedOn w:val="DefaultParagraphFont"/>
+    <w:link w:val="Heading4"/>
+    <w:uiPriority w:val="9"/>
+    <w:semiHidden/>
+    <w:rsid w:val="005F690F"/>
+    <w:rPr>
+      <w:rFonts w:asciiTheme="majorHAnsi" w:eastAsiaTheme="majorEastAsia" w:hAnsiTheme="majorHAnsi" w:cstheme="majorBidi"/>
+      <w:i/>
+      <w:iCs/>
+      <w:color w:val="2E74B5" w:themeColor="accent1" w:themeShade="BF"/>
     </w:rPr>
   </w:style>
 </w:styles>

</xml_diff>

<commit_message>
feat: Enhance PDF processing and categorization logic; improve security and logging in controllers
Co-authored-by: Copilot <copilot@github.com>
</commit_message>
<xml_diff>
--- a/STEP.docx
+++ b/STEP.docx
@@ -2684,12 +2684,7 @@
       </w:pPr>
       <w:r>
         <w:lastRenderedPageBreak/>
-        <w:t>If you'd like to fix this, we can upgrade</w:t>
-      </w:r>
-      <w:bookmarkStart w:id="0" w:name="_GoBack"/>
-      <w:bookmarkEnd w:id="0"/>
-      <w:r>
-        <w:t xml:space="preserve"> your Python </w:t>
+        <w:t xml:space="preserve">If you'd like to fix this, we can upgrade your Python </w:t>
       </w:r>
       <w:r>
         <w:rPr>
@@ -2741,6 +2736,2625 @@
           <w:szCs w:val="24"/>
         </w:rPr>
       </w:pPr>
+    </w:p>
+    <w:p/>
+    <w:p/>
+    <w:p/>
+    <w:p/>
+    <w:p/>
+    <w:p/>
+    <w:p/>
+    <w:p/>
+    <w:p/>
+    <w:p/>
+    <w:p/>
+    <w:p/>
+    <w:p/>
+    <w:p/>
+    <w:p/>
+    <w:p/>
+    <w:p/>
+    <w:p/>
+    <w:p/>
+    <w:p/>
+    <w:p/>
+    <w:p/>
+    <w:p/>
+    <w:p/>
+    <w:p>
+      <w:pPr>
+        <w:pStyle w:val="NormalWeb"/>
+      </w:pPr>
+      <w:r>
+        <w:lastRenderedPageBreak/>
+        <w:t>This is a fantastic codebase. You have successfully merged a Node.js/Express backend with a Python/</w:t>
+      </w:r>
+      <w:proofErr w:type="spellStart"/>
+      <w:r>
+        <w:t>FastAPI</w:t>
+      </w:r>
+      <w:proofErr w:type="spellEnd"/>
+      <w:r>
+        <w:t xml:space="preserve"> </w:t>
+      </w:r>
+      <w:proofErr w:type="spellStart"/>
+      <w:r>
+        <w:t>microservice</w:t>
+      </w:r>
+      <w:proofErr w:type="spellEnd"/>
+      <w:r>
+        <w:t>, integrated LLM routing, and built a custom RAG (Retrieval-Augmented Generation) pipeline.</w:t>
+      </w:r>
+    </w:p>
+    <w:p>
+      <w:pPr>
+        <w:pStyle w:val="NormalWeb"/>
+      </w:pPr>
+      <w:r>
+        <w:t>I have reviewed all the code files you uploaded. While the application is structurally sound and works perfectly for a "Happy Path" (where the user does exactly what they are supposed to do), there are several areas we need to bulletproof before this can handle real-world users.</w:t>
+      </w:r>
+    </w:p>
+    <w:p>
+      <w:pPr>
+        <w:pStyle w:val="NormalWeb"/>
+      </w:pPr>
+      <w:r>
+        <w:t xml:space="preserve">Here is my Senior Architectural Code Review, broken down into 4 critical areas: </w:t>
+      </w:r>
+      <w:r>
+        <w:rPr>
+          <w:b/>
+          <w:bCs/>
+        </w:rPr>
+        <w:t>Database &amp; Performance, System Security, Bug Prevention, and Architecture.</w:t>
+      </w:r>
+    </w:p>
+    <w:p>
+      <w:r>
+        <w:pict>
+          <v:rect id="_x0000_i1035" style="width:0;height:1.5pt" o:hralign="center" o:hrstd="t" o:hr="t" fillcolor="#a0a0a0" stroked="f"/>
+        </w:pict>
+      </w:r>
+    </w:p>
+    <w:p>
+      <w:pPr>
+        <w:pStyle w:val="Heading3"/>
+      </w:pPr>
+      <w:r>
+        <w:rPr>
+          <w:rFonts w:ascii="Segoe UI Symbol" w:hAnsi="Segoe UI Symbol" w:cs="Segoe UI Symbol"/>
+        </w:rPr>
+        <w:t>🗄</w:t>
+      </w:r>
+      <w:r>
+        <w:t>️ 1. Database &amp; Performance (MongoDB)</w:t>
+      </w:r>
+    </w:p>
+    <w:p>
+      <w:pPr>
+        <w:pStyle w:val="NormalWeb"/>
+      </w:pPr>
+      <w:r>
+        <w:rPr>
+          <w:b/>
+          <w:bCs/>
+        </w:rPr>
+        <w:t xml:space="preserve">The Issue: Missing Indexes in </w:t>
+      </w:r>
+      <w:r>
+        <w:rPr>
+          <w:rStyle w:val="HTMLCode"/>
+          <w:b/>
+          <w:bCs/>
+        </w:rPr>
+        <w:t>Transaction.js</w:t>
+      </w:r>
+      <w:r>
+        <w:t xml:space="preserve"> Right now, your Node.js </w:t>
+      </w:r>
+      <w:r>
+        <w:rPr>
+          <w:rStyle w:val="HTMLCode"/>
+        </w:rPr>
+        <w:t>analysisControllers.js</w:t>
+      </w:r>
+      <w:r>
+        <w:t xml:space="preserve"> is doing </w:t>
+      </w:r>
+      <w:r>
+        <w:rPr>
+          <w:rStyle w:val="HTMLCode"/>
+        </w:rPr>
+        <w:t xml:space="preserve">$match: </w:t>
+      </w:r>
+      <w:proofErr w:type="gramStart"/>
+      <w:r>
+        <w:rPr>
+          <w:rStyle w:val="HTMLCode"/>
+        </w:rPr>
+        <w:t xml:space="preserve">{ </w:t>
+      </w:r>
+      <w:proofErr w:type="spellStart"/>
+      <w:r>
+        <w:rPr>
+          <w:rStyle w:val="HTMLCode"/>
+        </w:rPr>
+        <w:t>userId</w:t>
+      </w:r>
+      <w:proofErr w:type="spellEnd"/>
+      <w:proofErr w:type="gramEnd"/>
+      <w:r>
+        <w:rPr>
+          <w:rStyle w:val="HTMLCode"/>
+        </w:rPr>
+        <w:t xml:space="preserve">: </w:t>
+      </w:r>
+      <w:proofErr w:type="spellStart"/>
+      <w:r>
+        <w:rPr>
+          <w:rStyle w:val="HTMLCode"/>
+        </w:rPr>
+        <w:t>req.userId</w:t>
+      </w:r>
+      <w:proofErr w:type="spellEnd"/>
+      <w:r>
+        <w:rPr>
+          <w:rStyle w:val="HTMLCode"/>
+        </w:rPr>
+        <w:t>, month: { $in: [current, previous] } }</w:t>
+      </w:r>
+      <w:r>
+        <w:t>. Because your MongoDB schema has no indexes, MongoDB has to scan every single document in the database one by one. If 1,000 users upload statements, your charts will take seconds (or minutes) to load.</w:t>
+      </w:r>
+    </w:p>
+    <w:p>
+      <w:pPr>
+        <w:pStyle w:val="NormalWeb"/>
+      </w:pPr>
+      <w:r>
+        <w:rPr>
+          <w:b/>
+          <w:bCs/>
+        </w:rPr>
+        <w:t>The Fix:</w:t>
+      </w:r>
+      <w:r>
+        <w:t xml:space="preserve"> Open </w:t>
+      </w:r>
+      <w:r>
+        <w:rPr>
+          <w:rStyle w:val="HTMLCode"/>
+        </w:rPr>
+        <w:t>backend/models/Transaction.js</w:t>
+      </w:r>
+      <w:r>
+        <w:t xml:space="preserve"> and add a compound index so MongoDB pre-sorts the data.</w:t>
+      </w:r>
+    </w:p>
+    <w:p>
+      <w:r>
+        <w:rPr>
+          <w:rStyle w:val="ng-tns-c2371930484-252"/>
+        </w:rPr>
+        <w:t>JavaScript</w:t>
+      </w:r>
+    </w:p>
+    <w:p>
+      <w:pPr>
+        <w:pStyle w:val="HTMLPreformatted"/>
+        <w:rPr>
+          <w:rStyle w:val="HTMLCode"/>
+        </w:rPr>
+      </w:pPr>
+      <w:proofErr w:type="spellStart"/>
+      <w:proofErr w:type="gramStart"/>
+      <w:r>
+        <w:rPr>
+          <w:rStyle w:val="hljs-keyword"/>
+        </w:rPr>
+        <w:t>const</w:t>
+      </w:r>
+      <w:proofErr w:type="spellEnd"/>
+      <w:proofErr w:type="gramEnd"/>
+      <w:r>
+        <w:rPr>
+          <w:rStyle w:val="HTMLCode"/>
+        </w:rPr>
+        <w:t xml:space="preserve"> </w:t>
+      </w:r>
+      <w:proofErr w:type="spellStart"/>
+      <w:r>
+        <w:rPr>
+          <w:rStyle w:val="HTMLCode"/>
+        </w:rPr>
+        <w:t>transactionSchema</w:t>
+      </w:r>
+      <w:proofErr w:type="spellEnd"/>
+      <w:r>
+        <w:rPr>
+          <w:rStyle w:val="HTMLCode"/>
+        </w:rPr>
+        <w:t xml:space="preserve"> = </w:t>
+      </w:r>
+      <w:r>
+        <w:rPr>
+          <w:rStyle w:val="hljs-keyword"/>
+        </w:rPr>
+        <w:t>new</w:t>
+      </w:r>
+      <w:r>
+        <w:rPr>
+          <w:rStyle w:val="HTMLCode"/>
+        </w:rPr>
+        <w:t xml:space="preserve"> </w:t>
+      </w:r>
+      <w:proofErr w:type="spellStart"/>
+      <w:r>
+        <w:rPr>
+          <w:rStyle w:val="HTMLCode"/>
+        </w:rPr>
+        <w:t>mongoose.Schema</w:t>
+      </w:r>
+      <w:proofErr w:type="spellEnd"/>
+      <w:r>
+        <w:rPr>
+          <w:rStyle w:val="HTMLCode"/>
+        </w:rPr>
+        <w:t>({</w:t>
+      </w:r>
+    </w:p>
+    <w:p>
+      <w:pPr>
+        <w:pStyle w:val="HTMLPreformatted"/>
+        <w:rPr>
+          <w:rStyle w:val="HTMLCode"/>
+        </w:rPr>
+      </w:pPr>
+      <w:r>
+        <w:rPr>
+          <w:rStyle w:val="HTMLCode"/>
+        </w:rPr>
+        <w:t xml:space="preserve">  </w:t>
+      </w:r>
+      <w:proofErr w:type="spellStart"/>
+      <w:proofErr w:type="gramStart"/>
+      <w:r>
+        <w:rPr>
+          <w:rStyle w:val="hljs-attr"/>
+        </w:rPr>
+        <w:t>userId</w:t>
+      </w:r>
+      <w:proofErr w:type="spellEnd"/>
+      <w:proofErr w:type="gramEnd"/>
+      <w:r>
+        <w:rPr>
+          <w:rStyle w:val="HTMLCode"/>
+        </w:rPr>
+        <w:t xml:space="preserve">: { </w:t>
+      </w:r>
+      <w:r>
+        <w:rPr>
+          <w:rStyle w:val="hljs-attr"/>
+        </w:rPr>
+        <w:t>type</w:t>
+      </w:r>
+      <w:r>
+        <w:rPr>
+          <w:rStyle w:val="HTMLCode"/>
+        </w:rPr>
+        <w:t xml:space="preserve">: </w:t>
+      </w:r>
+      <w:r>
+        <w:rPr>
+          <w:rStyle w:val="hljs-builtin"/>
+        </w:rPr>
+        <w:t>String</w:t>
+      </w:r>
+      <w:r>
+        <w:rPr>
+          <w:rStyle w:val="HTMLCode"/>
+        </w:rPr>
+        <w:t xml:space="preserve">, </w:t>
+      </w:r>
+      <w:r>
+        <w:rPr>
+          <w:rStyle w:val="hljs-attr"/>
+        </w:rPr>
+        <w:t>required</w:t>
+      </w:r>
+      <w:r>
+        <w:rPr>
+          <w:rStyle w:val="HTMLCode"/>
+        </w:rPr>
+        <w:t xml:space="preserve">: </w:t>
+      </w:r>
+      <w:r>
+        <w:rPr>
+          <w:rStyle w:val="hljs-literal"/>
+        </w:rPr>
+        <w:t>true</w:t>
+      </w:r>
+      <w:r>
+        <w:rPr>
+          <w:rStyle w:val="HTMLCode"/>
+        </w:rPr>
+        <w:t xml:space="preserve">, </w:t>
+      </w:r>
+      <w:r>
+        <w:rPr>
+          <w:rStyle w:val="hljs-attr"/>
+        </w:rPr>
+        <w:t>index</w:t>
+      </w:r>
+      <w:r>
+        <w:rPr>
+          <w:rStyle w:val="HTMLCode"/>
+        </w:rPr>
+        <w:t xml:space="preserve">: </w:t>
+      </w:r>
+      <w:r>
+        <w:rPr>
+          <w:rStyle w:val="hljs-literal"/>
+        </w:rPr>
+        <w:t>true</w:t>
+      </w:r>
+      <w:r>
+        <w:rPr>
+          <w:rStyle w:val="HTMLCode"/>
+        </w:rPr>
+        <w:t xml:space="preserve"> }, </w:t>
+      </w:r>
+      <w:r>
+        <w:rPr>
+          <w:rStyle w:val="hljs-comment"/>
+        </w:rPr>
+        <w:t xml:space="preserve">// </w:t>
+      </w:r>
+      <w:r>
+        <w:rPr>
+          <w:rStyle w:val="hljs-comment"/>
+          <w:rFonts w:ascii="Segoe UI Symbol" w:hAnsi="Segoe UI Symbol" w:cs="Segoe UI Symbol"/>
+        </w:rPr>
+        <w:t>👈</w:t>
+      </w:r>
+      <w:r>
+        <w:rPr>
+          <w:rStyle w:val="hljs-comment"/>
+        </w:rPr>
+        <w:t xml:space="preserve"> Make it required and indexed</w:t>
+      </w:r>
+    </w:p>
+    <w:p>
+      <w:pPr>
+        <w:pStyle w:val="HTMLPreformatted"/>
+        <w:rPr>
+          <w:rStyle w:val="HTMLCode"/>
+        </w:rPr>
+      </w:pPr>
+      <w:r>
+        <w:rPr>
+          <w:rStyle w:val="HTMLCode"/>
+        </w:rPr>
+        <w:t xml:space="preserve">  </w:t>
+      </w:r>
+      <w:proofErr w:type="gramStart"/>
+      <w:r>
+        <w:rPr>
+          <w:rStyle w:val="hljs-attr"/>
+        </w:rPr>
+        <w:t>date</w:t>
+      </w:r>
+      <w:proofErr w:type="gramEnd"/>
+      <w:r>
+        <w:rPr>
+          <w:rStyle w:val="HTMLCode"/>
+        </w:rPr>
+        <w:t xml:space="preserve">: </w:t>
+      </w:r>
+      <w:r>
+        <w:rPr>
+          <w:rStyle w:val="hljs-builtin"/>
+        </w:rPr>
+        <w:t>String</w:t>
+      </w:r>
+      <w:r>
+        <w:rPr>
+          <w:rStyle w:val="HTMLCode"/>
+        </w:rPr>
+        <w:t>,</w:t>
+      </w:r>
+    </w:p>
+    <w:p>
+      <w:pPr>
+        <w:pStyle w:val="HTMLPreformatted"/>
+        <w:rPr>
+          <w:rStyle w:val="HTMLCode"/>
+        </w:rPr>
+      </w:pPr>
+      <w:r>
+        <w:rPr>
+          <w:rStyle w:val="HTMLCode"/>
+        </w:rPr>
+        <w:t xml:space="preserve">  </w:t>
+      </w:r>
+      <w:proofErr w:type="gramStart"/>
+      <w:r>
+        <w:rPr>
+          <w:rStyle w:val="hljs-attr"/>
+        </w:rPr>
+        <w:t>description</w:t>
+      </w:r>
+      <w:proofErr w:type="gramEnd"/>
+      <w:r>
+        <w:rPr>
+          <w:rStyle w:val="HTMLCode"/>
+        </w:rPr>
+        <w:t xml:space="preserve">: </w:t>
+      </w:r>
+      <w:r>
+        <w:rPr>
+          <w:rStyle w:val="hljs-builtin"/>
+        </w:rPr>
+        <w:t>String</w:t>
+      </w:r>
+      <w:r>
+        <w:rPr>
+          <w:rStyle w:val="HTMLCode"/>
+        </w:rPr>
+        <w:t>,</w:t>
+      </w:r>
+    </w:p>
+    <w:p>
+      <w:pPr>
+        <w:pStyle w:val="HTMLPreformatted"/>
+        <w:rPr>
+          <w:rStyle w:val="HTMLCode"/>
+        </w:rPr>
+      </w:pPr>
+      <w:r>
+        <w:rPr>
+          <w:rStyle w:val="HTMLCode"/>
+        </w:rPr>
+        <w:t xml:space="preserve">  </w:t>
+      </w:r>
+      <w:proofErr w:type="gramStart"/>
+      <w:r>
+        <w:rPr>
+          <w:rStyle w:val="hljs-attr"/>
+        </w:rPr>
+        <w:t>amount</w:t>
+      </w:r>
+      <w:proofErr w:type="gramEnd"/>
+      <w:r>
+        <w:rPr>
+          <w:rStyle w:val="HTMLCode"/>
+        </w:rPr>
+        <w:t xml:space="preserve">: </w:t>
+      </w:r>
+      <w:r>
+        <w:rPr>
+          <w:rStyle w:val="hljs-builtin"/>
+        </w:rPr>
+        <w:t>Number</w:t>
+      </w:r>
+      <w:r>
+        <w:rPr>
+          <w:rStyle w:val="HTMLCode"/>
+        </w:rPr>
+        <w:t xml:space="preserve">, </w:t>
+      </w:r>
+    </w:p>
+    <w:p>
+      <w:pPr>
+        <w:pStyle w:val="HTMLPreformatted"/>
+        <w:rPr>
+          <w:rStyle w:val="HTMLCode"/>
+        </w:rPr>
+      </w:pPr>
+      <w:r>
+        <w:rPr>
+          <w:rStyle w:val="HTMLCode"/>
+        </w:rPr>
+        <w:t xml:space="preserve">  </w:t>
+      </w:r>
+      <w:proofErr w:type="gramStart"/>
+      <w:r>
+        <w:rPr>
+          <w:rStyle w:val="hljs-attr"/>
+        </w:rPr>
+        <w:t>balance</w:t>
+      </w:r>
+      <w:proofErr w:type="gramEnd"/>
+      <w:r>
+        <w:rPr>
+          <w:rStyle w:val="HTMLCode"/>
+        </w:rPr>
+        <w:t xml:space="preserve">: </w:t>
+      </w:r>
+      <w:r>
+        <w:rPr>
+          <w:rStyle w:val="hljs-builtin"/>
+        </w:rPr>
+        <w:t>Number</w:t>
+      </w:r>
+      <w:r>
+        <w:rPr>
+          <w:rStyle w:val="HTMLCode"/>
+        </w:rPr>
+        <w:t>,</w:t>
+      </w:r>
+    </w:p>
+    <w:p>
+      <w:pPr>
+        <w:pStyle w:val="HTMLPreformatted"/>
+        <w:rPr>
+          <w:rStyle w:val="HTMLCode"/>
+        </w:rPr>
+      </w:pPr>
+      <w:r>
+        <w:rPr>
+          <w:rStyle w:val="HTMLCode"/>
+        </w:rPr>
+        <w:t xml:space="preserve">  </w:t>
+      </w:r>
+      <w:proofErr w:type="gramStart"/>
+      <w:r>
+        <w:rPr>
+          <w:rStyle w:val="hljs-attr"/>
+        </w:rPr>
+        <w:t>category</w:t>
+      </w:r>
+      <w:proofErr w:type="gramEnd"/>
+      <w:r>
+        <w:rPr>
+          <w:rStyle w:val="HTMLCode"/>
+        </w:rPr>
+        <w:t xml:space="preserve">: </w:t>
+      </w:r>
+      <w:r>
+        <w:rPr>
+          <w:rStyle w:val="hljs-builtin"/>
+        </w:rPr>
+        <w:t>String</w:t>
+      </w:r>
+      <w:r>
+        <w:rPr>
+          <w:rStyle w:val="HTMLCode"/>
+        </w:rPr>
+        <w:t>,</w:t>
+      </w:r>
+    </w:p>
+    <w:p>
+      <w:pPr>
+        <w:pStyle w:val="HTMLPreformatted"/>
+        <w:rPr>
+          <w:rStyle w:val="HTMLCode"/>
+        </w:rPr>
+      </w:pPr>
+      <w:r>
+        <w:rPr>
+          <w:rStyle w:val="HTMLCode"/>
+        </w:rPr>
+        <w:t xml:space="preserve">  </w:t>
+      </w:r>
+      <w:proofErr w:type="gramStart"/>
+      <w:r>
+        <w:rPr>
+          <w:rStyle w:val="hljs-attr"/>
+        </w:rPr>
+        <w:t>month</w:t>
+      </w:r>
+      <w:proofErr w:type="gramEnd"/>
+      <w:r>
+        <w:rPr>
+          <w:rStyle w:val="HTMLCode"/>
+        </w:rPr>
+        <w:t xml:space="preserve">: </w:t>
+      </w:r>
+      <w:r>
+        <w:rPr>
+          <w:rStyle w:val="hljs-builtin"/>
+        </w:rPr>
+        <w:t>String</w:t>
+      </w:r>
+      <w:r>
+        <w:rPr>
+          <w:rStyle w:val="HTMLCode"/>
+        </w:rPr>
+        <w:t>,</w:t>
+      </w:r>
+    </w:p>
+    <w:p>
+      <w:pPr>
+        <w:pStyle w:val="HTMLPreformatted"/>
+        <w:rPr>
+          <w:rStyle w:val="HTMLCode"/>
+        </w:rPr>
+      </w:pPr>
+      <w:r>
+        <w:rPr>
+          <w:rStyle w:val="HTMLCode"/>
+        </w:rPr>
+        <w:t xml:space="preserve">  </w:t>
+      </w:r>
+      <w:proofErr w:type="spellStart"/>
+      <w:proofErr w:type="gramStart"/>
+      <w:r>
+        <w:rPr>
+          <w:rStyle w:val="hljs-attr"/>
+        </w:rPr>
+        <w:t>createdAt</w:t>
+      </w:r>
+      <w:proofErr w:type="spellEnd"/>
+      <w:proofErr w:type="gramEnd"/>
+      <w:r>
+        <w:rPr>
+          <w:rStyle w:val="HTMLCode"/>
+        </w:rPr>
+        <w:t xml:space="preserve">: { </w:t>
+      </w:r>
+      <w:r>
+        <w:rPr>
+          <w:rStyle w:val="hljs-attr"/>
+        </w:rPr>
+        <w:t>type</w:t>
+      </w:r>
+      <w:r>
+        <w:rPr>
+          <w:rStyle w:val="HTMLCode"/>
+        </w:rPr>
+        <w:t xml:space="preserve">: </w:t>
+      </w:r>
+      <w:r>
+        <w:rPr>
+          <w:rStyle w:val="hljs-builtin"/>
+        </w:rPr>
+        <w:t>Date</w:t>
+      </w:r>
+      <w:r>
+        <w:rPr>
+          <w:rStyle w:val="HTMLCode"/>
+        </w:rPr>
+        <w:t xml:space="preserve">, </w:t>
+      </w:r>
+      <w:r>
+        <w:rPr>
+          <w:rStyle w:val="hljs-attr"/>
+        </w:rPr>
+        <w:t>default</w:t>
+      </w:r>
+      <w:r>
+        <w:rPr>
+          <w:rStyle w:val="HTMLCode"/>
+        </w:rPr>
+        <w:t xml:space="preserve">: </w:t>
+      </w:r>
+      <w:proofErr w:type="spellStart"/>
+      <w:r>
+        <w:rPr>
+          <w:rStyle w:val="hljs-builtin"/>
+        </w:rPr>
+        <w:t>Date</w:t>
+      </w:r>
+      <w:r>
+        <w:rPr>
+          <w:rStyle w:val="HTMLCode"/>
+        </w:rPr>
+        <w:t>.now</w:t>
+      </w:r>
+      <w:proofErr w:type="spellEnd"/>
+      <w:r>
+        <w:rPr>
+          <w:rStyle w:val="HTMLCode"/>
+        </w:rPr>
+        <w:t xml:space="preserve"> },</w:t>
+      </w:r>
+    </w:p>
+    <w:p>
+      <w:pPr>
+        <w:pStyle w:val="HTMLPreformatted"/>
+        <w:rPr>
+          <w:rStyle w:val="HTMLCode"/>
+        </w:rPr>
+      </w:pPr>
+      <w:r>
+        <w:rPr>
+          <w:rStyle w:val="HTMLCode"/>
+        </w:rPr>
+        <w:t>});</w:t>
+      </w:r>
+    </w:p>
+    <w:p>
+      <w:pPr>
+        <w:pStyle w:val="HTMLPreformatted"/>
+        <w:rPr>
+          <w:rStyle w:val="HTMLCode"/>
+        </w:rPr>
+      </w:pPr>
+    </w:p>
+    <w:p>
+      <w:pPr>
+        <w:pStyle w:val="HTMLPreformatted"/>
+        <w:rPr>
+          <w:rStyle w:val="HTMLCode"/>
+        </w:rPr>
+      </w:pPr>
+      <w:r>
+        <w:rPr>
+          <w:rStyle w:val="hljs-comment"/>
+        </w:rPr>
+        <w:t xml:space="preserve">// </w:t>
+      </w:r>
+      <w:r>
+        <w:rPr>
+          <w:rStyle w:val="hljs-comment"/>
+          <w:rFonts w:ascii="Segoe UI Symbol" w:hAnsi="Segoe UI Symbol" w:cs="Segoe UI Symbol"/>
+        </w:rPr>
+        <w:t>🚀</w:t>
+      </w:r>
+      <w:r>
+        <w:rPr>
+          <w:rStyle w:val="hljs-comment"/>
+        </w:rPr>
+        <w:t xml:space="preserve"> Add a Compound Index for blazing-fast dashboard queries</w:t>
+      </w:r>
+    </w:p>
+    <w:p>
+      <w:pPr>
+        <w:pStyle w:val="HTMLPreformatted"/>
+        <w:rPr>
+          <w:rStyle w:val="HTMLCode"/>
+        </w:rPr>
+      </w:pPr>
+      <w:proofErr w:type="spellStart"/>
+      <w:proofErr w:type="gramStart"/>
+      <w:r>
+        <w:rPr>
+          <w:rStyle w:val="HTMLCode"/>
+        </w:rPr>
+        <w:t>transactionSchema.index</w:t>
+      </w:r>
+      <w:proofErr w:type="spellEnd"/>
+      <w:r>
+        <w:rPr>
+          <w:rStyle w:val="HTMLCode"/>
+        </w:rPr>
+        <w:t>(</w:t>
+      </w:r>
+      <w:proofErr w:type="gramEnd"/>
+      <w:r>
+        <w:rPr>
+          <w:rStyle w:val="HTMLCode"/>
+        </w:rPr>
+        <w:t xml:space="preserve">{ </w:t>
+      </w:r>
+      <w:proofErr w:type="spellStart"/>
+      <w:r>
+        <w:rPr>
+          <w:rStyle w:val="hljs-attr"/>
+        </w:rPr>
+        <w:t>userId</w:t>
+      </w:r>
+      <w:proofErr w:type="spellEnd"/>
+      <w:r>
+        <w:rPr>
+          <w:rStyle w:val="HTMLCode"/>
+        </w:rPr>
+        <w:t xml:space="preserve">: </w:t>
+      </w:r>
+      <w:r>
+        <w:rPr>
+          <w:rStyle w:val="hljs-number"/>
+        </w:rPr>
+        <w:t>1</w:t>
+      </w:r>
+      <w:r>
+        <w:rPr>
+          <w:rStyle w:val="HTMLCode"/>
+        </w:rPr>
+        <w:t xml:space="preserve">, </w:t>
+      </w:r>
+      <w:r>
+        <w:rPr>
+          <w:rStyle w:val="hljs-attr"/>
+        </w:rPr>
+        <w:t>month</w:t>
+      </w:r>
+      <w:r>
+        <w:rPr>
+          <w:rStyle w:val="HTMLCode"/>
+        </w:rPr>
+        <w:t xml:space="preserve">: </w:t>
+      </w:r>
+      <w:r>
+        <w:rPr>
+          <w:rStyle w:val="hljs-number"/>
+        </w:rPr>
+        <w:t>1</w:t>
+      </w:r>
+      <w:r>
+        <w:rPr>
+          <w:rStyle w:val="HTMLCode"/>
+        </w:rPr>
+        <w:t xml:space="preserve">, </w:t>
+      </w:r>
+      <w:r>
+        <w:rPr>
+          <w:rStyle w:val="hljs-attr"/>
+        </w:rPr>
+        <w:t>category</w:t>
+      </w:r>
+      <w:r>
+        <w:rPr>
+          <w:rStyle w:val="HTMLCode"/>
+        </w:rPr>
+        <w:t xml:space="preserve">: </w:t>
+      </w:r>
+      <w:r>
+        <w:rPr>
+          <w:rStyle w:val="hljs-number"/>
+        </w:rPr>
+        <w:t>1</w:t>
+      </w:r>
+      <w:r>
+        <w:rPr>
+          <w:rStyle w:val="HTMLCode"/>
+        </w:rPr>
+        <w:t xml:space="preserve"> });</w:t>
+      </w:r>
+    </w:p>
+    <w:p>
+      <w:pPr>
+        <w:pStyle w:val="HTMLPreformatted"/>
+        <w:rPr>
+          <w:rStyle w:val="HTMLCode"/>
+        </w:rPr>
+      </w:pPr>
+    </w:p>
+    <w:p>
+      <w:pPr>
+        <w:pStyle w:val="HTMLPreformatted"/>
+        <w:rPr>
+          <w:rStyle w:val="HTMLCode"/>
+        </w:rPr>
+      </w:pPr>
+      <w:proofErr w:type="spellStart"/>
+      <w:r>
+        <w:rPr>
+          <w:rStyle w:val="hljs-builtin"/>
+        </w:rPr>
+        <w:t>module</w:t>
+      </w:r>
+      <w:r>
+        <w:rPr>
+          <w:rStyle w:val="HTMLCode"/>
+        </w:rPr>
+        <w:t>.exports</w:t>
+      </w:r>
+      <w:proofErr w:type="spellEnd"/>
+      <w:r>
+        <w:rPr>
+          <w:rStyle w:val="HTMLCode"/>
+        </w:rPr>
+        <w:t xml:space="preserve"> = </w:t>
+      </w:r>
+      <w:proofErr w:type="spellStart"/>
+      <w:proofErr w:type="gramStart"/>
+      <w:r>
+        <w:rPr>
+          <w:rStyle w:val="HTMLCode"/>
+        </w:rPr>
+        <w:t>mongoose.model</w:t>
+      </w:r>
+      <w:proofErr w:type="spellEnd"/>
+      <w:r>
+        <w:rPr>
+          <w:rStyle w:val="HTMLCode"/>
+        </w:rPr>
+        <w:t>(</w:t>
+      </w:r>
+      <w:proofErr w:type="gramEnd"/>
+      <w:r>
+        <w:rPr>
+          <w:rStyle w:val="hljs-string"/>
+        </w:rPr>
+        <w:t>"Transaction"</w:t>
+      </w:r>
+      <w:r>
+        <w:rPr>
+          <w:rStyle w:val="HTMLCode"/>
+        </w:rPr>
+        <w:t xml:space="preserve">, </w:t>
+      </w:r>
+      <w:proofErr w:type="spellStart"/>
+      <w:r>
+        <w:rPr>
+          <w:rStyle w:val="HTMLCode"/>
+        </w:rPr>
+        <w:t>transactionSchema</w:t>
+      </w:r>
+      <w:proofErr w:type="spellEnd"/>
+      <w:r>
+        <w:rPr>
+          <w:rStyle w:val="HTMLCode"/>
+        </w:rPr>
+        <w:t>);</w:t>
+      </w:r>
+    </w:p>
+    <w:p>
+      <w:pPr>
+        <w:pStyle w:val="Heading3"/>
+      </w:pPr>
+      <w:r>
+        <w:rPr>
+          <w:rFonts w:ascii="Segoe UI Symbol" w:hAnsi="Segoe UI Symbol" w:cs="Segoe UI Symbol"/>
+        </w:rPr>
+        <w:t>🐛</w:t>
+      </w:r>
+      <w:r>
+        <w:t xml:space="preserve"> 2. Bug Prevention &amp; Edge Cases</w:t>
+      </w:r>
+    </w:p>
+    <w:p>
+      <w:pPr>
+        <w:pStyle w:val="NormalWeb"/>
+      </w:pPr>
+      <w:r>
+        <w:rPr>
+          <w:b/>
+          <w:bCs/>
+        </w:rPr>
+        <w:t>A. The "Duplicate Upload" Bug (</w:t>
+      </w:r>
+      <w:r>
+        <w:rPr>
+          <w:rStyle w:val="HTMLCode"/>
+          <w:b/>
+          <w:bCs/>
+        </w:rPr>
+        <w:t>uploadControllers.js</w:t>
+      </w:r>
+      <w:r>
+        <w:rPr>
+          <w:b/>
+          <w:bCs/>
+        </w:rPr>
+        <w:t>)</w:t>
+      </w:r>
+      <w:r>
+        <w:t xml:space="preserve"> If a user forgets they uploaded their 2023 statement and uploads it again, </w:t>
+      </w:r>
+      <w:r>
+        <w:rPr>
+          <w:rStyle w:val="HTMLCode"/>
+        </w:rPr>
+        <w:t xml:space="preserve">await </w:t>
+      </w:r>
+      <w:proofErr w:type="spellStart"/>
+      <w:proofErr w:type="gramStart"/>
+      <w:r>
+        <w:rPr>
+          <w:rStyle w:val="HTMLCode"/>
+        </w:rPr>
+        <w:t>Transaction.insertMany</w:t>
+      </w:r>
+      <w:proofErr w:type="spellEnd"/>
+      <w:r>
+        <w:rPr>
+          <w:rStyle w:val="HTMLCode"/>
+        </w:rPr>
+        <w:t>(</w:t>
+      </w:r>
+      <w:proofErr w:type="spellStart"/>
+      <w:proofErr w:type="gramEnd"/>
+      <w:r>
+        <w:rPr>
+          <w:rStyle w:val="HTMLCode"/>
+        </w:rPr>
+        <w:t>formattedTransactions</w:t>
+      </w:r>
+      <w:proofErr w:type="spellEnd"/>
+      <w:r>
+        <w:rPr>
+          <w:rStyle w:val="HTMLCode"/>
+        </w:rPr>
+        <w:t>)</w:t>
+      </w:r>
+      <w:r>
+        <w:t xml:space="preserve"> will blindly insert them again. Their dashboard will show double the expenses!</w:t>
+      </w:r>
+    </w:p>
+    <w:p>
+      <w:pPr>
+        <w:pStyle w:val="NormalWeb"/>
+        <w:numPr>
+          <w:ilvl w:val="0"/>
+          <w:numId w:val="15"/>
+        </w:numPr>
+      </w:pPr>
+      <w:r>
+        <w:rPr>
+          <w:b/>
+          <w:bCs/>
+        </w:rPr>
+        <w:lastRenderedPageBreak/>
+        <w:t>The Fix:</w:t>
+      </w:r>
+      <w:r>
+        <w:t xml:space="preserve"> Before inserting, you need to check if those exact transactions already exist for that user. You can do this by creating a unique "hash" of the transaction (Date + Amount + Description) or checking the database for overlapping dates before saving.</w:t>
+      </w:r>
+    </w:p>
+    <w:p>
+      <w:pPr>
+        <w:pStyle w:val="NormalWeb"/>
+      </w:pPr>
+      <w:r>
+        <w:rPr>
+          <w:b/>
+          <w:bCs/>
+        </w:rPr>
+        <w:t xml:space="preserve">B. The </w:t>
+      </w:r>
+      <w:proofErr w:type="spellStart"/>
+      <w:r>
+        <w:rPr>
+          <w:b/>
+          <w:bCs/>
+        </w:rPr>
+        <w:t>ChromaDB</w:t>
+      </w:r>
+      <w:proofErr w:type="spellEnd"/>
+      <w:r>
+        <w:rPr>
+          <w:b/>
+          <w:bCs/>
+        </w:rPr>
+        <w:t xml:space="preserve"> "Race Condition" Bug (</w:t>
+      </w:r>
+      <w:r>
+        <w:rPr>
+          <w:rStyle w:val="HTMLCode"/>
+          <w:b/>
+          <w:bCs/>
+        </w:rPr>
+        <w:t>vector_store.py</w:t>
+      </w:r>
+      <w:r>
+        <w:rPr>
+          <w:b/>
+          <w:bCs/>
+        </w:rPr>
+        <w:t>)</w:t>
+      </w:r>
+      <w:r>
+        <w:t xml:space="preserve"> Look at this line in your Python code: </w:t>
+      </w:r>
+      <w:proofErr w:type="spellStart"/>
+      <w:proofErr w:type="gramStart"/>
+      <w:r>
+        <w:rPr>
+          <w:rStyle w:val="HTMLCode"/>
+        </w:rPr>
+        <w:t>ids.append</w:t>
+      </w:r>
+      <w:proofErr w:type="spellEnd"/>
+      <w:r>
+        <w:rPr>
+          <w:rStyle w:val="HTMLCode"/>
+        </w:rPr>
+        <w:t>(</w:t>
+      </w:r>
+      <w:proofErr w:type="spellStart"/>
+      <w:proofErr w:type="gramEnd"/>
+      <w:r>
+        <w:rPr>
+          <w:rStyle w:val="HTMLCode"/>
+        </w:rPr>
+        <w:t>f"txn</w:t>
+      </w:r>
+      <w:proofErr w:type="spellEnd"/>
+      <w:r>
+        <w:rPr>
+          <w:rStyle w:val="HTMLCode"/>
+        </w:rPr>
+        <w:t>_{</w:t>
+      </w:r>
+      <w:proofErr w:type="spellStart"/>
+      <w:r>
+        <w:rPr>
+          <w:rStyle w:val="HTMLCode"/>
+        </w:rPr>
+        <w:t>user_id</w:t>
+      </w:r>
+      <w:proofErr w:type="spellEnd"/>
+      <w:r>
+        <w:rPr>
+          <w:rStyle w:val="HTMLCode"/>
+        </w:rPr>
+        <w:t>}_{</w:t>
+      </w:r>
+      <w:proofErr w:type="spellStart"/>
+      <w:r>
+        <w:rPr>
+          <w:rStyle w:val="HTMLCode"/>
+        </w:rPr>
+        <w:t>start_id</w:t>
+      </w:r>
+      <w:proofErr w:type="spellEnd"/>
+      <w:r>
+        <w:rPr>
+          <w:rStyle w:val="HTMLCode"/>
+        </w:rPr>
+        <w:t xml:space="preserve"> + </w:t>
+      </w:r>
+      <w:proofErr w:type="spellStart"/>
+      <w:r>
+        <w:rPr>
+          <w:rStyle w:val="HTMLCode"/>
+        </w:rPr>
+        <w:t>i</w:t>
+      </w:r>
+      <w:proofErr w:type="spellEnd"/>
+      <w:r>
+        <w:rPr>
+          <w:rStyle w:val="HTMLCode"/>
+        </w:rPr>
+        <w:t>}")</w:t>
+      </w:r>
+      <w:r>
+        <w:t xml:space="preserve">. If two users upload a PDF at the exact same millisecond, </w:t>
+      </w:r>
+      <w:proofErr w:type="spellStart"/>
+      <w:proofErr w:type="gramStart"/>
+      <w:r>
+        <w:rPr>
+          <w:rStyle w:val="HTMLCode"/>
+        </w:rPr>
+        <w:t>self.collection.count</w:t>
+      </w:r>
+      <w:proofErr w:type="spellEnd"/>
+      <w:r>
+        <w:rPr>
+          <w:rStyle w:val="HTMLCode"/>
+        </w:rPr>
+        <w:t>(</w:t>
+      </w:r>
+      <w:proofErr w:type="gramEnd"/>
+      <w:r>
+        <w:rPr>
+          <w:rStyle w:val="HTMLCode"/>
+        </w:rPr>
+        <w:t>)</w:t>
+      </w:r>
+      <w:r>
+        <w:t xml:space="preserve"> will be identical for both of them, causing ID collisions and crashing the database.</w:t>
+      </w:r>
+    </w:p>
+    <w:p>
+      <w:pPr>
+        <w:pStyle w:val="NormalWeb"/>
+        <w:numPr>
+          <w:ilvl w:val="0"/>
+          <w:numId w:val="16"/>
+        </w:numPr>
+      </w:pPr>
+      <w:r>
+        <w:rPr>
+          <w:b/>
+          <w:bCs/>
+        </w:rPr>
+        <w:t>The Fix:</w:t>
+      </w:r>
+      <w:r>
+        <w:t xml:space="preserve"> Never use </w:t>
+      </w:r>
+      <w:r>
+        <w:rPr>
+          <w:rStyle w:val="HTMLCode"/>
+        </w:rPr>
+        <w:t>.</w:t>
+      </w:r>
+      <w:proofErr w:type="gramStart"/>
+      <w:r>
+        <w:rPr>
+          <w:rStyle w:val="HTMLCode"/>
+        </w:rPr>
+        <w:t>count(</w:t>
+      </w:r>
+      <w:proofErr w:type="gramEnd"/>
+      <w:r>
+        <w:rPr>
+          <w:rStyle w:val="HTMLCode"/>
+        </w:rPr>
+        <w:t>)</w:t>
+      </w:r>
+      <w:r>
+        <w:t xml:space="preserve"> to generate IDs. Use Python's built-in </w:t>
+      </w:r>
+      <w:proofErr w:type="spellStart"/>
+      <w:r>
+        <w:rPr>
+          <w:rStyle w:val="HTMLCode"/>
+        </w:rPr>
+        <w:t>uuid</w:t>
+      </w:r>
+      <w:proofErr w:type="spellEnd"/>
+      <w:r>
+        <w:t xml:space="preserve"> library to guarantee unique vector IDs.</w:t>
+      </w:r>
+    </w:p>
+    <w:p>
+      <w:r>
+        <w:rPr>
+          <w:rStyle w:val="ng-tns-c2371930484-253"/>
+        </w:rPr>
+        <w:t>Python</w:t>
+      </w:r>
+    </w:p>
+    <w:p>
+      <w:pPr>
+        <w:pStyle w:val="HTMLPreformatted"/>
+        <w:rPr>
+          <w:rStyle w:val="HTMLCode"/>
+        </w:rPr>
+      </w:pPr>
+      <w:proofErr w:type="gramStart"/>
+      <w:r>
+        <w:rPr>
+          <w:rStyle w:val="hljs-keyword"/>
+        </w:rPr>
+        <w:t>import</w:t>
+      </w:r>
+      <w:proofErr w:type="gramEnd"/>
+      <w:r>
+        <w:rPr>
+          <w:rStyle w:val="HTMLCode"/>
+        </w:rPr>
+        <w:t xml:space="preserve"> </w:t>
+      </w:r>
+      <w:proofErr w:type="spellStart"/>
+      <w:r>
+        <w:rPr>
+          <w:rStyle w:val="HTMLCode"/>
+        </w:rPr>
+        <w:t>uuid</w:t>
+      </w:r>
+      <w:proofErr w:type="spellEnd"/>
+    </w:p>
+    <w:p>
+      <w:pPr>
+        <w:pStyle w:val="HTMLPreformatted"/>
+        <w:rPr>
+          <w:rStyle w:val="HTMLCode"/>
+        </w:rPr>
+      </w:pPr>
+      <w:r>
+        <w:rPr>
+          <w:rStyle w:val="hljs-comment"/>
+        </w:rPr>
+        <w:t># ... inside your loop:</w:t>
+      </w:r>
+    </w:p>
+    <w:p>
+      <w:pPr>
+        <w:pStyle w:val="HTMLPreformatted"/>
+        <w:rPr>
+          <w:rStyle w:val="HTMLCode"/>
+        </w:rPr>
+      </w:pPr>
+      <w:proofErr w:type="spellStart"/>
+      <w:r>
+        <w:rPr>
+          <w:rStyle w:val="HTMLCode"/>
+        </w:rPr>
+        <w:t>unique_id</w:t>
+      </w:r>
+      <w:proofErr w:type="spellEnd"/>
+      <w:r>
+        <w:rPr>
+          <w:rStyle w:val="HTMLCode"/>
+        </w:rPr>
+        <w:t xml:space="preserve"> = </w:t>
+      </w:r>
+      <w:proofErr w:type="spellStart"/>
+      <w:proofErr w:type="gramStart"/>
+      <w:r>
+        <w:rPr>
+          <w:rStyle w:val="hljs-builtin"/>
+        </w:rPr>
+        <w:t>str</w:t>
+      </w:r>
+      <w:proofErr w:type="spellEnd"/>
+      <w:r>
+        <w:rPr>
+          <w:rStyle w:val="HTMLCode"/>
+        </w:rPr>
+        <w:t>(</w:t>
+      </w:r>
+      <w:proofErr w:type="gramEnd"/>
+      <w:r>
+        <w:rPr>
+          <w:rStyle w:val="HTMLCode"/>
+        </w:rPr>
+        <w:t>uuid.uuid4())</w:t>
+      </w:r>
+    </w:p>
+    <w:p>
+      <w:pPr>
+        <w:pStyle w:val="HTMLPreformatted"/>
+        <w:rPr>
+          <w:rStyle w:val="HTMLCode"/>
+        </w:rPr>
+      </w:pPr>
+      <w:proofErr w:type="spellStart"/>
+      <w:proofErr w:type="gramStart"/>
+      <w:r>
+        <w:rPr>
+          <w:rStyle w:val="HTMLCode"/>
+        </w:rPr>
+        <w:t>ids.append</w:t>
+      </w:r>
+      <w:proofErr w:type="spellEnd"/>
+      <w:r>
+        <w:rPr>
+          <w:rStyle w:val="HTMLCode"/>
+        </w:rPr>
+        <w:t>(</w:t>
+      </w:r>
+      <w:proofErr w:type="spellStart"/>
+      <w:proofErr w:type="gramEnd"/>
+      <w:r>
+        <w:rPr>
+          <w:rStyle w:val="hljs-string"/>
+        </w:rPr>
+        <w:t>f"txn</w:t>
+      </w:r>
+      <w:proofErr w:type="spellEnd"/>
+      <w:r>
+        <w:rPr>
+          <w:rStyle w:val="hljs-string"/>
+        </w:rPr>
+        <w:t>_</w:t>
+      </w:r>
+      <w:r>
+        <w:rPr>
+          <w:rStyle w:val="hljs-subst"/>
+        </w:rPr>
+        <w:t>{</w:t>
+      </w:r>
+      <w:proofErr w:type="spellStart"/>
+      <w:r>
+        <w:rPr>
+          <w:rStyle w:val="hljs-subst"/>
+        </w:rPr>
+        <w:t>user_id</w:t>
+      </w:r>
+      <w:proofErr w:type="spellEnd"/>
+      <w:r>
+        <w:rPr>
+          <w:rStyle w:val="hljs-subst"/>
+        </w:rPr>
+        <w:t>}</w:t>
+      </w:r>
+      <w:r>
+        <w:rPr>
+          <w:rStyle w:val="hljs-string"/>
+        </w:rPr>
+        <w:t>_</w:t>
+      </w:r>
+      <w:r>
+        <w:rPr>
+          <w:rStyle w:val="hljs-subst"/>
+        </w:rPr>
+        <w:t>{</w:t>
+      </w:r>
+      <w:proofErr w:type="spellStart"/>
+      <w:r>
+        <w:rPr>
+          <w:rStyle w:val="hljs-subst"/>
+        </w:rPr>
+        <w:t>unique_id</w:t>
+      </w:r>
+      <w:proofErr w:type="spellEnd"/>
+      <w:r>
+        <w:rPr>
+          <w:rStyle w:val="hljs-subst"/>
+        </w:rPr>
+        <w:t>}</w:t>
+      </w:r>
+      <w:r>
+        <w:rPr>
+          <w:rStyle w:val="hljs-string"/>
+        </w:rPr>
+        <w:t>"</w:t>
+      </w:r>
+      <w:r>
+        <w:rPr>
+          <w:rStyle w:val="HTMLCode"/>
+        </w:rPr>
+        <w:t>)</w:t>
+      </w:r>
+    </w:p>
+    <w:p>
+      <w:pPr>
+        <w:pStyle w:val="NormalWeb"/>
+      </w:pPr>
+      <w:r>
+        <w:rPr>
+          <w:b/>
+          <w:bCs/>
+        </w:rPr>
+        <w:t>C. The PDF Password Crash (</w:t>
+      </w:r>
+      <w:r>
+        <w:rPr>
+          <w:rStyle w:val="HTMLCode"/>
+          <w:b/>
+          <w:bCs/>
+        </w:rPr>
+        <w:t>main.py</w:t>
+      </w:r>
+      <w:r>
+        <w:rPr>
+          <w:b/>
+          <w:bCs/>
+        </w:rPr>
+        <w:t>)</w:t>
+      </w:r>
+      <w:r>
+        <w:t xml:space="preserve"> If a user uploads a password-protected bank statement, </w:t>
+      </w:r>
+      <w:proofErr w:type="spellStart"/>
+      <w:proofErr w:type="gramStart"/>
+      <w:r>
+        <w:rPr>
+          <w:rStyle w:val="HTMLCode"/>
+        </w:rPr>
+        <w:t>fitz.open</w:t>
+      </w:r>
+      <w:proofErr w:type="spellEnd"/>
+      <w:r>
+        <w:rPr>
+          <w:rStyle w:val="HTMLCode"/>
+        </w:rPr>
+        <w:t>(</w:t>
+      </w:r>
+      <w:proofErr w:type="gramEnd"/>
+      <w:r>
+        <w:rPr>
+          <w:rStyle w:val="HTMLCode"/>
+        </w:rPr>
+        <w:t xml:space="preserve">stream=content, </w:t>
+      </w:r>
+      <w:proofErr w:type="spellStart"/>
+      <w:r>
+        <w:rPr>
+          <w:rStyle w:val="HTMLCode"/>
+        </w:rPr>
+        <w:t>filetype</w:t>
+      </w:r>
+      <w:proofErr w:type="spellEnd"/>
+      <w:r>
+        <w:rPr>
+          <w:rStyle w:val="HTMLCode"/>
+        </w:rPr>
+        <w:t>="pdf")</w:t>
+      </w:r>
+      <w:r>
+        <w:t xml:space="preserve"> will immediately crash the Python server.</w:t>
+      </w:r>
+    </w:p>
+    <w:p>
+      <w:pPr>
+        <w:pStyle w:val="NormalWeb"/>
+        <w:numPr>
+          <w:ilvl w:val="0"/>
+          <w:numId w:val="17"/>
+        </w:numPr>
+      </w:pPr>
+      <w:r>
+        <w:rPr>
+          <w:b/>
+          <w:bCs/>
+        </w:rPr>
+        <w:t>The Fix:</w:t>
+      </w:r>
+      <w:r>
+        <w:t xml:space="preserve"> Check if it's encrypted before reading:</w:t>
+      </w:r>
+    </w:p>
+    <w:p>
+      <w:r>
+        <w:rPr>
+          <w:rStyle w:val="ng-tns-c2371930484-254"/>
+        </w:rPr>
+        <w:t>Python</w:t>
+      </w:r>
+    </w:p>
+    <w:p>
+      <w:pPr>
+        <w:pStyle w:val="HTMLPreformatted"/>
+        <w:rPr>
+          <w:rStyle w:val="HTMLCode"/>
+        </w:rPr>
+      </w:pPr>
+      <w:proofErr w:type="gramStart"/>
+      <w:r>
+        <w:rPr>
+          <w:rStyle w:val="HTMLCode"/>
+        </w:rPr>
+        <w:t>doc</w:t>
+      </w:r>
+      <w:proofErr w:type="gramEnd"/>
+      <w:r>
+        <w:rPr>
+          <w:rStyle w:val="HTMLCode"/>
+        </w:rPr>
+        <w:t xml:space="preserve"> = </w:t>
+      </w:r>
+      <w:proofErr w:type="spellStart"/>
+      <w:r>
+        <w:rPr>
+          <w:rStyle w:val="HTMLCode"/>
+        </w:rPr>
+        <w:t>fitz.</w:t>
+      </w:r>
+      <w:r>
+        <w:rPr>
+          <w:rStyle w:val="hljs-builtin"/>
+        </w:rPr>
+        <w:t>open</w:t>
+      </w:r>
+      <w:proofErr w:type="spellEnd"/>
+      <w:r>
+        <w:rPr>
+          <w:rStyle w:val="HTMLCode"/>
+        </w:rPr>
+        <w:t xml:space="preserve">(stream=content, </w:t>
+      </w:r>
+      <w:proofErr w:type="spellStart"/>
+      <w:r>
+        <w:rPr>
+          <w:rStyle w:val="HTMLCode"/>
+        </w:rPr>
+        <w:t>filetype</w:t>
+      </w:r>
+      <w:proofErr w:type="spellEnd"/>
+      <w:r>
+        <w:rPr>
+          <w:rStyle w:val="HTMLCode"/>
+        </w:rPr>
+        <w:t>=</w:t>
+      </w:r>
+      <w:r>
+        <w:rPr>
+          <w:rStyle w:val="hljs-string"/>
+        </w:rPr>
+        <w:t>"pdf"</w:t>
+      </w:r>
+      <w:r>
+        <w:rPr>
+          <w:rStyle w:val="HTMLCode"/>
+        </w:rPr>
+        <w:t>)</w:t>
+      </w:r>
+    </w:p>
+    <w:p>
+      <w:pPr>
+        <w:pStyle w:val="HTMLPreformatted"/>
+        <w:rPr>
+          <w:rStyle w:val="HTMLCode"/>
+        </w:rPr>
+      </w:pPr>
+      <w:proofErr w:type="gramStart"/>
+      <w:r>
+        <w:rPr>
+          <w:rStyle w:val="hljs-keyword"/>
+        </w:rPr>
+        <w:t>if</w:t>
+      </w:r>
+      <w:proofErr w:type="gramEnd"/>
+      <w:r>
+        <w:rPr>
+          <w:rStyle w:val="HTMLCode"/>
+        </w:rPr>
+        <w:t xml:space="preserve"> </w:t>
+      </w:r>
+      <w:proofErr w:type="spellStart"/>
+      <w:r>
+        <w:rPr>
+          <w:rStyle w:val="HTMLCode"/>
+        </w:rPr>
+        <w:t>doc.is_encrypted</w:t>
+      </w:r>
+      <w:proofErr w:type="spellEnd"/>
+      <w:r>
+        <w:rPr>
+          <w:rStyle w:val="HTMLCode"/>
+        </w:rPr>
+        <w:t>:</w:t>
+      </w:r>
+    </w:p>
+    <w:p>
+      <w:pPr>
+        <w:pStyle w:val="HTMLPreformatted"/>
+        <w:rPr>
+          <w:rStyle w:val="HTMLCode"/>
+        </w:rPr>
+      </w:pPr>
+      <w:r>
+        <w:rPr>
+          <w:rStyle w:val="HTMLCode"/>
+        </w:rPr>
+        <w:t xml:space="preserve">    </w:t>
+      </w:r>
+      <w:proofErr w:type="gramStart"/>
+      <w:r>
+        <w:rPr>
+          <w:rStyle w:val="hljs-keyword"/>
+        </w:rPr>
+        <w:t>return</w:t>
+      </w:r>
+      <w:proofErr w:type="gramEnd"/>
+      <w:r>
+        <w:rPr>
+          <w:rStyle w:val="HTMLCode"/>
+        </w:rPr>
+        <w:t xml:space="preserve"> {</w:t>
+      </w:r>
+      <w:r>
+        <w:rPr>
+          <w:rStyle w:val="hljs-string"/>
+        </w:rPr>
+        <w:t>"error"</w:t>
+      </w:r>
+      <w:r>
+        <w:rPr>
+          <w:rStyle w:val="HTMLCode"/>
+        </w:rPr>
+        <w:t xml:space="preserve">: </w:t>
+      </w:r>
+      <w:r>
+        <w:rPr>
+          <w:rStyle w:val="hljs-string"/>
+        </w:rPr>
+        <w:t>"Please decrypt your PDF before uploading."</w:t>
+      </w:r>
+      <w:r>
+        <w:rPr>
+          <w:rStyle w:val="HTMLCode"/>
+        </w:rPr>
+        <w:t>}</w:t>
+      </w:r>
+    </w:p>
+    <w:p>
+      <w:pPr>
+        <w:pStyle w:val="Heading3"/>
+      </w:pPr>
+      <w:r>
+        <w:rPr>
+          <w:rFonts w:ascii="Segoe UI Symbol" w:hAnsi="Segoe UI Symbol" w:cs="Segoe UI Symbol"/>
+        </w:rPr>
+        <w:t>🔒</w:t>
+      </w:r>
+      <w:r>
+        <w:t xml:space="preserve"> 3. System Security</w:t>
+      </w:r>
+    </w:p>
+    <w:p>
+      <w:pPr>
+        <w:pStyle w:val="NormalWeb"/>
+      </w:pPr>
+      <w:r>
+        <w:rPr>
+          <w:b/>
+          <w:bCs/>
+        </w:rPr>
+        <w:t xml:space="preserve">A. Exposed Python </w:t>
+      </w:r>
+      <w:proofErr w:type="spellStart"/>
+      <w:r>
+        <w:rPr>
+          <w:b/>
+          <w:bCs/>
+        </w:rPr>
+        <w:t>Microservice</w:t>
+      </w:r>
+      <w:proofErr w:type="spellEnd"/>
+      <w:r>
+        <w:rPr>
+          <w:b/>
+          <w:bCs/>
+        </w:rPr>
+        <w:t xml:space="preserve"> (</w:t>
+      </w:r>
+      <w:r>
+        <w:rPr>
+          <w:rStyle w:val="HTMLCode"/>
+          <w:b/>
+          <w:bCs/>
+        </w:rPr>
+        <w:t>main.py</w:t>
+      </w:r>
+      <w:r>
+        <w:rPr>
+          <w:b/>
+          <w:bCs/>
+        </w:rPr>
+        <w:t xml:space="preserve"> &amp; Controllers)</w:t>
+      </w:r>
+      <w:r>
+        <w:t xml:space="preserve"> Right now, Node.js securely checks the JWT token, but Python does not. Anyone who finds out your Python server is running on Port 8000 can send a POST request to </w:t>
+      </w:r>
+      <w:r>
+        <w:rPr>
+          <w:rStyle w:val="HTMLCode"/>
+        </w:rPr>
+        <w:t>/</w:t>
+      </w:r>
+      <w:proofErr w:type="spellStart"/>
+      <w:r>
+        <w:rPr>
+          <w:rStyle w:val="HTMLCode"/>
+        </w:rPr>
+        <w:t>process?user_id</w:t>
+      </w:r>
+      <w:proofErr w:type="spellEnd"/>
+      <w:r>
+        <w:rPr>
+          <w:rStyle w:val="HTMLCode"/>
+        </w:rPr>
+        <w:t>=123</w:t>
+      </w:r>
+      <w:r>
+        <w:t xml:space="preserve"> and inject fake data into someone else's account.</w:t>
+      </w:r>
+    </w:p>
+    <w:p>
+      <w:pPr>
+        <w:pStyle w:val="NormalWeb"/>
+        <w:numPr>
+          <w:ilvl w:val="0"/>
+          <w:numId w:val="18"/>
+        </w:numPr>
+      </w:pPr>
+      <w:r>
+        <w:rPr>
+          <w:b/>
+          <w:bCs/>
+        </w:rPr>
+        <w:t>The Fix:</w:t>
+      </w:r>
+      <w:r>
+        <w:t xml:space="preserve"> Create an </w:t>
+      </w:r>
+      <w:r>
+        <w:rPr>
+          <w:rStyle w:val="HTMLCode"/>
+        </w:rPr>
+        <w:t>INTERNAL_SERVICE_KEY</w:t>
+      </w:r>
+      <w:r>
+        <w:t xml:space="preserve"> in both </w:t>
+      </w:r>
+      <w:r>
+        <w:rPr>
+          <w:rStyle w:val="HTMLCode"/>
+        </w:rPr>
+        <w:t>.</w:t>
+      </w:r>
+      <w:proofErr w:type="spellStart"/>
+      <w:r>
+        <w:rPr>
+          <w:rStyle w:val="HTMLCode"/>
+        </w:rPr>
+        <w:t>env</w:t>
+      </w:r>
+      <w:proofErr w:type="spellEnd"/>
+      <w:r>
+        <w:t xml:space="preserve"> files. In </w:t>
+      </w:r>
+      <w:r>
+        <w:rPr>
+          <w:rStyle w:val="HTMLCode"/>
+        </w:rPr>
+        <w:t>uploadControllers.js</w:t>
+      </w:r>
+      <w:r>
+        <w:t xml:space="preserve"> and </w:t>
+      </w:r>
+      <w:r>
+        <w:rPr>
+          <w:rStyle w:val="HTMLCode"/>
+        </w:rPr>
+        <w:t>chatControllers.js</w:t>
+      </w:r>
+      <w:r>
+        <w:t xml:space="preserve">, pass it in the headers. In Python </w:t>
+      </w:r>
+      <w:r>
+        <w:rPr>
+          <w:rStyle w:val="HTMLCode"/>
+        </w:rPr>
+        <w:t>main.py</w:t>
+      </w:r>
+      <w:r>
+        <w:t>, reject any request that doesn't have that exact header.</w:t>
+      </w:r>
+    </w:p>
+    <w:p>
+      <w:pPr>
+        <w:pStyle w:val="NormalWeb"/>
+      </w:pPr>
+      <w:r>
+        <w:rPr>
+          <w:b/>
+          <w:bCs/>
+        </w:rPr>
+        <w:t>B. Wide-Open CORS (</w:t>
+      </w:r>
+      <w:r>
+        <w:rPr>
+          <w:rStyle w:val="HTMLCode"/>
+          <w:b/>
+          <w:bCs/>
+        </w:rPr>
+        <w:t>index.js</w:t>
+      </w:r>
+      <w:r>
+        <w:rPr>
+          <w:b/>
+          <w:bCs/>
+        </w:rPr>
+        <w:t>)</w:t>
+      </w:r>
+      <w:r>
+        <w:t xml:space="preserve"> In </w:t>
+      </w:r>
+      <w:r>
+        <w:rPr>
+          <w:rStyle w:val="HTMLCode"/>
+        </w:rPr>
+        <w:t>backend/index.js</w:t>
+      </w:r>
+      <w:r>
+        <w:t xml:space="preserve">, you have </w:t>
+      </w:r>
+      <w:proofErr w:type="spellStart"/>
+      <w:proofErr w:type="gramStart"/>
+      <w:r>
+        <w:rPr>
+          <w:rStyle w:val="HTMLCode"/>
+        </w:rPr>
+        <w:t>app.use</w:t>
+      </w:r>
+      <w:proofErr w:type="spellEnd"/>
+      <w:r>
+        <w:rPr>
+          <w:rStyle w:val="HTMLCode"/>
+        </w:rPr>
+        <w:t>(</w:t>
+      </w:r>
+      <w:proofErr w:type="spellStart"/>
+      <w:proofErr w:type="gramEnd"/>
+      <w:r>
+        <w:rPr>
+          <w:rStyle w:val="HTMLCode"/>
+        </w:rPr>
+        <w:t>cors</w:t>
+      </w:r>
+      <w:proofErr w:type="spellEnd"/>
+      <w:r>
+        <w:rPr>
+          <w:rStyle w:val="HTMLCode"/>
+        </w:rPr>
+        <w:t>());</w:t>
+      </w:r>
+      <w:r>
+        <w:t xml:space="preserve">. This allows </w:t>
+      </w:r>
+      <w:r>
+        <w:rPr>
+          <w:i/>
+          <w:iCs/>
+        </w:rPr>
+        <w:t>any</w:t>
+      </w:r>
+      <w:r>
+        <w:t xml:space="preserve"> website on the internet to make requests to your API.</w:t>
+      </w:r>
+    </w:p>
+    <w:p>
+      <w:pPr>
+        <w:pStyle w:val="NormalWeb"/>
+        <w:numPr>
+          <w:ilvl w:val="0"/>
+          <w:numId w:val="19"/>
+        </w:numPr>
+      </w:pPr>
+      <w:r>
+        <w:rPr>
+          <w:b/>
+          <w:bCs/>
+        </w:rPr>
+        <w:t>The Fix:</w:t>
+      </w:r>
+      <w:r>
+        <w:t xml:space="preserve"> Restrict it to your React frontend URL.</w:t>
+      </w:r>
+    </w:p>
+    <w:p>
+      <w:r>
+        <w:rPr>
+          <w:rStyle w:val="ng-tns-c2371930484-255"/>
+        </w:rPr>
+        <w:t>JavaScript</w:t>
+      </w:r>
+    </w:p>
+    <w:p>
+      <w:pPr>
+        <w:pStyle w:val="HTMLPreformatted"/>
+        <w:rPr>
+          <w:rStyle w:val="HTMLCode"/>
+        </w:rPr>
+      </w:pPr>
+      <w:proofErr w:type="spellStart"/>
+      <w:proofErr w:type="gramStart"/>
+      <w:r>
+        <w:rPr>
+          <w:rStyle w:val="HTMLCode"/>
+        </w:rPr>
+        <w:t>app.use</w:t>
+      </w:r>
+      <w:proofErr w:type="spellEnd"/>
+      <w:r>
+        <w:rPr>
+          <w:rStyle w:val="HTMLCode"/>
+        </w:rPr>
+        <w:t>(</w:t>
+      </w:r>
+      <w:proofErr w:type="spellStart"/>
+      <w:proofErr w:type="gramEnd"/>
+      <w:r>
+        <w:rPr>
+          <w:rStyle w:val="HTMLCode"/>
+        </w:rPr>
+        <w:t>cors</w:t>
+      </w:r>
+      <w:proofErr w:type="spellEnd"/>
+      <w:r>
+        <w:rPr>
+          <w:rStyle w:val="HTMLCode"/>
+        </w:rPr>
+        <w:t xml:space="preserve">({ </w:t>
+      </w:r>
+      <w:r>
+        <w:rPr>
+          <w:rStyle w:val="hljs-attr"/>
+        </w:rPr>
+        <w:t>origin</w:t>
+      </w:r>
+      <w:r>
+        <w:rPr>
+          <w:rStyle w:val="HTMLCode"/>
+        </w:rPr>
+        <w:t xml:space="preserve">: </w:t>
+      </w:r>
+      <w:r>
+        <w:rPr>
+          <w:rStyle w:val="hljs-string"/>
+        </w:rPr>
+        <w:t>"http://localhost:5173"</w:t>
+      </w:r>
+      <w:r>
+        <w:rPr>
+          <w:rStyle w:val="HTMLCode"/>
+        </w:rPr>
+        <w:t xml:space="preserve">, </w:t>
+      </w:r>
+      <w:r>
+        <w:rPr>
+          <w:rStyle w:val="hljs-attr"/>
+        </w:rPr>
+        <w:t>credentials</w:t>
+      </w:r>
+      <w:r>
+        <w:rPr>
+          <w:rStyle w:val="HTMLCode"/>
+        </w:rPr>
+        <w:t xml:space="preserve">: </w:t>
+      </w:r>
+      <w:r>
+        <w:rPr>
+          <w:rStyle w:val="hljs-literal"/>
+        </w:rPr>
+        <w:t>true</w:t>
+      </w:r>
+      <w:r>
+        <w:rPr>
+          <w:rStyle w:val="HTMLCode"/>
+        </w:rPr>
+        <w:t xml:space="preserve"> }));</w:t>
+      </w:r>
+    </w:p>
+    <w:p>
+      <w:pPr>
+        <w:pStyle w:val="NormalWeb"/>
+      </w:pPr>
+      <w:r>
+        <w:rPr>
+          <w:b/>
+          <w:bCs/>
+        </w:rPr>
+        <w:lastRenderedPageBreak/>
+        <w:t>C. No Rate Limiting (</w:t>
+      </w:r>
+      <w:r>
+        <w:rPr>
+          <w:rStyle w:val="HTMLCode"/>
+          <w:b/>
+          <w:bCs/>
+        </w:rPr>
+        <w:t>index.js</w:t>
+      </w:r>
+      <w:r>
+        <w:rPr>
+          <w:b/>
+          <w:bCs/>
+        </w:rPr>
+        <w:t>)</w:t>
+      </w:r>
+      <w:r>
+        <w:t xml:space="preserve"> Your API uses </w:t>
+      </w:r>
+      <w:proofErr w:type="spellStart"/>
+      <w:r>
+        <w:t>OpenRouter</w:t>
+      </w:r>
+      <w:proofErr w:type="spellEnd"/>
+      <w:r>
+        <w:t xml:space="preserve"> (GPT models), which costs money per request. Without a Rate Limiter, a malicious bot could hit your </w:t>
+      </w:r>
+      <w:r>
+        <w:rPr>
+          <w:rStyle w:val="HTMLCode"/>
+        </w:rPr>
+        <w:t>/</w:t>
+      </w:r>
+      <w:proofErr w:type="spellStart"/>
+      <w:r>
+        <w:rPr>
+          <w:rStyle w:val="HTMLCode"/>
+        </w:rPr>
+        <w:t>api</w:t>
+      </w:r>
+      <w:proofErr w:type="spellEnd"/>
+      <w:r>
+        <w:rPr>
+          <w:rStyle w:val="HTMLCode"/>
+        </w:rPr>
+        <w:t>/chat</w:t>
+      </w:r>
+      <w:r>
+        <w:t xml:space="preserve"> route 10,000 times in a minute and drain your API credits.</w:t>
+      </w:r>
+    </w:p>
+    <w:p>
+      <w:pPr>
+        <w:pStyle w:val="NormalWeb"/>
+        <w:numPr>
+          <w:ilvl w:val="0"/>
+          <w:numId w:val="20"/>
+        </w:numPr>
+      </w:pPr>
+      <w:r>
+        <w:rPr>
+          <w:b/>
+          <w:bCs/>
+        </w:rPr>
+        <w:t>The Fix:</w:t>
+      </w:r>
+      <w:r>
+        <w:t xml:space="preserve"> Install </w:t>
+      </w:r>
+      <w:r>
+        <w:rPr>
+          <w:rStyle w:val="HTMLCode"/>
+        </w:rPr>
+        <w:t>express-rate-limit</w:t>
+      </w:r>
+      <w:r>
+        <w:t xml:space="preserve"> in Node.js and apply it to your </w:t>
+      </w:r>
+      <w:r>
+        <w:rPr>
+          <w:rStyle w:val="HTMLCode"/>
+        </w:rPr>
+        <w:t>/</w:t>
+      </w:r>
+      <w:proofErr w:type="spellStart"/>
+      <w:r>
+        <w:rPr>
+          <w:rStyle w:val="HTMLCode"/>
+        </w:rPr>
+        <w:t>api</w:t>
+      </w:r>
+      <w:proofErr w:type="spellEnd"/>
+      <w:r>
+        <w:rPr>
+          <w:rStyle w:val="HTMLCode"/>
+        </w:rPr>
+        <w:t>/chat</w:t>
+      </w:r>
+      <w:r>
+        <w:t xml:space="preserve"> and </w:t>
+      </w:r>
+      <w:r>
+        <w:rPr>
+          <w:rStyle w:val="HTMLCode"/>
+        </w:rPr>
+        <w:t>/</w:t>
+      </w:r>
+      <w:proofErr w:type="spellStart"/>
+      <w:r>
+        <w:rPr>
+          <w:rStyle w:val="HTMLCode"/>
+        </w:rPr>
+        <w:t>api</w:t>
+      </w:r>
+      <w:proofErr w:type="spellEnd"/>
+      <w:r>
+        <w:rPr>
+          <w:rStyle w:val="HTMLCode"/>
+        </w:rPr>
+        <w:t>/</w:t>
+      </w:r>
+      <w:proofErr w:type="spellStart"/>
+      <w:r>
+        <w:rPr>
+          <w:rStyle w:val="HTMLCode"/>
+        </w:rPr>
+        <w:t>auth</w:t>
+      </w:r>
+      <w:proofErr w:type="spellEnd"/>
+      <w:r>
+        <w:t xml:space="preserve"> routes.</w:t>
+      </w:r>
+    </w:p>
+    <w:p>
+      <w:pPr>
+        <w:pStyle w:val="Heading3"/>
+      </w:pPr>
+      <w:r>
+        <w:rPr>
+          <w:rFonts w:ascii="Segoe UI Symbol" w:hAnsi="Segoe UI Symbol" w:cs="Segoe UI Symbol"/>
+        </w:rPr>
+        <w:t>🏗</w:t>
+      </w:r>
+      <w:r>
+        <w:t>️ 4. Architecture &amp; Scalabil</w:t>
+      </w:r>
+      <w:bookmarkStart w:id="0" w:name="_GoBack"/>
+      <w:bookmarkEnd w:id="0"/>
+      <w:r>
+        <w:t>ity</w:t>
+      </w:r>
+    </w:p>
+    <w:p>
+      <w:pPr>
+        <w:pStyle w:val="NormalWeb"/>
+      </w:pPr>
+      <w:r>
+        <w:rPr>
+          <w:b/>
+          <w:bCs/>
+        </w:rPr>
+        <w:t>A. Hardcoded "Localhost" URLs</w:t>
+      </w:r>
+      <w:r>
+        <w:t xml:space="preserve"> In </w:t>
+      </w:r>
+      <w:r>
+        <w:rPr>
+          <w:rStyle w:val="HTMLCode"/>
+        </w:rPr>
+        <w:t>uploadControllers.js</w:t>
+      </w:r>
+      <w:r>
+        <w:t xml:space="preserve"> and </w:t>
+      </w:r>
+      <w:r>
+        <w:rPr>
+          <w:rStyle w:val="HTMLCode"/>
+        </w:rPr>
+        <w:t>chatControllers.js</w:t>
+      </w:r>
+      <w:r>
+        <w:t xml:space="preserve">, you have hardcoded </w:t>
+      </w:r>
+      <w:r>
+        <w:rPr>
+          <w:rStyle w:val="HTMLCode"/>
+        </w:rPr>
+        <w:t>http://localhost:8000</w:t>
+      </w:r>
+      <w:r>
+        <w:t xml:space="preserve">. When you deploy this to the internet (like Render, AWS, or </w:t>
+      </w:r>
+      <w:proofErr w:type="spellStart"/>
+      <w:r>
+        <w:t>Heroku</w:t>
+      </w:r>
+      <w:proofErr w:type="spellEnd"/>
+      <w:r>
+        <w:t xml:space="preserve">), </w:t>
+      </w:r>
+      <w:r>
+        <w:rPr>
+          <w:rStyle w:val="HTMLCode"/>
+        </w:rPr>
+        <w:t>localhost</w:t>
+      </w:r>
+      <w:r>
+        <w:t xml:space="preserve"> will point to the cloud server's empty local network and crash.</w:t>
+      </w:r>
+    </w:p>
+    <w:p>
+      <w:pPr>
+        <w:pStyle w:val="NormalWeb"/>
+        <w:numPr>
+          <w:ilvl w:val="0"/>
+          <w:numId w:val="21"/>
+        </w:numPr>
+      </w:pPr>
+      <w:r>
+        <w:rPr>
+          <w:b/>
+          <w:bCs/>
+        </w:rPr>
+        <w:t>The Fix:</w:t>
+      </w:r>
+      <w:r>
+        <w:t xml:space="preserve"> Replace them with environment variables.</w:t>
+      </w:r>
+    </w:p>
+    <w:p>
+      <w:r>
+        <w:rPr>
+          <w:rStyle w:val="ng-tns-c2371930484-256"/>
+        </w:rPr>
+        <w:t>JavaScript</w:t>
+      </w:r>
+    </w:p>
+    <w:p>
+      <w:pPr>
+        <w:pStyle w:val="HTMLPreformatted"/>
+        <w:rPr>
+          <w:rStyle w:val="HTMLCode"/>
+        </w:rPr>
+      </w:pPr>
+      <w:r>
+        <w:rPr>
+          <w:rStyle w:val="hljs-comment"/>
+        </w:rPr>
+        <w:t>// Change this:</w:t>
+      </w:r>
+    </w:p>
+    <w:p>
+      <w:pPr>
+        <w:pStyle w:val="HTMLPreformatted"/>
+        <w:rPr>
+          <w:rStyle w:val="HTMLCode"/>
+        </w:rPr>
+      </w:pPr>
+      <w:proofErr w:type="spellStart"/>
+      <w:proofErr w:type="gramStart"/>
+      <w:r>
+        <w:rPr>
+          <w:rStyle w:val="hljs-keyword"/>
+        </w:rPr>
+        <w:t>const</w:t>
+      </w:r>
+      <w:proofErr w:type="spellEnd"/>
+      <w:proofErr w:type="gramEnd"/>
+      <w:r>
+        <w:rPr>
+          <w:rStyle w:val="HTMLCode"/>
+        </w:rPr>
+        <w:t xml:space="preserve"> response = </w:t>
+      </w:r>
+      <w:r>
+        <w:rPr>
+          <w:rStyle w:val="hljs-keyword"/>
+        </w:rPr>
+        <w:t>await</w:t>
+      </w:r>
+      <w:r>
+        <w:rPr>
+          <w:rStyle w:val="HTMLCode"/>
+        </w:rPr>
+        <w:t xml:space="preserve"> </w:t>
+      </w:r>
+      <w:proofErr w:type="spellStart"/>
+      <w:r>
+        <w:rPr>
+          <w:rStyle w:val="HTMLCode"/>
+        </w:rPr>
+        <w:t>axios.post</w:t>
+      </w:r>
+      <w:proofErr w:type="spellEnd"/>
+      <w:r>
+        <w:rPr>
+          <w:rStyle w:val="HTMLCode"/>
+        </w:rPr>
+        <w:t>(</w:t>
+      </w:r>
+      <w:r>
+        <w:rPr>
+          <w:rStyle w:val="hljs-string"/>
+        </w:rPr>
+        <w:t>`http://localhost:8000/process...`</w:t>
+      </w:r>
+      <w:r>
+        <w:rPr>
+          <w:rStyle w:val="HTMLCode"/>
+        </w:rPr>
+        <w:t>)</w:t>
+      </w:r>
+    </w:p>
+    <w:p>
+      <w:pPr>
+        <w:pStyle w:val="HTMLPreformatted"/>
+        <w:rPr>
+          <w:rStyle w:val="HTMLCode"/>
+        </w:rPr>
+      </w:pPr>
+    </w:p>
+    <w:p>
+      <w:pPr>
+        <w:pStyle w:val="HTMLPreformatted"/>
+        <w:rPr>
+          <w:rStyle w:val="HTMLCode"/>
+        </w:rPr>
+      </w:pPr>
+      <w:r>
+        <w:rPr>
+          <w:rStyle w:val="hljs-comment"/>
+        </w:rPr>
+        <w:t>// To this:</w:t>
+      </w:r>
+    </w:p>
+    <w:p>
+      <w:pPr>
+        <w:pStyle w:val="HTMLPreformatted"/>
+        <w:rPr>
+          <w:rStyle w:val="HTMLCode"/>
+        </w:rPr>
+      </w:pPr>
+      <w:proofErr w:type="spellStart"/>
+      <w:proofErr w:type="gramStart"/>
+      <w:r>
+        <w:rPr>
+          <w:rStyle w:val="hljs-keyword"/>
+        </w:rPr>
+        <w:t>const</w:t>
+      </w:r>
+      <w:proofErr w:type="spellEnd"/>
+      <w:proofErr w:type="gramEnd"/>
+      <w:r>
+        <w:rPr>
+          <w:rStyle w:val="HTMLCode"/>
+        </w:rPr>
+        <w:t xml:space="preserve"> PYTHON_URL = </w:t>
+      </w:r>
+      <w:proofErr w:type="spellStart"/>
+      <w:r>
+        <w:rPr>
+          <w:rStyle w:val="HTMLCode"/>
+        </w:rPr>
+        <w:t>process.env.PYTHON_SERVICE_URL</w:t>
+      </w:r>
+      <w:proofErr w:type="spellEnd"/>
+      <w:r>
+        <w:rPr>
+          <w:rStyle w:val="HTMLCode"/>
+        </w:rPr>
+        <w:t xml:space="preserve"> || </w:t>
+      </w:r>
+      <w:r>
+        <w:rPr>
+          <w:rStyle w:val="hljs-string"/>
+        </w:rPr>
+        <w:t>"http://localhost:8000"</w:t>
+      </w:r>
+      <w:r>
+        <w:rPr>
+          <w:rStyle w:val="HTMLCode"/>
+        </w:rPr>
+        <w:t>;</w:t>
+      </w:r>
+    </w:p>
+    <w:p>
+      <w:pPr>
+        <w:pStyle w:val="HTMLPreformatted"/>
+        <w:rPr>
+          <w:rStyle w:val="HTMLCode"/>
+        </w:rPr>
+      </w:pPr>
+      <w:proofErr w:type="spellStart"/>
+      <w:proofErr w:type="gramStart"/>
+      <w:r>
+        <w:rPr>
+          <w:rStyle w:val="hljs-keyword"/>
+        </w:rPr>
+        <w:t>const</w:t>
+      </w:r>
+      <w:proofErr w:type="spellEnd"/>
+      <w:proofErr w:type="gramEnd"/>
+      <w:r>
+        <w:rPr>
+          <w:rStyle w:val="HTMLCode"/>
+        </w:rPr>
+        <w:t xml:space="preserve"> response = </w:t>
+      </w:r>
+      <w:r>
+        <w:rPr>
+          <w:rStyle w:val="hljs-keyword"/>
+        </w:rPr>
+        <w:t>await</w:t>
+      </w:r>
+      <w:r>
+        <w:rPr>
+          <w:rStyle w:val="HTMLCode"/>
+        </w:rPr>
+        <w:t xml:space="preserve"> </w:t>
+      </w:r>
+      <w:proofErr w:type="spellStart"/>
+      <w:r>
+        <w:rPr>
+          <w:rStyle w:val="HTMLCode"/>
+        </w:rPr>
+        <w:t>axios.post</w:t>
+      </w:r>
+      <w:proofErr w:type="spellEnd"/>
+      <w:r>
+        <w:rPr>
+          <w:rStyle w:val="HTMLCode"/>
+        </w:rPr>
+        <w:t>(</w:t>
+      </w:r>
+      <w:r>
+        <w:rPr>
+          <w:rStyle w:val="hljs-string"/>
+        </w:rPr>
+        <w:t>`</w:t>
+      </w:r>
+      <w:r>
+        <w:rPr>
+          <w:rStyle w:val="hljs-subst"/>
+        </w:rPr>
+        <w:t>${PYTHON_URL}</w:t>
+      </w:r>
+      <w:r>
+        <w:rPr>
+          <w:rStyle w:val="hljs-string"/>
+        </w:rPr>
+        <w:t>/process...`</w:t>
+      </w:r>
+      <w:r>
+        <w:rPr>
+          <w:rStyle w:val="HTMLCode"/>
+        </w:rPr>
+        <w:t>)</w:t>
+      </w:r>
+    </w:p>
+    <w:p>
+      <w:pPr>
+        <w:pStyle w:val="NormalWeb"/>
+      </w:pPr>
+      <w:r>
+        <w:rPr>
+          <w:b/>
+          <w:bCs/>
+        </w:rPr>
+        <w:t>B. The "Timeout" Trap (</w:t>
+      </w:r>
+      <w:r>
+        <w:rPr>
+          <w:rStyle w:val="HTMLCode"/>
+          <w:b/>
+          <w:bCs/>
+        </w:rPr>
+        <w:t>uploadControllers.js</w:t>
+      </w:r>
+      <w:r>
+        <w:rPr>
+          <w:b/>
+          <w:bCs/>
+        </w:rPr>
+        <w:t>)</w:t>
+      </w:r>
+      <w:r>
+        <w:t xml:space="preserve"> </w:t>
+      </w:r>
+      <w:proofErr w:type="gramStart"/>
+      <w:r>
+        <w:t>Currently</w:t>
+      </w:r>
+      <w:proofErr w:type="gramEnd"/>
+      <w:r>
+        <w:t xml:space="preserve">, when a user uploads a PDF, Node.js waits for Python to finish chunking, calling the LLM multiple times, and saving to </w:t>
+      </w:r>
+      <w:proofErr w:type="spellStart"/>
+      <w:r>
+        <w:t>ChromaDB</w:t>
+      </w:r>
+      <w:proofErr w:type="spellEnd"/>
+      <w:r>
+        <w:t xml:space="preserve"> before it sends a response back to React. If a user uploads a 50-page PDF, this process will take 2+ minutes. Standard HTTP connections time out after 60 seconds, so the frontend will crash with a "Network Error", even if Python successfully finishes later.</w:t>
+      </w:r>
+    </w:p>
+    <w:p>
+      <w:pPr>
+        <w:pStyle w:val="NormalWeb"/>
+        <w:numPr>
+          <w:ilvl w:val="0"/>
+          <w:numId w:val="22"/>
+        </w:numPr>
+      </w:pPr>
+      <w:r>
+        <w:rPr>
+          <w:b/>
+          <w:bCs/>
+        </w:rPr>
+        <w:t>The Fix (Advanced):</w:t>
+      </w:r>
+      <w:r>
+        <w:t xml:space="preserve"> In the future, you should switch to an </w:t>
+      </w:r>
+      <w:r>
+        <w:rPr>
+          <w:b/>
+          <w:bCs/>
+        </w:rPr>
+        <w:t>Asynchronous Queue</w:t>
+      </w:r>
+      <w:r>
+        <w:t xml:space="preserve">. Node.js should immediately reply: </w:t>
+      </w:r>
+      <w:proofErr w:type="gramStart"/>
+      <w:r>
+        <w:rPr>
+          <w:rStyle w:val="HTMLCode"/>
+        </w:rPr>
+        <w:t>{ message</w:t>
+      </w:r>
+      <w:proofErr w:type="gramEnd"/>
+      <w:r>
+        <w:rPr>
+          <w:rStyle w:val="HTMLCode"/>
+        </w:rPr>
+        <w:t>: "Upload received. Processing in background...</w:t>
+      </w:r>
+      <w:proofErr w:type="gramStart"/>
+      <w:r>
+        <w:rPr>
+          <w:rStyle w:val="HTMLCode"/>
+        </w:rPr>
+        <w:t>" }</w:t>
+      </w:r>
+      <w:proofErr w:type="gramEnd"/>
+      <w:r>
+        <w:t xml:space="preserve">. You can then use </w:t>
+      </w:r>
+      <w:proofErr w:type="spellStart"/>
+      <w:r>
+        <w:t>WebSockets</w:t>
+      </w:r>
+      <w:proofErr w:type="spellEnd"/>
+      <w:r>
+        <w:t xml:space="preserve"> (Socket.io) to tell React when it's finally done so the UI can update!</w:t>
+      </w:r>
     </w:p>
     <w:p/>
     <w:sectPr>
@@ -2756,6 +5370,304 @@
 <file path=word/numbering.xml><?xml version="1.0" encoding="utf-8"?>
 <w:numbering xmlns:wpc="http://schemas.microsoft.com/office/word/2010/wordprocessingCanvas" xmlns:mc="http://schemas.openxmlformats.org/markup-compatibility/2006" xmlns:o="urn:schemas-microsoft-com:office:office" xmlns:r="http://schemas.openxmlformats.org/officeDocument/2006/relationships" xmlns:m="http://schemas.openxmlformats.org/officeDocument/2006/math" xmlns:v="urn:schemas-microsoft-com:vml" xmlns:wp14="http://schemas.microsoft.com/office/word/2010/wordprocessingDrawing" xmlns:wp="http://schemas.openxmlformats.org/drawingml/2006/wordprocessingDrawing" xmlns:w10="urn:schemas-microsoft-com:office:word" xmlns:w="http://schemas.openxmlformats.org/wordprocessingml/2006/main" xmlns:w14="http://schemas.microsoft.com/office/word/2010/wordml" xmlns:w15="http://schemas.microsoft.com/office/word/2012/wordml" xmlns:wpg="http://schemas.microsoft.com/office/word/2010/wordprocessingGroup" xmlns:wpi="http://schemas.microsoft.com/office/word/2010/wordprocessingInk" xmlns:wne="http://schemas.microsoft.com/office/word/2006/wordml" xmlns:wps="http://schemas.microsoft.com/office/word/2010/wordprocessingShape" mc:Ignorable="w14 w15 wp14">
   <w:abstractNum w:abstractNumId="0" w15:restartNumberingAfterBreak="0">
+    <w:nsid w:val="03173817"/>
+    <w:multiLevelType w:val="multilevel"/>
+    <w:tmpl w:val="329E2CBE"/>
+    <w:lvl w:ilvl="0">
+      <w:start w:val="1"/>
+      <w:numFmt w:val="bullet"/>
+      <w:lvlText w:val=""/>
+      <w:lvlJc w:val="left"/>
+      <w:pPr>
+        <w:tabs>
+          <w:tab w:val="num" w:pos="720"/>
+        </w:tabs>
+        <w:ind w:left="720" w:hanging="360"/>
+      </w:pPr>
+      <w:rPr>
+        <w:rFonts w:ascii="Symbol" w:hAnsi="Symbol" w:hint="default"/>
+        <w:sz w:val="20"/>
+      </w:rPr>
+    </w:lvl>
+    <w:lvl w:ilvl="1" w:tentative="1">
+      <w:start w:val="1"/>
+      <w:numFmt w:val="bullet"/>
+      <w:lvlText w:val="o"/>
+      <w:lvlJc w:val="left"/>
+      <w:pPr>
+        <w:tabs>
+          <w:tab w:val="num" w:pos="1440"/>
+        </w:tabs>
+        <w:ind w:left="1440" w:hanging="360"/>
+      </w:pPr>
+      <w:rPr>
+        <w:rFonts w:ascii="Courier New" w:hAnsi="Courier New" w:hint="default"/>
+        <w:sz w:val="20"/>
+      </w:rPr>
+    </w:lvl>
+    <w:lvl w:ilvl="2" w:tentative="1">
+      <w:start w:val="1"/>
+      <w:numFmt w:val="bullet"/>
+      <w:lvlText w:val=""/>
+      <w:lvlJc w:val="left"/>
+      <w:pPr>
+        <w:tabs>
+          <w:tab w:val="num" w:pos="2160"/>
+        </w:tabs>
+        <w:ind w:left="2160" w:hanging="360"/>
+      </w:pPr>
+      <w:rPr>
+        <w:rFonts w:ascii="Wingdings" w:hAnsi="Wingdings" w:hint="default"/>
+        <w:sz w:val="20"/>
+      </w:rPr>
+    </w:lvl>
+    <w:lvl w:ilvl="3" w:tentative="1">
+      <w:start w:val="1"/>
+      <w:numFmt w:val="bullet"/>
+      <w:lvlText w:val=""/>
+      <w:lvlJc w:val="left"/>
+      <w:pPr>
+        <w:tabs>
+          <w:tab w:val="num" w:pos="2880"/>
+        </w:tabs>
+        <w:ind w:left="2880" w:hanging="360"/>
+      </w:pPr>
+      <w:rPr>
+        <w:rFonts w:ascii="Wingdings" w:hAnsi="Wingdings" w:hint="default"/>
+        <w:sz w:val="20"/>
+      </w:rPr>
+    </w:lvl>
+    <w:lvl w:ilvl="4" w:tentative="1">
+      <w:start w:val="1"/>
+      <w:numFmt w:val="bullet"/>
+      <w:lvlText w:val=""/>
+      <w:lvlJc w:val="left"/>
+      <w:pPr>
+        <w:tabs>
+          <w:tab w:val="num" w:pos="3600"/>
+        </w:tabs>
+        <w:ind w:left="3600" w:hanging="360"/>
+      </w:pPr>
+      <w:rPr>
+        <w:rFonts w:ascii="Wingdings" w:hAnsi="Wingdings" w:hint="default"/>
+        <w:sz w:val="20"/>
+      </w:rPr>
+    </w:lvl>
+    <w:lvl w:ilvl="5" w:tentative="1">
+      <w:start w:val="1"/>
+      <w:numFmt w:val="bullet"/>
+      <w:lvlText w:val=""/>
+      <w:lvlJc w:val="left"/>
+      <w:pPr>
+        <w:tabs>
+          <w:tab w:val="num" w:pos="4320"/>
+        </w:tabs>
+        <w:ind w:left="4320" w:hanging="360"/>
+      </w:pPr>
+      <w:rPr>
+        <w:rFonts w:ascii="Wingdings" w:hAnsi="Wingdings" w:hint="default"/>
+        <w:sz w:val="20"/>
+      </w:rPr>
+    </w:lvl>
+    <w:lvl w:ilvl="6" w:tentative="1">
+      <w:start w:val="1"/>
+      <w:numFmt w:val="bullet"/>
+      <w:lvlText w:val=""/>
+      <w:lvlJc w:val="left"/>
+      <w:pPr>
+        <w:tabs>
+          <w:tab w:val="num" w:pos="5040"/>
+        </w:tabs>
+        <w:ind w:left="5040" w:hanging="360"/>
+      </w:pPr>
+      <w:rPr>
+        <w:rFonts w:ascii="Wingdings" w:hAnsi="Wingdings" w:hint="default"/>
+        <w:sz w:val="20"/>
+      </w:rPr>
+    </w:lvl>
+    <w:lvl w:ilvl="7" w:tentative="1">
+      <w:start w:val="1"/>
+      <w:numFmt w:val="bullet"/>
+      <w:lvlText w:val=""/>
+      <w:lvlJc w:val="left"/>
+      <w:pPr>
+        <w:tabs>
+          <w:tab w:val="num" w:pos="5760"/>
+        </w:tabs>
+        <w:ind w:left="5760" w:hanging="360"/>
+      </w:pPr>
+      <w:rPr>
+        <w:rFonts w:ascii="Wingdings" w:hAnsi="Wingdings" w:hint="default"/>
+        <w:sz w:val="20"/>
+      </w:rPr>
+    </w:lvl>
+    <w:lvl w:ilvl="8" w:tentative="1">
+      <w:start w:val="1"/>
+      <w:numFmt w:val="bullet"/>
+      <w:lvlText w:val=""/>
+      <w:lvlJc w:val="left"/>
+      <w:pPr>
+        <w:tabs>
+          <w:tab w:val="num" w:pos="6480"/>
+        </w:tabs>
+        <w:ind w:left="6480" w:hanging="360"/>
+      </w:pPr>
+      <w:rPr>
+        <w:rFonts w:ascii="Wingdings" w:hAnsi="Wingdings" w:hint="default"/>
+        <w:sz w:val="20"/>
+      </w:rPr>
+    </w:lvl>
+  </w:abstractNum>
+  <w:abstractNum w:abstractNumId="1" w15:restartNumberingAfterBreak="0">
+    <w:nsid w:val="0C9268E1"/>
+    <w:multiLevelType w:val="multilevel"/>
+    <w:tmpl w:val="960832F8"/>
+    <w:lvl w:ilvl="0">
+      <w:start w:val="1"/>
+      <w:numFmt w:val="bullet"/>
+      <w:lvlText w:val=""/>
+      <w:lvlJc w:val="left"/>
+      <w:pPr>
+        <w:tabs>
+          <w:tab w:val="num" w:pos="720"/>
+        </w:tabs>
+        <w:ind w:left="720" w:hanging="360"/>
+      </w:pPr>
+      <w:rPr>
+        <w:rFonts w:ascii="Symbol" w:hAnsi="Symbol" w:hint="default"/>
+        <w:sz w:val="20"/>
+      </w:rPr>
+    </w:lvl>
+    <w:lvl w:ilvl="1" w:tentative="1">
+      <w:start w:val="1"/>
+      <w:numFmt w:val="bullet"/>
+      <w:lvlText w:val="o"/>
+      <w:lvlJc w:val="left"/>
+      <w:pPr>
+        <w:tabs>
+          <w:tab w:val="num" w:pos="1440"/>
+        </w:tabs>
+        <w:ind w:left="1440" w:hanging="360"/>
+      </w:pPr>
+      <w:rPr>
+        <w:rFonts w:ascii="Courier New" w:hAnsi="Courier New" w:hint="default"/>
+        <w:sz w:val="20"/>
+      </w:rPr>
+    </w:lvl>
+    <w:lvl w:ilvl="2" w:tentative="1">
+      <w:start w:val="1"/>
+      <w:numFmt w:val="bullet"/>
+      <w:lvlText w:val=""/>
+      <w:lvlJc w:val="left"/>
+      <w:pPr>
+        <w:tabs>
+          <w:tab w:val="num" w:pos="2160"/>
+        </w:tabs>
+        <w:ind w:left="2160" w:hanging="360"/>
+      </w:pPr>
+      <w:rPr>
+        <w:rFonts w:ascii="Wingdings" w:hAnsi="Wingdings" w:hint="default"/>
+        <w:sz w:val="20"/>
+      </w:rPr>
+    </w:lvl>
+    <w:lvl w:ilvl="3" w:tentative="1">
+      <w:start w:val="1"/>
+      <w:numFmt w:val="bullet"/>
+      <w:lvlText w:val=""/>
+      <w:lvlJc w:val="left"/>
+      <w:pPr>
+        <w:tabs>
+          <w:tab w:val="num" w:pos="2880"/>
+        </w:tabs>
+        <w:ind w:left="2880" w:hanging="360"/>
+      </w:pPr>
+      <w:rPr>
+        <w:rFonts w:ascii="Wingdings" w:hAnsi="Wingdings" w:hint="default"/>
+        <w:sz w:val="20"/>
+      </w:rPr>
+    </w:lvl>
+    <w:lvl w:ilvl="4" w:tentative="1">
+      <w:start w:val="1"/>
+      <w:numFmt w:val="bullet"/>
+      <w:lvlText w:val=""/>
+      <w:lvlJc w:val="left"/>
+      <w:pPr>
+        <w:tabs>
+          <w:tab w:val="num" w:pos="3600"/>
+        </w:tabs>
+        <w:ind w:left="3600" w:hanging="360"/>
+      </w:pPr>
+      <w:rPr>
+        <w:rFonts w:ascii="Wingdings" w:hAnsi="Wingdings" w:hint="default"/>
+        <w:sz w:val="20"/>
+      </w:rPr>
+    </w:lvl>
+    <w:lvl w:ilvl="5" w:tentative="1">
+      <w:start w:val="1"/>
+      <w:numFmt w:val="bullet"/>
+      <w:lvlText w:val=""/>
+      <w:lvlJc w:val="left"/>
+      <w:pPr>
+        <w:tabs>
+          <w:tab w:val="num" w:pos="4320"/>
+        </w:tabs>
+        <w:ind w:left="4320" w:hanging="360"/>
+      </w:pPr>
+      <w:rPr>
+        <w:rFonts w:ascii="Wingdings" w:hAnsi="Wingdings" w:hint="default"/>
+        <w:sz w:val="20"/>
+      </w:rPr>
+    </w:lvl>
+    <w:lvl w:ilvl="6" w:tentative="1">
+      <w:start w:val="1"/>
+      <w:numFmt w:val="bullet"/>
+      <w:lvlText w:val=""/>
+      <w:lvlJc w:val="left"/>
+      <w:pPr>
+        <w:tabs>
+          <w:tab w:val="num" w:pos="5040"/>
+        </w:tabs>
+        <w:ind w:left="5040" w:hanging="360"/>
+      </w:pPr>
+      <w:rPr>
+        <w:rFonts w:ascii="Wingdings" w:hAnsi="Wingdings" w:hint="default"/>
+        <w:sz w:val="20"/>
+      </w:rPr>
+    </w:lvl>
+    <w:lvl w:ilvl="7" w:tentative="1">
+      <w:start w:val="1"/>
+      <w:numFmt w:val="bullet"/>
+      <w:lvlText w:val=""/>
+      <w:lvlJc w:val="left"/>
+      <w:pPr>
+        <w:tabs>
+          <w:tab w:val="num" w:pos="5760"/>
+        </w:tabs>
+        <w:ind w:left="5760" w:hanging="360"/>
+      </w:pPr>
+      <w:rPr>
+        <w:rFonts w:ascii="Wingdings" w:hAnsi="Wingdings" w:hint="default"/>
+        <w:sz w:val="20"/>
+      </w:rPr>
+    </w:lvl>
+    <w:lvl w:ilvl="8" w:tentative="1">
+      <w:start w:val="1"/>
+      <w:numFmt w:val="bullet"/>
+      <w:lvlText w:val=""/>
+      <w:lvlJc w:val="left"/>
+      <w:pPr>
+        <w:tabs>
+          <w:tab w:val="num" w:pos="6480"/>
+        </w:tabs>
+        <w:ind w:left="6480" w:hanging="360"/>
+      </w:pPr>
+      <w:rPr>
+        <w:rFonts w:ascii="Wingdings" w:hAnsi="Wingdings" w:hint="default"/>
+        <w:sz w:val="20"/>
+      </w:rPr>
+    </w:lvl>
+  </w:abstractNum>
+  <w:abstractNum w:abstractNumId="2" w15:restartNumberingAfterBreak="0">
     <w:nsid w:val="12823A34"/>
     <w:multiLevelType w:val="multilevel"/>
     <w:tmpl w:val="2C3ECF04"/>
@@ -2904,7 +5816,7 @@
       </w:rPr>
     </w:lvl>
   </w:abstractNum>
-  <w:abstractNum w:abstractNumId="1" w15:restartNumberingAfterBreak="0">
+  <w:abstractNum w:abstractNumId="3" w15:restartNumberingAfterBreak="0">
     <w:nsid w:val="14873263"/>
     <w:multiLevelType w:val="multilevel"/>
     <w:tmpl w:val="8A880600"/>
@@ -3053,7 +5965,7 @@
       </w:rPr>
     </w:lvl>
   </w:abstractNum>
-  <w:abstractNum w:abstractNumId="2" w15:restartNumberingAfterBreak="0">
+  <w:abstractNum w:abstractNumId="4" w15:restartNumberingAfterBreak="0">
     <w:nsid w:val="22D20861"/>
     <w:multiLevelType w:val="multilevel"/>
     <w:tmpl w:val="4D86A064"/>
@@ -3202,7 +6114,7 @@
       </w:rPr>
     </w:lvl>
   </w:abstractNum>
-  <w:abstractNum w:abstractNumId="3" w15:restartNumberingAfterBreak="0">
+  <w:abstractNum w:abstractNumId="5" w15:restartNumberingAfterBreak="0">
     <w:nsid w:val="3CBF27E1"/>
     <w:multiLevelType w:val="multilevel"/>
     <w:tmpl w:val="1AD6E32C"/>
@@ -3319,7 +6231,7 @@
       </w:pPr>
     </w:lvl>
   </w:abstractNum>
-  <w:abstractNum w:abstractNumId="4" w15:restartNumberingAfterBreak="0">
+  <w:abstractNum w:abstractNumId="6" w15:restartNumberingAfterBreak="0">
     <w:nsid w:val="3D774E9A"/>
     <w:multiLevelType w:val="multilevel"/>
     <w:tmpl w:val="708C0E96"/>
@@ -3468,7 +6380,156 @@
       </w:rPr>
     </w:lvl>
   </w:abstractNum>
-  <w:abstractNum w:abstractNumId="5" w15:restartNumberingAfterBreak="0">
+  <w:abstractNum w:abstractNumId="7" w15:restartNumberingAfterBreak="0">
+    <w:nsid w:val="3DD66A9E"/>
+    <w:multiLevelType w:val="multilevel"/>
+    <w:tmpl w:val="16BEF300"/>
+    <w:lvl w:ilvl="0">
+      <w:start w:val="1"/>
+      <w:numFmt w:val="bullet"/>
+      <w:lvlText w:val=""/>
+      <w:lvlJc w:val="left"/>
+      <w:pPr>
+        <w:tabs>
+          <w:tab w:val="num" w:pos="720"/>
+        </w:tabs>
+        <w:ind w:left="720" w:hanging="360"/>
+      </w:pPr>
+      <w:rPr>
+        <w:rFonts w:ascii="Symbol" w:hAnsi="Symbol" w:hint="default"/>
+        <w:sz w:val="20"/>
+      </w:rPr>
+    </w:lvl>
+    <w:lvl w:ilvl="1" w:tentative="1">
+      <w:start w:val="1"/>
+      <w:numFmt w:val="bullet"/>
+      <w:lvlText w:val="o"/>
+      <w:lvlJc w:val="left"/>
+      <w:pPr>
+        <w:tabs>
+          <w:tab w:val="num" w:pos="1440"/>
+        </w:tabs>
+        <w:ind w:left="1440" w:hanging="360"/>
+      </w:pPr>
+      <w:rPr>
+        <w:rFonts w:ascii="Courier New" w:hAnsi="Courier New" w:hint="default"/>
+        <w:sz w:val="20"/>
+      </w:rPr>
+    </w:lvl>
+    <w:lvl w:ilvl="2" w:tentative="1">
+      <w:start w:val="1"/>
+      <w:numFmt w:val="bullet"/>
+      <w:lvlText w:val=""/>
+      <w:lvlJc w:val="left"/>
+      <w:pPr>
+        <w:tabs>
+          <w:tab w:val="num" w:pos="2160"/>
+        </w:tabs>
+        <w:ind w:left="2160" w:hanging="360"/>
+      </w:pPr>
+      <w:rPr>
+        <w:rFonts w:ascii="Wingdings" w:hAnsi="Wingdings" w:hint="default"/>
+        <w:sz w:val="20"/>
+      </w:rPr>
+    </w:lvl>
+    <w:lvl w:ilvl="3" w:tentative="1">
+      <w:start w:val="1"/>
+      <w:numFmt w:val="bullet"/>
+      <w:lvlText w:val=""/>
+      <w:lvlJc w:val="left"/>
+      <w:pPr>
+        <w:tabs>
+          <w:tab w:val="num" w:pos="2880"/>
+        </w:tabs>
+        <w:ind w:left="2880" w:hanging="360"/>
+      </w:pPr>
+      <w:rPr>
+        <w:rFonts w:ascii="Wingdings" w:hAnsi="Wingdings" w:hint="default"/>
+        <w:sz w:val="20"/>
+      </w:rPr>
+    </w:lvl>
+    <w:lvl w:ilvl="4" w:tentative="1">
+      <w:start w:val="1"/>
+      <w:numFmt w:val="bullet"/>
+      <w:lvlText w:val=""/>
+      <w:lvlJc w:val="left"/>
+      <w:pPr>
+        <w:tabs>
+          <w:tab w:val="num" w:pos="3600"/>
+        </w:tabs>
+        <w:ind w:left="3600" w:hanging="360"/>
+      </w:pPr>
+      <w:rPr>
+        <w:rFonts w:ascii="Wingdings" w:hAnsi="Wingdings" w:hint="default"/>
+        <w:sz w:val="20"/>
+      </w:rPr>
+    </w:lvl>
+    <w:lvl w:ilvl="5" w:tentative="1">
+      <w:start w:val="1"/>
+      <w:numFmt w:val="bullet"/>
+      <w:lvlText w:val=""/>
+      <w:lvlJc w:val="left"/>
+      <w:pPr>
+        <w:tabs>
+          <w:tab w:val="num" w:pos="4320"/>
+        </w:tabs>
+        <w:ind w:left="4320" w:hanging="360"/>
+      </w:pPr>
+      <w:rPr>
+        <w:rFonts w:ascii="Wingdings" w:hAnsi="Wingdings" w:hint="default"/>
+        <w:sz w:val="20"/>
+      </w:rPr>
+    </w:lvl>
+    <w:lvl w:ilvl="6" w:tentative="1">
+      <w:start w:val="1"/>
+      <w:numFmt w:val="bullet"/>
+      <w:lvlText w:val=""/>
+      <w:lvlJc w:val="left"/>
+      <w:pPr>
+        <w:tabs>
+          <w:tab w:val="num" w:pos="5040"/>
+        </w:tabs>
+        <w:ind w:left="5040" w:hanging="360"/>
+      </w:pPr>
+      <w:rPr>
+        <w:rFonts w:ascii="Wingdings" w:hAnsi="Wingdings" w:hint="default"/>
+        <w:sz w:val="20"/>
+      </w:rPr>
+    </w:lvl>
+    <w:lvl w:ilvl="7" w:tentative="1">
+      <w:start w:val="1"/>
+      <w:numFmt w:val="bullet"/>
+      <w:lvlText w:val=""/>
+      <w:lvlJc w:val="left"/>
+      <w:pPr>
+        <w:tabs>
+          <w:tab w:val="num" w:pos="5760"/>
+        </w:tabs>
+        <w:ind w:left="5760" w:hanging="360"/>
+      </w:pPr>
+      <w:rPr>
+        <w:rFonts w:ascii="Wingdings" w:hAnsi="Wingdings" w:hint="default"/>
+        <w:sz w:val="20"/>
+      </w:rPr>
+    </w:lvl>
+    <w:lvl w:ilvl="8" w:tentative="1">
+      <w:start w:val="1"/>
+      <w:numFmt w:val="bullet"/>
+      <w:lvlText w:val=""/>
+      <w:lvlJc w:val="left"/>
+      <w:pPr>
+        <w:tabs>
+          <w:tab w:val="num" w:pos="6480"/>
+        </w:tabs>
+        <w:ind w:left="6480" w:hanging="360"/>
+      </w:pPr>
+      <w:rPr>
+        <w:rFonts w:ascii="Wingdings" w:hAnsi="Wingdings" w:hint="default"/>
+        <w:sz w:val="20"/>
+      </w:rPr>
+    </w:lvl>
+  </w:abstractNum>
+  <w:abstractNum w:abstractNumId="8" w15:restartNumberingAfterBreak="0">
     <w:nsid w:val="3E7123D5"/>
     <w:multiLevelType w:val="multilevel"/>
     <w:tmpl w:val="B1BE527E"/>
@@ -3617,7 +6678,7 @@
       </w:rPr>
     </w:lvl>
   </w:abstractNum>
-  <w:abstractNum w:abstractNumId="6" w15:restartNumberingAfterBreak="0">
+  <w:abstractNum w:abstractNumId="9" w15:restartNumberingAfterBreak="0">
     <w:nsid w:val="417601BE"/>
     <w:multiLevelType w:val="multilevel"/>
     <w:tmpl w:val="2D4AC106"/>
@@ -3766,7 +6827,7 @@
       </w:rPr>
     </w:lvl>
   </w:abstractNum>
-  <w:abstractNum w:abstractNumId="7" w15:restartNumberingAfterBreak="0">
+  <w:abstractNum w:abstractNumId="10" w15:restartNumberingAfterBreak="0">
     <w:nsid w:val="446B0A61"/>
     <w:multiLevelType w:val="multilevel"/>
     <w:tmpl w:val="B3CC4FA2"/>
@@ -3915,7 +6976,7 @@
       </w:rPr>
     </w:lvl>
   </w:abstractNum>
-  <w:abstractNum w:abstractNumId="8" w15:restartNumberingAfterBreak="0">
+  <w:abstractNum w:abstractNumId="11" w15:restartNumberingAfterBreak="0">
     <w:nsid w:val="461567C6"/>
     <w:multiLevelType w:val="multilevel"/>
     <w:tmpl w:val="DA987604"/>
@@ -4032,7 +7093,7 @@
       </w:pPr>
     </w:lvl>
   </w:abstractNum>
-  <w:abstractNum w:abstractNumId="9" w15:restartNumberingAfterBreak="0">
+  <w:abstractNum w:abstractNumId="12" w15:restartNumberingAfterBreak="0">
     <w:nsid w:val="5B9814EA"/>
     <w:multiLevelType w:val="multilevel"/>
     <w:tmpl w:val="FC9EC6E8"/>
@@ -4181,7 +7242,603 @@
       </w:rPr>
     </w:lvl>
   </w:abstractNum>
-  <w:abstractNum w:abstractNumId="10" w15:restartNumberingAfterBreak="0">
+  <w:abstractNum w:abstractNumId="13" w15:restartNumberingAfterBreak="0">
+    <w:nsid w:val="62563652"/>
+    <w:multiLevelType w:val="multilevel"/>
+    <w:tmpl w:val="495A8D4A"/>
+    <w:lvl w:ilvl="0">
+      <w:start w:val="1"/>
+      <w:numFmt w:val="bullet"/>
+      <w:lvlText w:val=""/>
+      <w:lvlJc w:val="left"/>
+      <w:pPr>
+        <w:tabs>
+          <w:tab w:val="num" w:pos="720"/>
+        </w:tabs>
+        <w:ind w:left="720" w:hanging="360"/>
+      </w:pPr>
+      <w:rPr>
+        <w:rFonts w:ascii="Symbol" w:hAnsi="Symbol" w:hint="default"/>
+        <w:sz w:val="20"/>
+      </w:rPr>
+    </w:lvl>
+    <w:lvl w:ilvl="1" w:tentative="1">
+      <w:start w:val="1"/>
+      <w:numFmt w:val="bullet"/>
+      <w:lvlText w:val="o"/>
+      <w:lvlJc w:val="left"/>
+      <w:pPr>
+        <w:tabs>
+          <w:tab w:val="num" w:pos="1440"/>
+        </w:tabs>
+        <w:ind w:left="1440" w:hanging="360"/>
+      </w:pPr>
+      <w:rPr>
+        <w:rFonts w:ascii="Courier New" w:hAnsi="Courier New" w:hint="default"/>
+        <w:sz w:val="20"/>
+      </w:rPr>
+    </w:lvl>
+    <w:lvl w:ilvl="2" w:tentative="1">
+      <w:start w:val="1"/>
+      <w:numFmt w:val="bullet"/>
+      <w:lvlText w:val=""/>
+      <w:lvlJc w:val="left"/>
+      <w:pPr>
+        <w:tabs>
+          <w:tab w:val="num" w:pos="2160"/>
+        </w:tabs>
+        <w:ind w:left="2160" w:hanging="360"/>
+      </w:pPr>
+      <w:rPr>
+        <w:rFonts w:ascii="Wingdings" w:hAnsi="Wingdings" w:hint="default"/>
+        <w:sz w:val="20"/>
+      </w:rPr>
+    </w:lvl>
+    <w:lvl w:ilvl="3" w:tentative="1">
+      <w:start w:val="1"/>
+      <w:numFmt w:val="bullet"/>
+      <w:lvlText w:val=""/>
+      <w:lvlJc w:val="left"/>
+      <w:pPr>
+        <w:tabs>
+          <w:tab w:val="num" w:pos="2880"/>
+        </w:tabs>
+        <w:ind w:left="2880" w:hanging="360"/>
+      </w:pPr>
+      <w:rPr>
+        <w:rFonts w:ascii="Wingdings" w:hAnsi="Wingdings" w:hint="default"/>
+        <w:sz w:val="20"/>
+      </w:rPr>
+    </w:lvl>
+    <w:lvl w:ilvl="4" w:tentative="1">
+      <w:start w:val="1"/>
+      <w:numFmt w:val="bullet"/>
+      <w:lvlText w:val=""/>
+      <w:lvlJc w:val="left"/>
+      <w:pPr>
+        <w:tabs>
+          <w:tab w:val="num" w:pos="3600"/>
+        </w:tabs>
+        <w:ind w:left="3600" w:hanging="360"/>
+      </w:pPr>
+      <w:rPr>
+        <w:rFonts w:ascii="Wingdings" w:hAnsi="Wingdings" w:hint="default"/>
+        <w:sz w:val="20"/>
+      </w:rPr>
+    </w:lvl>
+    <w:lvl w:ilvl="5" w:tentative="1">
+      <w:start w:val="1"/>
+      <w:numFmt w:val="bullet"/>
+      <w:lvlText w:val=""/>
+      <w:lvlJc w:val="left"/>
+      <w:pPr>
+        <w:tabs>
+          <w:tab w:val="num" w:pos="4320"/>
+        </w:tabs>
+        <w:ind w:left="4320" w:hanging="360"/>
+      </w:pPr>
+      <w:rPr>
+        <w:rFonts w:ascii="Wingdings" w:hAnsi="Wingdings" w:hint="default"/>
+        <w:sz w:val="20"/>
+      </w:rPr>
+    </w:lvl>
+    <w:lvl w:ilvl="6" w:tentative="1">
+      <w:start w:val="1"/>
+      <w:numFmt w:val="bullet"/>
+      <w:lvlText w:val=""/>
+      <w:lvlJc w:val="left"/>
+      <w:pPr>
+        <w:tabs>
+          <w:tab w:val="num" w:pos="5040"/>
+        </w:tabs>
+        <w:ind w:left="5040" w:hanging="360"/>
+      </w:pPr>
+      <w:rPr>
+        <w:rFonts w:ascii="Wingdings" w:hAnsi="Wingdings" w:hint="default"/>
+        <w:sz w:val="20"/>
+      </w:rPr>
+    </w:lvl>
+    <w:lvl w:ilvl="7" w:tentative="1">
+      <w:start w:val="1"/>
+      <w:numFmt w:val="bullet"/>
+      <w:lvlText w:val=""/>
+      <w:lvlJc w:val="left"/>
+      <w:pPr>
+        <w:tabs>
+          <w:tab w:val="num" w:pos="5760"/>
+        </w:tabs>
+        <w:ind w:left="5760" w:hanging="360"/>
+      </w:pPr>
+      <w:rPr>
+        <w:rFonts w:ascii="Wingdings" w:hAnsi="Wingdings" w:hint="default"/>
+        <w:sz w:val="20"/>
+      </w:rPr>
+    </w:lvl>
+    <w:lvl w:ilvl="8" w:tentative="1">
+      <w:start w:val="1"/>
+      <w:numFmt w:val="bullet"/>
+      <w:lvlText w:val=""/>
+      <w:lvlJc w:val="left"/>
+      <w:pPr>
+        <w:tabs>
+          <w:tab w:val="num" w:pos="6480"/>
+        </w:tabs>
+        <w:ind w:left="6480" w:hanging="360"/>
+      </w:pPr>
+      <w:rPr>
+        <w:rFonts w:ascii="Wingdings" w:hAnsi="Wingdings" w:hint="default"/>
+        <w:sz w:val="20"/>
+      </w:rPr>
+    </w:lvl>
+  </w:abstractNum>
+  <w:abstractNum w:abstractNumId="14" w15:restartNumberingAfterBreak="0">
+    <w:nsid w:val="675E577A"/>
+    <w:multiLevelType w:val="multilevel"/>
+    <w:tmpl w:val="51E6781C"/>
+    <w:lvl w:ilvl="0">
+      <w:start w:val="1"/>
+      <w:numFmt w:val="bullet"/>
+      <w:lvlText w:val=""/>
+      <w:lvlJc w:val="left"/>
+      <w:pPr>
+        <w:tabs>
+          <w:tab w:val="num" w:pos="720"/>
+        </w:tabs>
+        <w:ind w:left="720" w:hanging="360"/>
+      </w:pPr>
+      <w:rPr>
+        <w:rFonts w:ascii="Symbol" w:hAnsi="Symbol" w:hint="default"/>
+        <w:sz w:val="20"/>
+      </w:rPr>
+    </w:lvl>
+    <w:lvl w:ilvl="1" w:tentative="1">
+      <w:start w:val="1"/>
+      <w:numFmt w:val="bullet"/>
+      <w:lvlText w:val="o"/>
+      <w:lvlJc w:val="left"/>
+      <w:pPr>
+        <w:tabs>
+          <w:tab w:val="num" w:pos="1440"/>
+        </w:tabs>
+        <w:ind w:left="1440" w:hanging="360"/>
+      </w:pPr>
+      <w:rPr>
+        <w:rFonts w:ascii="Courier New" w:hAnsi="Courier New" w:hint="default"/>
+        <w:sz w:val="20"/>
+      </w:rPr>
+    </w:lvl>
+    <w:lvl w:ilvl="2" w:tentative="1">
+      <w:start w:val="1"/>
+      <w:numFmt w:val="bullet"/>
+      <w:lvlText w:val=""/>
+      <w:lvlJc w:val="left"/>
+      <w:pPr>
+        <w:tabs>
+          <w:tab w:val="num" w:pos="2160"/>
+        </w:tabs>
+        <w:ind w:left="2160" w:hanging="360"/>
+      </w:pPr>
+      <w:rPr>
+        <w:rFonts w:ascii="Wingdings" w:hAnsi="Wingdings" w:hint="default"/>
+        <w:sz w:val="20"/>
+      </w:rPr>
+    </w:lvl>
+    <w:lvl w:ilvl="3" w:tentative="1">
+      <w:start w:val="1"/>
+      <w:numFmt w:val="bullet"/>
+      <w:lvlText w:val=""/>
+      <w:lvlJc w:val="left"/>
+      <w:pPr>
+        <w:tabs>
+          <w:tab w:val="num" w:pos="2880"/>
+        </w:tabs>
+        <w:ind w:left="2880" w:hanging="360"/>
+      </w:pPr>
+      <w:rPr>
+        <w:rFonts w:ascii="Wingdings" w:hAnsi="Wingdings" w:hint="default"/>
+        <w:sz w:val="20"/>
+      </w:rPr>
+    </w:lvl>
+    <w:lvl w:ilvl="4" w:tentative="1">
+      <w:start w:val="1"/>
+      <w:numFmt w:val="bullet"/>
+      <w:lvlText w:val=""/>
+      <w:lvlJc w:val="left"/>
+      <w:pPr>
+        <w:tabs>
+          <w:tab w:val="num" w:pos="3600"/>
+        </w:tabs>
+        <w:ind w:left="3600" w:hanging="360"/>
+      </w:pPr>
+      <w:rPr>
+        <w:rFonts w:ascii="Wingdings" w:hAnsi="Wingdings" w:hint="default"/>
+        <w:sz w:val="20"/>
+      </w:rPr>
+    </w:lvl>
+    <w:lvl w:ilvl="5" w:tentative="1">
+      <w:start w:val="1"/>
+      <w:numFmt w:val="bullet"/>
+      <w:lvlText w:val=""/>
+      <w:lvlJc w:val="left"/>
+      <w:pPr>
+        <w:tabs>
+          <w:tab w:val="num" w:pos="4320"/>
+        </w:tabs>
+        <w:ind w:left="4320" w:hanging="360"/>
+      </w:pPr>
+      <w:rPr>
+        <w:rFonts w:ascii="Wingdings" w:hAnsi="Wingdings" w:hint="default"/>
+        <w:sz w:val="20"/>
+      </w:rPr>
+    </w:lvl>
+    <w:lvl w:ilvl="6" w:tentative="1">
+      <w:start w:val="1"/>
+      <w:numFmt w:val="bullet"/>
+      <w:lvlText w:val=""/>
+      <w:lvlJc w:val="left"/>
+      <w:pPr>
+        <w:tabs>
+          <w:tab w:val="num" w:pos="5040"/>
+        </w:tabs>
+        <w:ind w:left="5040" w:hanging="360"/>
+      </w:pPr>
+      <w:rPr>
+        <w:rFonts w:ascii="Wingdings" w:hAnsi="Wingdings" w:hint="default"/>
+        <w:sz w:val="20"/>
+      </w:rPr>
+    </w:lvl>
+    <w:lvl w:ilvl="7" w:tentative="1">
+      <w:start w:val="1"/>
+      <w:numFmt w:val="bullet"/>
+      <w:lvlText w:val=""/>
+      <w:lvlJc w:val="left"/>
+      <w:pPr>
+        <w:tabs>
+          <w:tab w:val="num" w:pos="5760"/>
+        </w:tabs>
+        <w:ind w:left="5760" w:hanging="360"/>
+      </w:pPr>
+      <w:rPr>
+        <w:rFonts w:ascii="Wingdings" w:hAnsi="Wingdings" w:hint="default"/>
+        <w:sz w:val="20"/>
+      </w:rPr>
+    </w:lvl>
+    <w:lvl w:ilvl="8" w:tentative="1">
+      <w:start w:val="1"/>
+      <w:numFmt w:val="bullet"/>
+      <w:lvlText w:val=""/>
+      <w:lvlJc w:val="left"/>
+      <w:pPr>
+        <w:tabs>
+          <w:tab w:val="num" w:pos="6480"/>
+        </w:tabs>
+        <w:ind w:left="6480" w:hanging="360"/>
+      </w:pPr>
+      <w:rPr>
+        <w:rFonts w:ascii="Wingdings" w:hAnsi="Wingdings" w:hint="default"/>
+        <w:sz w:val="20"/>
+      </w:rPr>
+    </w:lvl>
+  </w:abstractNum>
+  <w:abstractNum w:abstractNumId="15" w15:restartNumberingAfterBreak="0">
+    <w:nsid w:val="69A704EB"/>
+    <w:multiLevelType w:val="multilevel"/>
+    <w:tmpl w:val="9138B9D2"/>
+    <w:lvl w:ilvl="0">
+      <w:start w:val="1"/>
+      <w:numFmt w:val="bullet"/>
+      <w:lvlText w:val=""/>
+      <w:lvlJc w:val="left"/>
+      <w:pPr>
+        <w:tabs>
+          <w:tab w:val="num" w:pos="720"/>
+        </w:tabs>
+        <w:ind w:left="720" w:hanging="360"/>
+      </w:pPr>
+      <w:rPr>
+        <w:rFonts w:ascii="Symbol" w:hAnsi="Symbol" w:hint="default"/>
+        <w:sz w:val="20"/>
+      </w:rPr>
+    </w:lvl>
+    <w:lvl w:ilvl="1" w:tentative="1">
+      <w:start w:val="1"/>
+      <w:numFmt w:val="bullet"/>
+      <w:lvlText w:val="o"/>
+      <w:lvlJc w:val="left"/>
+      <w:pPr>
+        <w:tabs>
+          <w:tab w:val="num" w:pos="1440"/>
+        </w:tabs>
+        <w:ind w:left="1440" w:hanging="360"/>
+      </w:pPr>
+      <w:rPr>
+        <w:rFonts w:ascii="Courier New" w:hAnsi="Courier New" w:hint="default"/>
+        <w:sz w:val="20"/>
+      </w:rPr>
+    </w:lvl>
+    <w:lvl w:ilvl="2" w:tentative="1">
+      <w:start w:val="1"/>
+      <w:numFmt w:val="bullet"/>
+      <w:lvlText w:val=""/>
+      <w:lvlJc w:val="left"/>
+      <w:pPr>
+        <w:tabs>
+          <w:tab w:val="num" w:pos="2160"/>
+        </w:tabs>
+        <w:ind w:left="2160" w:hanging="360"/>
+      </w:pPr>
+      <w:rPr>
+        <w:rFonts w:ascii="Wingdings" w:hAnsi="Wingdings" w:hint="default"/>
+        <w:sz w:val="20"/>
+      </w:rPr>
+    </w:lvl>
+    <w:lvl w:ilvl="3" w:tentative="1">
+      <w:start w:val="1"/>
+      <w:numFmt w:val="bullet"/>
+      <w:lvlText w:val=""/>
+      <w:lvlJc w:val="left"/>
+      <w:pPr>
+        <w:tabs>
+          <w:tab w:val="num" w:pos="2880"/>
+        </w:tabs>
+        <w:ind w:left="2880" w:hanging="360"/>
+      </w:pPr>
+      <w:rPr>
+        <w:rFonts w:ascii="Wingdings" w:hAnsi="Wingdings" w:hint="default"/>
+        <w:sz w:val="20"/>
+      </w:rPr>
+    </w:lvl>
+    <w:lvl w:ilvl="4" w:tentative="1">
+      <w:start w:val="1"/>
+      <w:numFmt w:val="bullet"/>
+      <w:lvlText w:val=""/>
+      <w:lvlJc w:val="left"/>
+      <w:pPr>
+        <w:tabs>
+          <w:tab w:val="num" w:pos="3600"/>
+        </w:tabs>
+        <w:ind w:left="3600" w:hanging="360"/>
+      </w:pPr>
+      <w:rPr>
+        <w:rFonts w:ascii="Wingdings" w:hAnsi="Wingdings" w:hint="default"/>
+        <w:sz w:val="20"/>
+      </w:rPr>
+    </w:lvl>
+    <w:lvl w:ilvl="5" w:tentative="1">
+      <w:start w:val="1"/>
+      <w:numFmt w:val="bullet"/>
+      <w:lvlText w:val=""/>
+      <w:lvlJc w:val="left"/>
+      <w:pPr>
+        <w:tabs>
+          <w:tab w:val="num" w:pos="4320"/>
+        </w:tabs>
+        <w:ind w:left="4320" w:hanging="360"/>
+      </w:pPr>
+      <w:rPr>
+        <w:rFonts w:ascii="Wingdings" w:hAnsi="Wingdings" w:hint="default"/>
+        <w:sz w:val="20"/>
+      </w:rPr>
+    </w:lvl>
+    <w:lvl w:ilvl="6" w:tentative="1">
+      <w:start w:val="1"/>
+      <w:numFmt w:val="bullet"/>
+      <w:lvlText w:val=""/>
+      <w:lvlJc w:val="left"/>
+      <w:pPr>
+        <w:tabs>
+          <w:tab w:val="num" w:pos="5040"/>
+        </w:tabs>
+        <w:ind w:left="5040" w:hanging="360"/>
+      </w:pPr>
+      <w:rPr>
+        <w:rFonts w:ascii="Wingdings" w:hAnsi="Wingdings" w:hint="default"/>
+        <w:sz w:val="20"/>
+      </w:rPr>
+    </w:lvl>
+    <w:lvl w:ilvl="7" w:tentative="1">
+      <w:start w:val="1"/>
+      <w:numFmt w:val="bullet"/>
+      <w:lvlText w:val=""/>
+      <w:lvlJc w:val="left"/>
+      <w:pPr>
+        <w:tabs>
+          <w:tab w:val="num" w:pos="5760"/>
+        </w:tabs>
+        <w:ind w:left="5760" w:hanging="360"/>
+      </w:pPr>
+      <w:rPr>
+        <w:rFonts w:ascii="Wingdings" w:hAnsi="Wingdings" w:hint="default"/>
+        <w:sz w:val="20"/>
+      </w:rPr>
+    </w:lvl>
+    <w:lvl w:ilvl="8" w:tentative="1">
+      <w:start w:val="1"/>
+      <w:numFmt w:val="bullet"/>
+      <w:lvlText w:val=""/>
+      <w:lvlJc w:val="left"/>
+      <w:pPr>
+        <w:tabs>
+          <w:tab w:val="num" w:pos="6480"/>
+        </w:tabs>
+        <w:ind w:left="6480" w:hanging="360"/>
+      </w:pPr>
+      <w:rPr>
+        <w:rFonts w:ascii="Wingdings" w:hAnsi="Wingdings" w:hint="default"/>
+        <w:sz w:val="20"/>
+      </w:rPr>
+    </w:lvl>
+  </w:abstractNum>
+  <w:abstractNum w:abstractNumId="16" w15:restartNumberingAfterBreak="0">
+    <w:nsid w:val="6CFF3991"/>
+    <w:multiLevelType w:val="multilevel"/>
+    <w:tmpl w:val="39500AC4"/>
+    <w:lvl w:ilvl="0">
+      <w:start w:val="1"/>
+      <w:numFmt w:val="bullet"/>
+      <w:lvlText w:val=""/>
+      <w:lvlJc w:val="left"/>
+      <w:pPr>
+        <w:tabs>
+          <w:tab w:val="num" w:pos="720"/>
+        </w:tabs>
+        <w:ind w:left="720" w:hanging="360"/>
+      </w:pPr>
+      <w:rPr>
+        <w:rFonts w:ascii="Symbol" w:hAnsi="Symbol" w:hint="default"/>
+        <w:sz w:val="20"/>
+      </w:rPr>
+    </w:lvl>
+    <w:lvl w:ilvl="1" w:tentative="1">
+      <w:start w:val="1"/>
+      <w:numFmt w:val="bullet"/>
+      <w:lvlText w:val="o"/>
+      <w:lvlJc w:val="left"/>
+      <w:pPr>
+        <w:tabs>
+          <w:tab w:val="num" w:pos="1440"/>
+        </w:tabs>
+        <w:ind w:left="1440" w:hanging="360"/>
+      </w:pPr>
+      <w:rPr>
+        <w:rFonts w:ascii="Courier New" w:hAnsi="Courier New" w:hint="default"/>
+        <w:sz w:val="20"/>
+      </w:rPr>
+    </w:lvl>
+    <w:lvl w:ilvl="2" w:tentative="1">
+      <w:start w:val="1"/>
+      <w:numFmt w:val="bullet"/>
+      <w:lvlText w:val=""/>
+      <w:lvlJc w:val="left"/>
+      <w:pPr>
+        <w:tabs>
+          <w:tab w:val="num" w:pos="2160"/>
+        </w:tabs>
+        <w:ind w:left="2160" w:hanging="360"/>
+      </w:pPr>
+      <w:rPr>
+        <w:rFonts w:ascii="Wingdings" w:hAnsi="Wingdings" w:hint="default"/>
+        <w:sz w:val="20"/>
+      </w:rPr>
+    </w:lvl>
+    <w:lvl w:ilvl="3" w:tentative="1">
+      <w:start w:val="1"/>
+      <w:numFmt w:val="bullet"/>
+      <w:lvlText w:val=""/>
+      <w:lvlJc w:val="left"/>
+      <w:pPr>
+        <w:tabs>
+          <w:tab w:val="num" w:pos="2880"/>
+        </w:tabs>
+        <w:ind w:left="2880" w:hanging="360"/>
+      </w:pPr>
+      <w:rPr>
+        <w:rFonts w:ascii="Wingdings" w:hAnsi="Wingdings" w:hint="default"/>
+        <w:sz w:val="20"/>
+      </w:rPr>
+    </w:lvl>
+    <w:lvl w:ilvl="4" w:tentative="1">
+      <w:start w:val="1"/>
+      <w:numFmt w:val="bullet"/>
+      <w:lvlText w:val=""/>
+      <w:lvlJc w:val="left"/>
+      <w:pPr>
+        <w:tabs>
+          <w:tab w:val="num" w:pos="3600"/>
+        </w:tabs>
+        <w:ind w:left="3600" w:hanging="360"/>
+      </w:pPr>
+      <w:rPr>
+        <w:rFonts w:ascii="Wingdings" w:hAnsi="Wingdings" w:hint="default"/>
+        <w:sz w:val="20"/>
+      </w:rPr>
+    </w:lvl>
+    <w:lvl w:ilvl="5" w:tentative="1">
+      <w:start w:val="1"/>
+      <w:numFmt w:val="bullet"/>
+      <w:lvlText w:val=""/>
+      <w:lvlJc w:val="left"/>
+      <w:pPr>
+        <w:tabs>
+          <w:tab w:val="num" w:pos="4320"/>
+        </w:tabs>
+        <w:ind w:left="4320" w:hanging="360"/>
+      </w:pPr>
+      <w:rPr>
+        <w:rFonts w:ascii="Wingdings" w:hAnsi="Wingdings" w:hint="default"/>
+        <w:sz w:val="20"/>
+      </w:rPr>
+    </w:lvl>
+    <w:lvl w:ilvl="6" w:tentative="1">
+      <w:start w:val="1"/>
+      <w:numFmt w:val="bullet"/>
+      <w:lvlText w:val=""/>
+      <w:lvlJc w:val="left"/>
+      <w:pPr>
+        <w:tabs>
+          <w:tab w:val="num" w:pos="5040"/>
+        </w:tabs>
+        <w:ind w:left="5040" w:hanging="360"/>
+      </w:pPr>
+      <w:rPr>
+        <w:rFonts w:ascii="Wingdings" w:hAnsi="Wingdings" w:hint="default"/>
+        <w:sz w:val="20"/>
+      </w:rPr>
+    </w:lvl>
+    <w:lvl w:ilvl="7" w:tentative="1">
+      <w:start w:val="1"/>
+      <w:numFmt w:val="bullet"/>
+      <w:lvlText w:val=""/>
+      <w:lvlJc w:val="left"/>
+      <w:pPr>
+        <w:tabs>
+          <w:tab w:val="num" w:pos="5760"/>
+        </w:tabs>
+        <w:ind w:left="5760" w:hanging="360"/>
+      </w:pPr>
+      <w:rPr>
+        <w:rFonts w:ascii="Wingdings" w:hAnsi="Wingdings" w:hint="default"/>
+        <w:sz w:val="20"/>
+      </w:rPr>
+    </w:lvl>
+    <w:lvl w:ilvl="8" w:tentative="1">
+      <w:start w:val="1"/>
+      <w:numFmt w:val="bullet"/>
+      <w:lvlText w:val=""/>
+      <w:lvlJc w:val="left"/>
+      <w:pPr>
+        <w:tabs>
+          <w:tab w:val="num" w:pos="6480"/>
+        </w:tabs>
+        <w:ind w:left="6480" w:hanging="360"/>
+      </w:pPr>
+      <w:rPr>
+        <w:rFonts w:ascii="Wingdings" w:hAnsi="Wingdings" w:hint="default"/>
+        <w:sz w:val="20"/>
+      </w:rPr>
+    </w:lvl>
+  </w:abstractNum>
+  <w:abstractNum w:abstractNumId="17" w15:restartNumberingAfterBreak="0">
     <w:nsid w:val="77001B87"/>
     <w:multiLevelType w:val="multilevel"/>
     <w:tmpl w:val="71CAEBD0"/>
@@ -4330,7 +7987,156 @@
       </w:rPr>
     </w:lvl>
   </w:abstractNum>
-  <w:abstractNum w:abstractNumId="11" w15:restartNumberingAfterBreak="0">
+  <w:abstractNum w:abstractNumId="18" w15:restartNumberingAfterBreak="0">
+    <w:nsid w:val="7D126175"/>
+    <w:multiLevelType w:val="multilevel"/>
+    <w:tmpl w:val="2DE0446A"/>
+    <w:lvl w:ilvl="0">
+      <w:start w:val="1"/>
+      <w:numFmt w:val="bullet"/>
+      <w:lvlText w:val=""/>
+      <w:lvlJc w:val="left"/>
+      <w:pPr>
+        <w:tabs>
+          <w:tab w:val="num" w:pos="720"/>
+        </w:tabs>
+        <w:ind w:left="720" w:hanging="360"/>
+      </w:pPr>
+      <w:rPr>
+        <w:rFonts w:ascii="Symbol" w:hAnsi="Symbol" w:hint="default"/>
+        <w:sz w:val="20"/>
+      </w:rPr>
+    </w:lvl>
+    <w:lvl w:ilvl="1" w:tentative="1">
+      <w:start w:val="1"/>
+      <w:numFmt w:val="bullet"/>
+      <w:lvlText w:val="o"/>
+      <w:lvlJc w:val="left"/>
+      <w:pPr>
+        <w:tabs>
+          <w:tab w:val="num" w:pos="1440"/>
+        </w:tabs>
+        <w:ind w:left="1440" w:hanging="360"/>
+      </w:pPr>
+      <w:rPr>
+        <w:rFonts w:ascii="Courier New" w:hAnsi="Courier New" w:hint="default"/>
+        <w:sz w:val="20"/>
+      </w:rPr>
+    </w:lvl>
+    <w:lvl w:ilvl="2" w:tentative="1">
+      <w:start w:val="1"/>
+      <w:numFmt w:val="bullet"/>
+      <w:lvlText w:val=""/>
+      <w:lvlJc w:val="left"/>
+      <w:pPr>
+        <w:tabs>
+          <w:tab w:val="num" w:pos="2160"/>
+        </w:tabs>
+        <w:ind w:left="2160" w:hanging="360"/>
+      </w:pPr>
+      <w:rPr>
+        <w:rFonts w:ascii="Wingdings" w:hAnsi="Wingdings" w:hint="default"/>
+        <w:sz w:val="20"/>
+      </w:rPr>
+    </w:lvl>
+    <w:lvl w:ilvl="3" w:tentative="1">
+      <w:start w:val="1"/>
+      <w:numFmt w:val="bullet"/>
+      <w:lvlText w:val=""/>
+      <w:lvlJc w:val="left"/>
+      <w:pPr>
+        <w:tabs>
+          <w:tab w:val="num" w:pos="2880"/>
+        </w:tabs>
+        <w:ind w:left="2880" w:hanging="360"/>
+      </w:pPr>
+      <w:rPr>
+        <w:rFonts w:ascii="Wingdings" w:hAnsi="Wingdings" w:hint="default"/>
+        <w:sz w:val="20"/>
+      </w:rPr>
+    </w:lvl>
+    <w:lvl w:ilvl="4" w:tentative="1">
+      <w:start w:val="1"/>
+      <w:numFmt w:val="bullet"/>
+      <w:lvlText w:val=""/>
+      <w:lvlJc w:val="left"/>
+      <w:pPr>
+        <w:tabs>
+          <w:tab w:val="num" w:pos="3600"/>
+        </w:tabs>
+        <w:ind w:left="3600" w:hanging="360"/>
+      </w:pPr>
+      <w:rPr>
+        <w:rFonts w:ascii="Wingdings" w:hAnsi="Wingdings" w:hint="default"/>
+        <w:sz w:val="20"/>
+      </w:rPr>
+    </w:lvl>
+    <w:lvl w:ilvl="5" w:tentative="1">
+      <w:start w:val="1"/>
+      <w:numFmt w:val="bullet"/>
+      <w:lvlText w:val=""/>
+      <w:lvlJc w:val="left"/>
+      <w:pPr>
+        <w:tabs>
+          <w:tab w:val="num" w:pos="4320"/>
+        </w:tabs>
+        <w:ind w:left="4320" w:hanging="360"/>
+      </w:pPr>
+      <w:rPr>
+        <w:rFonts w:ascii="Wingdings" w:hAnsi="Wingdings" w:hint="default"/>
+        <w:sz w:val="20"/>
+      </w:rPr>
+    </w:lvl>
+    <w:lvl w:ilvl="6" w:tentative="1">
+      <w:start w:val="1"/>
+      <w:numFmt w:val="bullet"/>
+      <w:lvlText w:val=""/>
+      <w:lvlJc w:val="left"/>
+      <w:pPr>
+        <w:tabs>
+          <w:tab w:val="num" w:pos="5040"/>
+        </w:tabs>
+        <w:ind w:left="5040" w:hanging="360"/>
+      </w:pPr>
+      <w:rPr>
+        <w:rFonts w:ascii="Wingdings" w:hAnsi="Wingdings" w:hint="default"/>
+        <w:sz w:val="20"/>
+      </w:rPr>
+    </w:lvl>
+    <w:lvl w:ilvl="7" w:tentative="1">
+      <w:start w:val="1"/>
+      <w:numFmt w:val="bullet"/>
+      <w:lvlText w:val=""/>
+      <w:lvlJc w:val="left"/>
+      <w:pPr>
+        <w:tabs>
+          <w:tab w:val="num" w:pos="5760"/>
+        </w:tabs>
+        <w:ind w:left="5760" w:hanging="360"/>
+      </w:pPr>
+      <w:rPr>
+        <w:rFonts w:ascii="Wingdings" w:hAnsi="Wingdings" w:hint="default"/>
+        <w:sz w:val="20"/>
+      </w:rPr>
+    </w:lvl>
+    <w:lvl w:ilvl="8" w:tentative="1">
+      <w:start w:val="1"/>
+      <w:numFmt w:val="bullet"/>
+      <w:lvlText w:val=""/>
+      <w:lvlJc w:val="left"/>
+      <w:pPr>
+        <w:tabs>
+          <w:tab w:val="num" w:pos="6480"/>
+        </w:tabs>
+        <w:ind w:left="6480" w:hanging="360"/>
+      </w:pPr>
+      <w:rPr>
+        <w:rFonts w:ascii="Wingdings" w:hAnsi="Wingdings" w:hint="default"/>
+        <w:sz w:val="20"/>
+      </w:rPr>
+    </w:lvl>
+  </w:abstractNum>
+  <w:abstractNum w:abstractNumId="19" w15:restartNumberingAfterBreak="0">
     <w:nsid w:val="7DFD2683"/>
     <w:multiLevelType w:val="multilevel"/>
     <w:tmpl w:val="2F90FD18"/>
@@ -4479,7 +8285,7 @@
       </w:rPr>
     </w:lvl>
   </w:abstractNum>
-  <w:abstractNum w:abstractNumId="12" w15:restartNumberingAfterBreak="0">
+  <w:abstractNum w:abstractNumId="20" w15:restartNumberingAfterBreak="0">
     <w:nsid w:val="7E6C3D42"/>
     <w:multiLevelType w:val="multilevel"/>
     <w:tmpl w:val="C0482644"/>
@@ -4596,7 +8402,7 @@
       </w:pPr>
     </w:lvl>
   </w:abstractNum>
-  <w:abstractNum w:abstractNumId="13" w15:restartNumberingAfterBreak="0">
+  <w:abstractNum w:abstractNumId="21" w15:restartNumberingAfterBreak="0">
     <w:nsid w:val="7FE84050"/>
     <w:multiLevelType w:val="multilevel"/>
     <w:tmpl w:val="DA92A2B6"/>
@@ -4714,46 +8520,70 @@
     </w:lvl>
   </w:abstractNum>
   <w:num w:numId="1">
+    <w:abstractNumId w:val="17"/>
+  </w:num>
+  <w:num w:numId="2">
+    <w:abstractNumId w:val="2"/>
+  </w:num>
+  <w:num w:numId="3">
+    <w:abstractNumId w:val="8"/>
+  </w:num>
+  <w:num w:numId="4">
+    <w:abstractNumId w:val="3"/>
+  </w:num>
+  <w:num w:numId="5">
+    <w:abstractNumId w:val="9"/>
+  </w:num>
+  <w:num w:numId="6">
+    <w:abstractNumId w:val="21"/>
+  </w:num>
+  <w:num w:numId="7">
+    <w:abstractNumId w:val="11"/>
+  </w:num>
+  <w:num w:numId="8">
+    <w:abstractNumId w:val="20"/>
+  </w:num>
+  <w:num w:numId="9">
+    <w:abstractNumId w:val="5"/>
+  </w:num>
+  <w:num w:numId="10">
+    <w:abstractNumId w:val="12"/>
+  </w:num>
+  <w:num w:numId="11">
+    <w:abstractNumId w:val="4"/>
+  </w:num>
+  <w:num w:numId="12">
     <w:abstractNumId w:val="10"/>
   </w:num>
-  <w:num w:numId="2">
+  <w:num w:numId="13">
+    <w:abstractNumId w:val="6"/>
+  </w:num>
+  <w:num w:numId="14">
+    <w:abstractNumId w:val="19"/>
+  </w:num>
+  <w:num w:numId="15">
     <w:abstractNumId w:val="0"/>
   </w:num>
-  <w:num w:numId="3">
-    <w:abstractNumId w:val="5"/>
+  <w:num w:numId="16">
+    <w:abstractNumId w:val="13"/>
   </w:num>
-  <w:num w:numId="4">
+  <w:num w:numId="17">
+    <w:abstractNumId w:val="14"/>
+  </w:num>
+  <w:num w:numId="18">
+    <w:abstractNumId w:val="18"/>
+  </w:num>
+  <w:num w:numId="19">
     <w:abstractNumId w:val="1"/>
   </w:num>
-  <w:num w:numId="5">
-    <w:abstractNumId w:val="6"/>
-  </w:num>
-  <w:num w:numId="6">
-    <w:abstractNumId w:val="13"/>
-  </w:num>
-  <w:num w:numId="7">
-    <w:abstractNumId w:val="8"/>
-  </w:num>
-  <w:num w:numId="8">
-    <w:abstractNumId w:val="12"/>
-  </w:num>
-  <w:num w:numId="9">
-    <w:abstractNumId w:val="3"/>
-  </w:num>
-  <w:num w:numId="10">
-    <w:abstractNumId w:val="9"/>
-  </w:num>
-  <w:num w:numId="11">
-    <w:abstractNumId w:val="2"/>
-  </w:num>
-  <w:num w:numId="12">
+  <w:num w:numId="20">
     <w:abstractNumId w:val="7"/>
   </w:num>
-  <w:num w:numId="13">
-    <w:abstractNumId w:val="4"/>
+  <w:num w:numId="21">
+    <w:abstractNumId w:val="15"/>
   </w:num>
-  <w:num w:numId="14">
-    <w:abstractNumId w:val="11"/>
+  <w:num w:numId="22">
+    <w:abstractNumId w:val="16"/>
   </w:num>
 </w:numbering>
 </file>
@@ -5350,6 +9180,119 @@
       <w:color w:val="2E74B5" w:themeColor="accent1" w:themeShade="BF"/>
     </w:rPr>
   </w:style>
+  <w:style w:type="character" w:customStyle="1" w:styleId="ng-tns-c2371930484-252">
+    <w:name w:val="ng-tns-c2371930484-252"/>
+    <w:basedOn w:val="DefaultParagraphFont"/>
+    <w:rsid w:val="00C80B18"/>
+  </w:style>
+  <w:style w:type="paragraph" w:styleId="HTMLPreformatted">
+    <w:name w:val="HTML Preformatted"/>
+    <w:basedOn w:val="Normal"/>
+    <w:link w:val="HTMLPreformattedChar"/>
+    <w:uiPriority w:val="99"/>
+    <w:semiHidden/>
+    <w:unhideWhenUsed/>
+    <w:rsid w:val="00C80B18"/>
+    <w:pPr>
+      <w:tabs>
+        <w:tab w:val="left" w:pos="916"/>
+        <w:tab w:val="left" w:pos="1832"/>
+        <w:tab w:val="left" w:pos="2748"/>
+        <w:tab w:val="left" w:pos="3664"/>
+        <w:tab w:val="left" w:pos="4580"/>
+        <w:tab w:val="left" w:pos="5496"/>
+        <w:tab w:val="left" w:pos="6412"/>
+        <w:tab w:val="left" w:pos="7328"/>
+        <w:tab w:val="left" w:pos="8244"/>
+        <w:tab w:val="left" w:pos="9160"/>
+        <w:tab w:val="left" w:pos="10076"/>
+        <w:tab w:val="left" w:pos="10992"/>
+        <w:tab w:val="left" w:pos="11908"/>
+        <w:tab w:val="left" w:pos="12824"/>
+        <w:tab w:val="left" w:pos="13740"/>
+        <w:tab w:val="left" w:pos="14656"/>
+      </w:tabs>
+      <w:spacing w:after="0" w:line="240" w:lineRule="auto"/>
+    </w:pPr>
+    <w:rPr>
+      <w:rFonts w:ascii="Courier New" w:eastAsia="Times New Roman" w:hAnsi="Courier New" w:cs="Courier New"/>
+      <w:sz w:val="20"/>
+      <w:szCs w:val="20"/>
+    </w:rPr>
+  </w:style>
+  <w:style w:type="character" w:customStyle="1" w:styleId="HTMLPreformattedChar">
+    <w:name w:val="HTML Preformatted Char"/>
+    <w:basedOn w:val="DefaultParagraphFont"/>
+    <w:link w:val="HTMLPreformatted"/>
+    <w:uiPriority w:val="99"/>
+    <w:semiHidden/>
+    <w:rsid w:val="00C80B18"/>
+    <w:rPr>
+      <w:rFonts w:ascii="Courier New" w:eastAsia="Times New Roman" w:hAnsi="Courier New" w:cs="Courier New"/>
+      <w:sz w:val="20"/>
+      <w:szCs w:val="20"/>
+    </w:rPr>
+  </w:style>
+  <w:style w:type="character" w:customStyle="1" w:styleId="hljs-keyword">
+    <w:name w:val="hljs-keyword"/>
+    <w:basedOn w:val="DefaultParagraphFont"/>
+    <w:rsid w:val="00C80B18"/>
+  </w:style>
+  <w:style w:type="character" w:customStyle="1" w:styleId="hljs-attr">
+    <w:name w:val="hljs-attr"/>
+    <w:basedOn w:val="DefaultParagraphFont"/>
+    <w:rsid w:val="00C80B18"/>
+  </w:style>
+  <w:style w:type="character" w:customStyle="1" w:styleId="hljs-builtin">
+    <w:name w:val="hljs-built_in"/>
+    <w:basedOn w:val="DefaultParagraphFont"/>
+    <w:rsid w:val="00C80B18"/>
+  </w:style>
+  <w:style w:type="character" w:customStyle="1" w:styleId="hljs-literal">
+    <w:name w:val="hljs-literal"/>
+    <w:basedOn w:val="DefaultParagraphFont"/>
+    <w:rsid w:val="00C80B18"/>
+  </w:style>
+  <w:style w:type="character" w:customStyle="1" w:styleId="hljs-comment">
+    <w:name w:val="hljs-comment"/>
+    <w:basedOn w:val="DefaultParagraphFont"/>
+    <w:rsid w:val="00C80B18"/>
+  </w:style>
+  <w:style w:type="character" w:customStyle="1" w:styleId="hljs-number">
+    <w:name w:val="hljs-number"/>
+    <w:basedOn w:val="DefaultParagraphFont"/>
+    <w:rsid w:val="00C80B18"/>
+  </w:style>
+  <w:style w:type="character" w:customStyle="1" w:styleId="hljs-string">
+    <w:name w:val="hljs-string"/>
+    <w:basedOn w:val="DefaultParagraphFont"/>
+    <w:rsid w:val="00C80B18"/>
+  </w:style>
+  <w:style w:type="character" w:customStyle="1" w:styleId="ng-tns-c2371930484-253">
+    <w:name w:val="ng-tns-c2371930484-253"/>
+    <w:basedOn w:val="DefaultParagraphFont"/>
+    <w:rsid w:val="00C80B18"/>
+  </w:style>
+  <w:style w:type="character" w:customStyle="1" w:styleId="hljs-subst">
+    <w:name w:val="hljs-subst"/>
+    <w:basedOn w:val="DefaultParagraphFont"/>
+    <w:rsid w:val="00C80B18"/>
+  </w:style>
+  <w:style w:type="character" w:customStyle="1" w:styleId="ng-tns-c2371930484-254">
+    <w:name w:val="ng-tns-c2371930484-254"/>
+    <w:basedOn w:val="DefaultParagraphFont"/>
+    <w:rsid w:val="00C80B18"/>
+  </w:style>
+  <w:style w:type="character" w:customStyle="1" w:styleId="ng-tns-c2371930484-255">
+    <w:name w:val="ng-tns-c2371930484-255"/>
+    <w:basedOn w:val="DefaultParagraphFont"/>
+    <w:rsid w:val="00C80B18"/>
+  </w:style>
+  <w:style w:type="character" w:customStyle="1" w:styleId="ng-tns-c2371930484-256">
+    <w:name w:val="ng-tns-c2371930484-256"/>
+    <w:basedOn w:val="DefaultParagraphFont"/>
+    <w:rsid w:val="00C80B18"/>
+  </w:style>
 </w:styles>
 </file>
 

</xml_diff>